<commit_message>
docs: update UC09 line numbers and blocks with full class structure
</commit_message>
<xml_diff>
--- a/hop-trang/KiemThuHopTrang_UC09_TuDongHoaGuiEmail.docx
+++ b/hop-trang/KiemThuHopTrang_UC09_TuDongHoaGuiEmail.docx
@@ -353,129 +353,147 @@
           <w:color w:val="222222"/>
           <w:sz w:val="17"/>
         </w:rPr>
-        <w:t>1:  async execute(input: SendBulkEmailInput): Promise&lt;SendBulkEmailResult&gt; {</w:t>
+        <w:t>1:  class SendBulkEmailUseCase {</w:t>
         <w:br/>
-        <w:t>2:    if (!input.candidateIds || input.candidateIds.length === 0) {</w:t>
+        <w:t>2:    constructor(</w:t>
         <w:br/>
-        <w:t>3:      throw new Error('Danh sách ứng viên không được để trống.');</w:t>
+        <w:t>3:      private readonly candidateRepo: ICandidateReadRepo,</w:t>
         <w:br/>
-        <w:t>4:    }</w:t>
+        <w:t>4:      private readonly jobRepo: IJobReadRepo,</w:t>
         <w:br/>
-        <w:t>5:</w:t>
+        <w:t>5:      private readonly mailSvc: IMailService,</w:t>
         <w:br/>
-        <w:t>6:    if (!input.title?.trim()) {</w:t>
+        <w:t>6:    ) { }</w:t>
         <w:br/>
-        <w:t>7:      throw new Error('Tiêu đề email không được để trống.');</w:t>
+        <w:t>7:</w:t>
         <w:br/>
-        <w:t>8:    }</w:t>
+        <w:t>8:    async execute(input: SendBulkEmailInput): Promise&lt;SendBulkEmailResult&gt; {</w:t>
         <w:br/>
-        <w:t>9:</w:t>
+        <w:t>9:      if (!input.candidateIds || input.candidateIds.length === 0) {</w:t>
         <w:br/>
-        <w:t>10:   if (!input.content?.trim()) {</w:t>
+        <w:t>10:       throw new Error('Danh sách ứng viên không được để trống.');</w:t>
         <w:br/>
-        <w:t>11:     throw new Error('Nội dung email không được để trống.');</w:t>
+        <w:t>11:     }</w:t>
         <w:br/>
-        <w:t>12:   }</w:t>
+        <w:t>12:</w:t>
         <w:br/>
-        <w:t>13:</w:t>
+        <w:t>13:     if (!input.title?.trim()) {</w:t>
         <w:br/>
-        <w:t>14:   const failed: Array&lt;{ candidateId: string; candidateName?: string; error: string; }&gt; = [];</w:t>
+        <w:t>14:       throw new Error('Tiêu đề email không được để trống.');</w:t>
         <w:br/>
-        <w:t>15:   let totalSent = 0;</w:t>
+        <w:t>15:     }</w:t>
         <w:br/>
         <w:t>16:</w:t>
         <w:br/>
-        <w:t>17:   const candidatePromises = input.candidateIds.map(id =&gt; this.candidateRepo.getById(id));</w:t>
+        <w:t>17:     if (!input.content?.trim()) {</w:t>
         <w:br/>
-        <w:t>18:   const candidates = await Promise.all(candidatePromises);</w:t>
+        <w:t>18:       throw new Error('Nội dung email không được để trống.');</w:t>
         <w:br/>
-        <w:t>19:</w:t>
+        <w:t>19:     }</w:t>
         <w:br/>
-        <w:t>20:   for (let i = 0; i &lt; candidates.length; i++) {</w:t>
+        <w:t>20:</w:t>
         <w:br/>
-        <w:t>21:     const candidate = candidates[i];</w:t>
+        <w:t>21:     const failed: Array&lt;{ candidateId: string; candidateName?: string; error: string; }&gt; = [];</w:t>
         <w:br/>
-        <w:t>22:     const candidateId = input.candidateIds[i]!;</w:t>
+        <w:t>22:     let totalSent = 0;</w:t>
         <w:br/>
         <w:t>23:</w:t>
         <w:br/>
-        <w:t>24:     try {</w:t>
+        <w:t>24:     const candidatePromises = input.candidateIds.map(id =&gt; this.candidateRepo.getById(id));</w:t>
         <w:br/>
-        <w:t>25:       if (!candidate) {</w:t>
+        <w:t>25:     const candidates = await Promise.all(candidatePromises);</w:t>
         <w:br/>
-        <w:t>26:         failed.push({ candidateId, error: 'Không tìm thấy ứng viên.' });</w:t>
+        <w:t>26:</w:t>
         <w:br/>
-        <w:t>27:         continue;</w:t>
+        <w:t>27:     for (let i = 0; i &lt; candidates.length; i++) {</w:t>
         <w:br/>
-        <w:t>28:       }</w:t>
+        <w:t>28:       const candidate = candidates[i];</w:t>
         <w:br/>
-        <w:t>29:</w:t>
+        <w:t>29:       const candidateId = input.candidateIds[i]!;</w:t>
         <w:br/>
-        <w:t>30:       const personal = candidate.getPersonal();</w:t>
+        <w:t>30:</w:t>
         <w:br/>
-        <w:t>31:       if (!personal?.email) {</w:t>
+        <w:t>31:       try {</w:t>
         <w:br/>
-        <w:t>32:         failed.push({ candidateId, candidateName: personal?.fullName, error: 'Ứng viên không có email.' });</w:t>
+        <w:t>32:         if (!candidate) {</w:t>
         <w:br/>
-        <w:t>33:         continue;</w:t>
+        <w:t>33:           failed.push({ candidateId, error: 'Không tìm thấy ứng viên.' });</w:t>
         <w:br/>
-        <w:t>34:       }</w:t>
+        <w:t>34:           continue;</w:t>
         <w:br/>
-        <w:t>35:</w:t>
+        <w:t>35:         }</w:t>
         <w:br/>
-        <w:t>36:       let jobTitle: string | undefined;</w:t>
+        <w:t>36:</w:t>
         <w:br/>
-        <w:t>37:       const jobID = candidate.getJobID();</w:t>
+        <w:t>37:         const personal = candidate.getPersonal();</w:t>
         <w:br/>
-        <w:t>38:       if (jobID) {</w:t>
+        <w:t>38:         if (!personal?.email) {</w:t>
         <w:br/>
-        <w:t>39:         try {</w:t>
+        <w:t>39:           failed.push({ candidateId, candidateName: personal?.fullName, error: 'Ứng viên không có email.' });</w:t>
         <w:br/>
-        <w:t>40:           const job = await this.jobRepo.getById(jobID.toString());</w:t>
+        <w:t>40:           continue;</w:t>
         <w:br/>
-        <w:t>41:           jobTitle = job?.getTitle();</w:t>
+        <w:t>41:         }</w:t>
         <w:br/>
-        <w:t>42:         } catch (e) { console.warn(`Could not fetch job for candidate ${candidateId}`); }</w:t>
+        <w:t>42:</w:t>
         <w:br/>
-        <w:t>43:       }</w:t>
+        <w:t>43:         let jobTitle: string | undefined;</w:t>
         <w:br/>
-        <w:t>44:</w:t>
+        <w:t>44:         const jobID = candidate.getJobID();</w:t>
         <w:br/>
-        <w:t>45:       const personalizedTitle = this.replacePlaceholders(input.title, candidate, jobTitle);</w:t>
+        <w:t>45:         if (jobID) {</w:t>
         <w:br/>
-        <w:t>46:       const personalizedContent = this.replacePlaceholders(input.content, candidate, jobTitle);</w:t>
+        <w:t>46:           try {</w:t>
         <w:br/>
-        <w:t>47:       const htmlContent = `&lt;html&gt;&lt;body&gt;&lt;div&gt;${personalizedContent}&lt;/div&gt;&lt;/body&gt;&lt;/html&gt;`;</w:t>
+        <w:t>47:             const job = await this.jobRepo.getById(jobID.toString());</w:t>
         <w:br/>
-        <w:t>48:</w:t>
+        <w:t>48:             jobTitle = job?.getTitle();</w:t>
         <w:br/>
-        <w:t>49:       const sent = await this.mailSvc.sendEmail(personal.email, personalizedTitle, htmlContent);</w:t>
+        <w:t>49:           } catch (e) { console.warn(`Could not fetch job for candidate ${candidateId}`); }</w:t>
         <w:br/>
-        <w:t>50:       if (sent) {</w:t>
+        <w:t>50:         }</w:t>
         <w:br/>
-        <w:t>51:         totalSent++;</w:t>
+        <w:t>51:</w:t>
         <w:br/>
-        <w:t>52:       } else {</w:t>
+        <w:t>52:         const personalizedTitle = this.replacePlaceholders(input.title, candidate, jobTitle);</w:t>
         <w:br/>
-        <w:t>53:         failed.push({ candidateId, candidateName: personal?.fullName, error: 'Lỗi gửi email từ dịch vụ mail.' });</w:t>
+        <w:t>53:         const personalizedContent = this.replacePlaceholders(input.content, candidate, jobTitle);</w:t>
         <w:br/>
-        <w:t>54:       }</w:t>
+        <w:t>54:         const htmlContent = `&lt;html&gt;&lt;body&gt;&lt;div&gt;${personalizedContent}&lt;/div&gt;&lt;/body&gt;&lt;/html&gt;`;</w:t>
         <w:br/>
-        <w:t>55:     } catch (error: unknown) {</w:t>
+        <w:t>55:</w:t>
         <w:br/>
-        <w:t>56:       const e = error as { message?: string };</w:t>
+        <w:t>56:         const sent = await this.mailSvc.sendEmail(personal.email, personalizedTitle, htmlContent);</w:t>
         <w:br/>
-        <w:t>57:       const personal = candidate?.getPersonal();</w:t>
+        <w:t>57:         if (sent) {</w:t>
         <w:br/>
-        <w:t>58:       failed.push({ candidateId, candidateName: personal?.fullName, error: e.message ?? 'Lỗi không xác định.' });</w:t>
+        <w:t>58:           totalSent++;</w:t>
         <w:br/>
-        <w:t>59:     }</w:t>
+        <w:t>59:         } else {</w:t>
         <w:br/>
-        <w:t>60:   }</w:t>
+        <w:t>60:           failed.push({ candidateId, candidateName: personal?.fullName, error: 'Lỗi gửi email từ dịch vụ mail.' });</w:t>
         <w:br/>
-        <w:t>61:   return { success: true, message: `Gửi email thành công tới ${totalSent}/${input.candidateIds.length} ứng viên.`, totalSent, failed };</w:t>
+        <w:t>61:         }</w:t>
         <w:br/>
-        <w:t>62: }</w:t>
+        <w:t>62:       } catch (error: unknown) {</w:t>
+        <w:br/>
+        <w:t>63:         const e = error as { message?: string };</w:t>
+        <w:br/>
+        <w:t>64:         const personal = candidate?.getPersonal();</w:t>
+        <w:br/>
+        <w:t>65:         failed.push({ candidateId, candidateName: personal?.fullName, error: e.message ?? 'Lỗi không xác định.' });</w:t>
+        <w:br/>
+        <w:t>66:       }</w:t>
+        <w:br/>
+        <w:t>67:     }</w:t>
+        <w:br/>
+        <w:t>68:</w:t>
+        <w:br/>
+        <w:t>69:     return { success: true, message: `Gửi email thành công tới ${totalSent}/${input.candidateIds.length} ứng viên.`, totalSent, failed };</w:t>
+        <w:br/>
+        <w:t>70:   }</w:t>
+        <w:br/>
+        <w:t>71: }</w:t>
       </w:r>
     </w:p>
     <w:p/>
@@ -633,7 +651,7 @@
               <w:rPr>
                 <w:sz w:val="18"/>
               </w:rPr>
-              <w:t>Dòng 1–2</w:t>
+              <w:t>Dòng 8–9</w:t>
             </w:r>
           </w:p>
         </w:tc>
@@ -714,7 +732,7 @@
               <w:rPr>
                 <w:sz w:val="18"/>
               </w:rPr>
-              <w:t>Dòng 3</w:t>
+              <w:t>Dòng 10</w:t>
             </w:r>
           </w:p>
         </w:tc>
@@ -795,7 +813,7 @@
               <w:rPr>
                 <w:sz w:val="18"/>
               </w:rPr>
-              <w:t>Dòng 6</w:t>
+              <w:t>Dòng 13</w:t>
             </w:r>
           </w:p>
         </w:tc>
@@ -814,7 +832,7 @@
               <w:rPr>
                 <w:sz w:val="18"/>
               </w:rPr>
-              <w:t>Kiểm tra tiêu đề if (!input.title?.trim())</w:t>
+              <w:t>Kiểm tra tiêu đề email if (!input.title?.trim())</w:t>
             </w:r>
           </w:p>
         </w:tc>
@@ -876,7 +894,7 @@
               <w:rPr>
                 <w:sz w:val="18"/>
               </w:rPr>
-              <w:t>Dòng 7</w:t>
+              <w:t>Dòng 14</w:t>
             </w:r>
           </w:p>
         </w:tc>
@@ -957,7 +975,7 @@
               <w:rPr>
                 <w:sz w:val="18"/>
               </w:rPr>
-              <w:t>Dòng 10</w:t>
+              <w:t>Dòng 17</w:t>
             </w:r>
           </w:p>
         </w:tc>
@@ -976,7 +994,7 @@
               <w:rPr>
                 <w:sz w:val="18"/>
               </w:rPr>
-              <w:t>Kiểm tra nội dung if (!input.content?.trim())</w:t>
+              <w:t>Kiểm tra nội dung email if (!input.content?.trim())</w:t>
             </w:r>
           </w:p>
         </w:tc>
@@ -1038,7 +1056,7 @@
               <w:rPr>
                 <w:sz w:val="18"/>
               </w:rPr>
-              <w:t>Dòng 11</w:t>
+              <w:t>Dòng 18</w:t>
             </w:r>
           </w:p>
         </w:tc>
@@ -1119,7 +1137,7 @@
               <w:rPr>
                 <w:sz w:val="18"/>
               </w:rPr>
-              <w:t>Dòng 14–20</w:t>
+              <w:t>Dòng 21–33</w:t>
             </w:r>
           </w:p>
         </w:tc>
@@ -1200,7 +1218,7 @@
               <w:rPr>
                 <w:sz w:val="18"/>
               </w:rPr>
-              <w:t>Dòng 21–25</w:t>
+              <w:t>Dòng 34–38</w:t>
             </w:r>
           </w:p>
         </w:tc>
@@ -1281,7 +1299,7 @@
               <w:rPr>
                 <w:sz w:val="18"/>
               </w:rPr>
-              <w:t>Dòng 26–27</w:t>
+              <w:t>Dòng 39–43</w:t>
             </w:r>
           </w:p>
         </w:tc>
@@ -1362,7 +1380,7 @@
               <w:rPr>
                 <w:sz w:val="18"/>
               </w:rPr>
-              <w:t>Dòng 30–31</w:t>
+              <w:t>Dòng 46–47</w:t>
             </w:r>
           </w:p>
         </w:tc>
@@ -1443,7 +1461,7 @@
               <w:rPr>
                 <w:sz w:val="18"/>
               </w:rPr>
-              <w:t>Dòng 32–33</w:t>
+              <w:t>Dòng 48–53</w:t>
             </w:r>
           </w:p>
         </w:tc>
@@ -1524,7 +1542,7 @@
               <w:rPr>
                 <w:sz w:val="18"/>
               </w:rPr>
-              <w:t>Dòng 36–38</w:t>
+              <w:t>Dòng 56–58</w:t>
             </w:r>
           </w:p>
         </w:tc>
@@ -1605,7 +1623,7 @@
               <w:rPr>
                 <w:sz w:val="18"/>
               </w:rPr>
-              <w:t>Dòng 39–42</w:t>
+              <w:t>Dòng 59–64</w:t>
             </w:r>
           </w:p>
         </w:tc>
@@ -1686,7 +1704,7 @@
               <w:rPr>
                 <w:sz w:val="18"/>
               </w:rPr>
-              <w:t>Dòng 45–50</w:t>
+              <w:t>Dòng 67–85</w:t>
             </w:r>
           </w:p>
         </w:tc>
@@ -1767,7 +1785,7 @@
               <w:rPr>
                 <w:sz w:val="18"/>
               </w:rPr>
-              <w:t>Dòng 51</w:t>
+              <w:t>Dòng 87–88</w:t>
             </w:r>
           </w:p>
         </w:tc>
@@ -1848,7 +1866,7 @@
               <w:rPr>
                 <w:sz w:val="18"/>
               </w:rPr>
-              <w:t>Dòng 53</w:t>
+              <w:t>Dòng 89–94</w:t>
             </w:r>
           </w:p>
         </w:tc>
@@ -1929,7 +1947,7 @@
               <w:rPr>
                 <w:sz w:val="18"/>
               </w:rPr>
-              <w:t>Dòng 55–58</w:t>
+              <w:t>Dòng 96–103</w:t>
             </w:r>
           </w:p>
         </w:tc>
@@ -2010,7 +2028,7 @@
               <w:rPr>
                 <w:sz w:val="18"/>
               </w:rPr>
-              <w:t>Dòng 61</w:t>
+              <w:t>Dòng 107–112</w:t>
             </w:r>
           </w:p>
         </w:tc>

</xml_diff>

<commit_message>
docs: refine line ranges for Node 14 and Node 15
</commit_message>
<xml_diff>
--- a/hop-trang/KiemThuHopTrang_UC09_TuDongHoaGuiEmail.docx
+++ b/hop-trang/KiemThuHopTrang_UC09_TuDongHoaGuiEmail.docx
@@ -1704,7 +1704,7 @@
               <w:rPr>
                 <w:sz w:val="18"/>
               </w:rPr>
-              <w:t>Dòng 67–85</w:t>
+              <w:t>Dòng 67–87</w:t>
             </w:r>
           </w:p>
         </w:tc>
@@ -1785,7 +1785,7 @@
               <w:rPr>
                 <w:sz w:val="18"/>
               </w:rPr>
-              <w:t>Dòng 87–88</w:t>
+              <w:t>Dòng 88</w:t>
             </w:r>
           </w:p>
         </w:tc>

</xml_diff>

<commit_message>
docs: separate Start entry point and define Node 1 as line 9
</commit_message>
<xml_diff>
--- a/hop-trang/KiemThuHopTrang_UC09_TuDongHoaGuiEmail.docx
+++ b/hop-trang/KiemThuHopTrang_UC09_TuDongHoaGuiEmail.docx
@@ -632,7 +632,7 @@
                 <w:b/>
                 <w:sz w:val="18"/>
               </w:rPr>
-              <w:t>Node 1</w:t>
+              <w:t>Start</w:t>
             </w:r>
           </w:p>
         </w:tc>
@@ -651,7 +651,7 @@
               <w:rPr>
                 <w:sz w:val="18"/>
               </w:rPr>
-              <w:t>Dòng 8–9</w:t>
+              <w:t>Dòng 8</w:t>
             </w:r>
           </w:p>
         </w:tc>
@@ -670,7 +670,7 @@
               <w:rPr>
                 <w:sz w:val="18"/>
               </w:rPr>
-              <w:t>Tiếp nhận input, kiểm tra if (!input.candidateIds || length === 0)</w:t>
+              <w:t>Bắt đầu hàm execute(input)</w:t>
             </w:r>
           </w:p>
         </w:tc>
@@ -689,7 +689,7 @@
               <w:rPr>
                 <w:sz w:val="18"/>
               </w:rPr>
-              <w:t>Decision (Quyết định 1)</w:t>
+              <w:t>Điểm vào (Entry Point)</w:t>
             </w:r>
           </w:p>
         </w:tc>
@@ -712,7 +712,7 @@
                 <w:b/>
                 <w:sz w:val="18"/>
               </w:rPr>
-              <w:t>Node 2</w:t>
+              <w:t>Node 1</w:t>
             </w:r>
           </w:p>
         </w:tc>
@@ -732,7 +732,7 @@
               <w:rPr>
                 <w:sz w:val="18"/>
               </w:rPr>
-              <w:t>Dòng 10</w:t>
+              <w:t>Dòng 9</w:t>
             </w:r>
           </w:p>
         </w:tc>
@@ -752,7 +752,7 @@
               <w:rPr>
                 <w:sz w:val="18"/>
               </w:rPr>
-              <w:t>throw new Error('Danh sách ứng viên không được để trống.')</w:t>
+              <w:t>Kiểm tra if (!input.candidateIds || length === 0)</w:t>
             </w:r>
           </w:p>
         </w:tc>
@@ -772,7 +772,7 @@
               <w:rPr>
                 <w:sz w:val="18"/>
               </w:rPr>
-              <w:t>Exit (Ngoại lệ 1)</w:t>
+              <w:t>Decision (Quyết định 1)</w:t>
             </w:r>
           </w:p>
         </w:tc>
@@ -794,7 +794,7 @@
                 <w:b/>
                 <w:sz w:val="18"/>
               </w:rPr>
-              <w:t>Node 3</w:t>
+              <w:t>Node 2</w:t>
             </w:r>
           </w:p>
         </w:tc>
@@ -813,7 +813,7 @@
               <w:rPr>
                 <w:sz w:val="18"/>
               </w:rPr>
-              <w:t>Dòng 13</w:t>
+              <w:t>Dòng 10</w:t>
             </w:r>
           </w:p>
         </w:tc>
@@ -832,7 +832,7 @@
               <w:rPr>
                 <w:sz w:val="18"/>
               </w:rPr>
-              <w:t>Kiểm tra tiêu đề email if (!input.title?.trim())</w:t>
+              <w:t>throw new Error('Danh sách ứng viên không được để trống.')</w:t>
             </w:r>
           </w:p>
         </w:tc>
@@ -851,7 +851,7 @@
               <w:rPr>
                 <w:sz w:val="18"/>
               </w:rPr>
-              <w:t>Decision (Quyết định 2)</w:t>
+              <w:t>Exit (Ngoại lệ 1)</w:t>
             </w:r>
           </w:p>
         </w:tc>
@@ -874,7 +874,7 @@
                 <w:b/>
                 <w:sz w:val="18"/>
               </w:rPr>
-              <w:t>Node 4</w:t>
+              <w:t>Node 3</w:t>
             </w:r>
           </w:p>
         </w:tc>
@@ -894,7 +894,7 @@
               <w:rPr>
                 <w:sz w:val="18"/>
               </w:rPr>
-              <w:t>Dòng 14</w:t>
+              <w:t>Dòng 13</w:t>
             </w:r>
           </w:p>
         </w:tc>
@@ -914,7 +914,7 @@
               <w:rPr>
                 <w:sz w:val="18"/>
               </w:rPr>
-              <w:t>throw new Error('Tiêu đề email không được để trống.')</w:t>
+              <w:t>Kiểm tra tiêu đề email if (!input.title?.trim())</w:t>
             </w:r>
           </w:p>
         </w:tc>
@@ -934,7 +934,7 @@
               <w:rPr>
                 <w:sz w:val="18"/>
               </w:rPr>
-              <w:t>Exit (Ngoại lệ 2)</w:t>
+              <w:t>Decision (Quyết định 2)</w:t>
             </w:r>
           </w:p>
         </w:tc>
@@ -956,7 +956,7 @@
                 <w:b/>
                 <w:sz w:val="18"/>
               </w:rPr>
-              <w:t>Node 5</w:t>
+              <w:t>Node 4</w:t>
             </w:r>
           </w:p>
         </w:tc>
@@ -975,7 +975,7 @@
               <w:rPr>
                 <w:sz w:val="18"/>
               </w:rPr>
-              <w:t>Dòng 17</w:t>
+              <w:t>Dòng 14</w:t>
             </w:r>
           </w:p>
         </w:tc>
@@ -994,7 +994,7 @@
               <w:rPr>
                 <w:sz w:val="18"/>
               </w:rPr>
-              <w:t>Kiểm tra nội dung email if (!input.content?.trim())</w:t>
+              <w:t>throw new Error('Tiêu đề email không được để trống.')</w:t>
             </w:r>
           </w:p>
         </w:tc>
@@ -1013,7 +1013,7 @@
               <w:rPr>
                 <w:sz w:val="18"/>
               </w:rPr>
-              <w:t>Decision (Quyết định 3)</w:t>
+              <w:t>Exit (Ngoại lệ 2)</w:t>
             </w:r>
           </w:p>
         </w:tc>
@@ -1036,7 +1036,7 @@
                 <w:b/>
                 <w:sz w:val="18"/>
               </w:rPr>
-              <w:t>Node 6</w:t>
+              <w:t>Node 5</w:t>
             </w:r>
           </w:p>
         </w:tc>
@@ -1056,7 +1056,7 @@
               <w:rPr>
                 <w:sz w:val="18"/>
               </w:rPr>
-              <w:t>Dòng 18</w:t>
+              <w:t>Dòng 17</w:t>
             </w:r>
           </w:p>
         </w:tc>
@@ -1076,7 +1076,7 @@
               <w:rPr>
                 <w:sz w:val="18"/>
               </w:rPr>
-              <w:t>throw new Error('Nội dung email không được để trống.')</w:t>
+              <w:t>Kiểm tra nội dung email if (!input.content?.trim())</w:t>
             </w:r>
           </w:p>
         </w:tc>
@@ -1096,7 +1096,7 @@
               <w:rPr>
                 <w:sz w:val="18"/>
               </w:rPr>
-              <w:t>Exit (Ngoại lệ 3)</w:t>
+              <w:t>Decision (Quyết định 3)</w:t>
             </w:r>
           </w:p>
         </w:tc>
@@ -1118,7 +1118,7 @@
                 <w:b/>
                 <w:sz w:val="18"/>
               </w:rPr>
-              <w:t>Node 7</w:t>
+              <w:t>Node 6</w:t>
             </w:r>
           </w:p>
         </w:tc>
@@ -1137,7 +1137,7 @@
               <w:rPr>
                 <w:sz w:val="18"/>
               </w:rPr>
-              <w:t>Dòng 21–33</w:t>
+              <w:t>Dòng 18</w:t>
             </w:r>
           </w:p>
         </w:tc>
@@ -1156,7 +1156,7 @@
               <w:rPr>
                 <w:sz w:val="18"/>
               </w:rPr>
-              <w:t>Khởi tạo failed, totalSent, lấy candidates, for (i &lt; candidates.length)</w:t>
+              <w:t>throw new Error('Nội dung email không được để trống.')</w:t>
             </w:r>
           </w:p>
         </w:tc>
@@ -1175,7 +1175,7 @@
               <w:rPr>
                 <w:sz w:val="18"/>
               </w:rPr>
-              <w:t>Loop / Decision 4</w:t>
+              <w:t>Exit (Ngoại lệ 3)</w:t>
             </w:r>
           </w:p>
         </w:tc>
@@ -1198,7 +1198,7 @@
                 <w:b/>
                 <w:sz w:val="18"/>
               </w:rPr>
-              <w:t>Node 8</w:t>
+              <w:t>Node 7</w:t>
             </w:r>
           </w:p>
         </w:tc>
@@ -1218,7 +1218,7 @@
               <w:rPr>
                 <w:sz w:val="18"/>
               </w:rPr>
-              <w:t>Dòng 34–38</w:t>
+              <w:t>Dòng 21–33</w:t>
             </w:r>
           </w:p>
         </w:tc>
@@ -1238,6 +1238,86 @@
               <w:rPr>
                 <w:sz w:val="18"/>
               </w:rPr>
+              <w:t>Khởi tạo failed, totalSent, lấy candidates, for (i &lt; candidates.length)</w:t>
+            </w:r>
+          </w:p>
+        </w:tc>
+        <w:tc>
+          <w:tcPr>
+            <w:tcW w:type="dxa" w:w="2484"/>
+            <w:shd w:fill="F9FAFB"/>
+            <w:tcMar>
+              <w:top w:w="100" w:type="dxa"/>
+              <w:bottom w:w="100" w:type="dxa"/>
+              <w:left w:w="140" w:type="dxa"/>
+              <w:right w:w="140" w:type="dxa"/>
+            </w:tcMar>
+          </w:tcPr>
+          <w:p>
+            <w:r>
+              <w:rPr>
+                <w:sz w:val="18"/>
+              </w:rPr>
+              <w:t>Loop / Decision 4</w:t>
+            </w:r>
+          </w:p>
+        </w:tc>
+      </w:tr>
+      <w:tr>
+        <w:tc>
+          <w:tcPr>
+            <w:tcW w:type="dxa" w:w="2484"/>
+            <w:tcMar>
+              <w:top w:w="100" w:type="dxa"/>
+              <w:bottom w:w="100" w:type="dxa"/>
+              <w:left w:w="140" w:type="dxa"/>
+              <w:right w:w="140" w:type="dxa"/>
+            </w:tcMar>
+          </w:tcPr>
+          <w:p>
+            <w:r>
+              <w:rPr>
+                <w:b/>
+                <w:sz w:val="18"/>
+              </w:rPr>
+              <w:t>Node 8</w:t>
+            </w:r>
+          </w:p>
+        </w:tc>
+        <w:tc>
+          <w:tcPr>
+            <w:tcW w:type="dxa" w:w="2484"/>
+            <w:tcMar>
+              <w:top w:w="100" w:type="dxa"/>
+              <w:bottom w:w="100" w:type="dxa"/>
+              <w:left w:w="140" w:type="dxa"/>
+              <w:right w:w="140" w:type="dxa"/>
+            </w:tcMar>
+          </w:tcPr>
+          <w:p>
+            <w:r>
+              <w:rPr>
+                <w:sz w:val="18"/>
+              </w:rPr>
+              <w:t>Dòng 34–38</w:t>
+            </w:r>
+          </w:p>
+        </w:tc>
+        <w:tc>
+          <w:tcPr>
+            <w:tcW w:type="dxa" w:w="2484"/>
+            <w:tcMar>
+              <w:top w:w="100" w:type="dxa"/>
+              <w:bottom w:w="100" w:type="dxa"/>
+              <w:left w:w="140" w:type="dxa"/>
+              <w:right w:w="140" w:type="dxa"/>
+            </w:tcMar>
+          </w:tcPr>
+          <w:p>
+            <w:r>
+              <w:rPr>
+                <w:sz w:val="18"/>
+              </w:rPr>
               <w:t>Lấy candidate, bắt đầu try, kiểm tra if (!candidate)</w:t>
             </w:r>
           </w:p>
@@ -1245,7 +1325,6 @@
         <w:tc>
           <w:tcPr>
             <w:tcW w:type="dxa" w:w="2484"/>
-            <w:shd w:fill="F9FAFB"/>
             <w:tcMar>
               <w:top w:w="100" w:type="dxa"/>
               <w:bottom w:w="100" w:type="dxa"/>
@@ -1267,6 +1346,7 @@
         <w:tc>
           <w:tcPr>
             <w:tcW w:type="dxa" w:w="2484"/>
+            <w:shd w:fill="F9FAFB"/>
             <w:tcMar>
               <w:top w:w="100" w:type="dxa"/>
               <w:bottom w:w="100" w:type="dxa"/>
@@ -1287,6 +1367,7 @@
         <w:tc>
           <w:tcPr>
             <w:tcW w:type="dxa" w:w="2484"/>
+            <w:shd w:fill="F9FAFB"/>
             <w:tcMar>
               <w:top w:w="100" w:type="dxa"/>
               <w:bottom w:w="100" w:type="dxa"/>
@@ -1306,6 +1387,7 @@
         <w:tc>
           <w:tcPr>
             <w:tcW w:type="dxa" w:w="2484"/>
+            <w:shd w:fill="F9FAFB"/>
             <w:tcMar>
               <w:top w:w="100" w:type="dxa"/>
               <w:bottom w:w="100" w:type="dxa"/>
@@ -1319,6 +1401,572 @@
                 <w:sz w:val="18"/>
               </w:rPr>
               <w:t>failed.push('Không tìm thấy ứng viên.'), continue (về Node 7)</w:t>
+            </w:r>
+          </w:p>
+        </w:tc>
+        <w:tc>
+          <w:tcPr>
+            <w:tcW w:type="dxa" w:w="2484"/>
+            <w:shd w:fill="F9FAFB"/>
+            <w:tcMar>
+              <w:top w:w="100" w:type="dxa"/>
+              <w:bottom w:w="100" w:type="dxa"/>
+              <w:left w:w="140" w:type="dxa"/>
+              <w:right w:w="140" w:type="dxa"/>
+            </w:tcMar>
+          </w:tcPr>
+          <w:p>
+            <w:r>
+              <w:rPr>
+                <w:sz w:val="18"/>
+              </w:rPr>
+              <w:t>Process</w:t>
+            </w:r>
+          </w:p>
+        </w:tc>
+      </w:tr>
+      <w:tr>
+        <w:tc>
+          <w:tcPr>
+            <w:tcW w:type="dxa" w:w="2484"/>
+            <w:tcMar>
+              <w:top w:w="100" w:type="dxa"/>
+              <w:bottom w:w="100" w:type="dxa"/>
+              <w:left w:w="140" w:type="dxa"/>
+              <w:right w:w="140" w:type="dxa"/>
+            </w:tcMar>
+          </w:tcPr>
+          <w:p>
+            <w:r>
+              <w:rPr>
+                <w:b/>
+                <w:sz w:val="18"/>
+              </w:rPr>
+              <w:t>Node 10</w:t>
+            </w:r>
+          </w:p>
+        </w:tc>
+        <w:tc>
+          <w:tcPr>
+            <w:tcW w:type="dxa" w:w="2484"/>
+            <w:tcMar>
+              <w:top w:w="100" w:type="dxa"/>
+              <w:bottom w:w="100" w:type="dxa"/>
+              <w:left w:w="140" w:type="dxa"/>
+              <w:right w:w="140" w:type="dxa"/>
+            </w:tcMar>
+          </w:tcPr>
+          <w:p>
+            <w:r>
+              <w:rPr>
+                <w:sz w:val="18"/>
+              </w:rPr>
+              <w:t>Dòng 46–47</w:t>
+            </w:r>
+          </w:p>
+        </w:tc>
+        <w:tc>
+          <w:tcPr>
+            <w:tcW w:type="dxa" w:w="2484"/>
+            <w:tcMar>
+              <w:top w:w="100" w:type="dxa"/>
+              <w:bottom w:w="100" w:type="dxa"/>
+              <w:left w:w="140" w:type="dxa"/>
+              <w:right w:w="140" w:type="dxa"/>
+            </w:tcMar>
+          </w:tcPr>
+          <w:p>
+            <w:r>
+              <w:rPr>
+                <w:sz w:val="18"/>
+              </w:rPr>
+              <w:t>Lấy personal, kiểm tra if (!personal?.email)</w:t>
+            </w:r>
+          </w:p>
+        </w:tc>
+        <w:tc>
+          <w:tcPr>
+            <w:tcW w:type="dxa" w:w="2484"/>
+            <w:tcMar>
+              <w:top w:w="100" w:type="dxa"/>
+              <w:bottom w:w="100" w:type="dxa"/>
+              <w:left w:w="140" w:type="dxa"/>
+              <w:right w:w="140" w:type="dxa"/>
+            </w:tcMar>
+          </w:tcPr>
+          <w:p>
+            <w:r>
+              <w:rPr>
+                <w:sz w:val="18"/>
+              </w:rPr>
+              <w:t>Decision (Quyết định 6)</w:t>
+            </w:r>
+          </w:p>
+        </w:tc>
+      </w:tr>
+      <w:tr>
+        <w:tc>
+          <w:tcPr>
+            <w:tcW w:type="dxa" w:w="2484"/>
+            <w:shd w:fill="F9FAFB"/>
+            <w:tcMar>
+              <w:top w:w="100" w:type="dxa"/>
+              <w:bottom w:w="100" w:type="dxa"/>
+              <w:left w:w="140" w:type="dxa"/>
+              <w:right w:w="140" w:type="dxa"/>
+            </w:tcMar>
+          </w:tcPr>
+          <w:p>
+            <w:r>
+              <w:rPr>
+                <w:b/>
+                <w:sz w:val="18"/>
+              </w:rPr>
+              <w:t>Node 11</w:t>
+            </w:r>
+          </w:p>
+        </w:tc>
+        <w:tc>
+          <w:tcPr>
+            <w:tcW w:type="dxa" w:w="2484"/>
+            <w:shd w:fill="F9FAFB"/>
+            <w:tcMar>
+              <w:top w:w="100" w:type="dxa"/>
+              <w:bottom w:w="100" w:type="dxa"/>
+              <w:left w:w="140" w:type="dxa"/>
+              <w:right w:w="140" w:type="dxa"/>
+            </w:tcMar>
+          </w:tcPr>
+          <w:p>
+            <w:r>
+              <w:rPr>
+                <w:sz w:val="18"/>
+              </w:rPr>
+              <w:t>Dòng 48–53</w:t>
+            </w:r>
+          </w:p>
+        </w:tc>
+        <w:tc>
+          <w:tcPr>
+            <w:tcW w:type="dxa" w:w="2484"/>
+            <w:shd w:fill="F9FAFB"/>
+            <w:tcMar>
+              <w:top w:w="100" w:type="dxa"/>
+              <w:bottom w:w="100" w:type="dxa"/>
+              <w:left w:w="140" w:type="dxa"/>
+              <w:right w:w="140" w:type="dxa"/>
+            </w:tcMar>
+          </w:tcPr>
+          <w:p>
+            <w:r>
+              <w:rPr>
+                <w:sz w:val="18"/>
+              </w:rPr>
+              <w:t>failed.push('Ứng viên không có email.'), continue (về Node 7)</w:t>
+            </w:r>
+          </w:p>
+        </w:tc>
+        <w:tc>
+          <w:tcPr>
+            <w:tcW w:type="dxa" w:w="2484"/>
+            <w:shd w:fill="F9FAFB"/>
+            <w:tcMar>
+              <w:top w:w="100" w:type="dxa"/>
+              <w:bottom w:w="100" w:type="dxa"/>
+              <w:left w:w="140" w:type="dxa"/>
+              <w:right w:w="140" w:type="dxa"/>
+            </w:tcMar>
+          </w:tcPr>
+          <w:p>
+            <w:r>
+              <w:rPr>
+                <w:sz w:val="18"/>
+              </w:rPr>
+              <w:t>Process</w:t>
+            </w:r>
+          </w:p>
+        </w:tc>
+      </w:tr>
+      <w:tr>
+        <w:tc>
+          <w:tcPr>
+            <w:tcW w:type="dxa" w:w="2484"/>
+            <w:tcMar>
+              <w:top w:w="100" w:type="dxa"/>
+              <w:bottom w:w="100" w:type="dxa"/>
+              <w:left w:w="140" w:type="dxa"/>
+              <w:right w:w="140" w:type="dxa"/>
+            </w:tcMar>
+          </w:tcPr>
+          <w:p>
+            <w:r>
+              <w:rPr>
+                <w:b/>
+                <w:sz w:val="18"/>
+              </w:rPr>
+              <w:t>Node 12</w:t>
+            </w:r>
+          </w:p>
+        </w:tc>
+        <w:tc>
+          <w:tcPr>
+            <w:tcW w:type="dxa" w:w="2484"/>
+            <w:tcMar>
+              <w:top w:w="100" w:type="dxa"/>
+              <w:bottom w:w="100" w:type="dxa"/>
+              <w:left w:w="140" w:type="dxa"/>
+              <w:right w:w="140" w:type="dxa"/>
+            </w:tcMar>
+          </w:tcPr>
+          <w:p>
+            <w:r>
+              <w:rPr>
+                <w:sz w:val="18"/>
+              </w:rPr>
+              <w:t>Dòng 56–58</w:t>
+            </w:r>
+          </w:p>
+        </w:tc>
+        <w:tc>
+          <w:tcPr>
+            <w:tcW w:type="dxa" w:w="2484"/>
+            <w:tcMar>
+              <w:top w:w="100" w:type="dxa"/>
+              <w:bottom w:w="100" w:type="dxa"/>
+              <w:left w:w="140" w:type="dxa"/>
+              <w:right w:w="140" w:type="dxa"/>
+            </w:tcMar>
+          </w:tcPr>
+          <w:p>
+            <w:r>
+              <w:rPr>
+                <w:sz w:val="18"/>
+              </w:rPr>
+              <w:t>Lấy jobID, kiểm tra if (jobID)</w:t>
+            </w:r>
+          </w:p>
+        </w:tc>
+        <w:tc>
+          <w:tcPr>
+            <w:tcW w:type="dxa" w:w="2484"/>
+            <w:tcMar>
+              <w:top w:w="100" w:type="dxa"/>
+              <w:bottom w:w="100" w:type="dxa"/>
+              <w:left w:w="140" w:type="dxa"/>
+              <w:right w:w="140" w:type="dxa"/>
+            </w:tcMar>
+          </w:tcPr>
+          <w:p>
+            <w:r>
+              <w:rPr>
+                <w:sz w:val="18"/>
+              </w:rPr>
+              <w:t>Decision (Quyết định 7)</w:t>
+            </w:r>
+          </w:p>
+        </w:tc>
+      </w:tr>
+      <w:tr>
+        <w:tc>
+          <w:tcPr>
+            <w:tcW w:type="dxa" w:w="2484"/>
+            <w:shd w:fill="F9FAFB"/>
+            <w:tcMar>
+              <w:top w:w="100" w:type="dxa"/>
+              <w:bottom w:w="100" w:type="dxa"/>
+              <w:left w:w="140" w:type="dxa"/>
+              <w:right w:w="140" w:type="dxa"/>
+            </w:tcMar>
+          </w:tcPr>
+          <w:p>
+            <w:r>
+              <w:rPr>
+                <w:b/>
+                <w:sz w:val="18"/>
+              </w:rPr>
+              <w:t>Node 13</w:t>
+            </w:r>
+          </w:p>
+        </w:tc>
+        <w:tc>
+          <w:tcPr>
+            <w:tcW w:type="dxa" w:w="2484"/>
+            <w:shd w:fill="F9FAFB"/>
+            <w:tcMar>
+              <w:top w:w="100" w:type="dxa"/>
+              <w:bottom w:w="100" w:type="dxa"/>
+              <w:left w:w="140" w:type="dxa"/>
+              <w:right w:w="140" w:type="dxa"/>
+            </w:tcMar>
+          </w:tcPr>
+          <w:p>
+            <w:r>
+              <w:rPr>
+                <w:sz w:val="18"/>
+              </w:rPr>
+              <w:t>Dòng 59–64</w:t>
+            </w:r>
+          </w:p>
+        </w:tc>
+        <w:tc>
+          <w:tcPr>
+            <w:tcW w:type="dxa" w:w="2484"/>
+            <w:shd w:fill="F9FAFB"/>
+            <w:tcMar>
+              <w:top w:w="100" w:type="dxa"/>
+              <w:bottom w:w="100" w:type="dxa"/>
+              <w:left w:w="140" w:type="dxa"/>
+              <w:right w:w="140" w:type="dxa"/>
+            </w:tcMar>
+          </w:tcPr>
+          <w:p>
+            <w:r>
+              <w:rPr>
+                <w:sz w:val="18"/>
+              </w:rPr>
+              <w:t>Khối try-catch lấy thông tin jobRepo.getById(jobID)</w:t>
+            </w:r>
+          </w:p>
+        </w:tc>
+        <w:tc>
+          <w:tcPr>
+            <w:tcW w:type="dxa" w:w="2484"/>
+            <w:shd w:fill="F9FAFB"/>
+            <w:tcMar>
+              <w:top w:w="100" w:type="dxa"/>
+              <w:bottom w:w="100" w:type="dxa"/>
+              <w:left w:w="140" w:type="dxa"/>
+              <w:right w:w="140" w:type="dxa"/>
+            </w:tcMar>
+          </w:tcPr>
+          <w:p>
+            <w:r>
+              <w:rPr>
+                <w:sz w:val="18"/>
+              </w:rPr>
+              <w:t>Process</w:t>
+            </w:r>
+          </w:p>
+        </w:tc>
+      </w:tr>
+      <w:tr>
+        <w:tc>
+          <w:tcPr>
+            <w:tcW w:type="dxa" w:w="2484"/>
+            <w:tcMar>
+              <w:top w:w="100" w:type="dxa"/>
+              <w:bottom w:w="100" w:type="dxa"/>
+              <w:left w:w="140" w:type="dxa"/>
+              <w:right w:w="140" w:type="dxa"/>
+            </w:tcMar>
+          </w:tcPr>
+          <w:p>
+            <w:r>
+              <w:rPr>
+                <w:b/>
+                <w:sz w:val="18"/>
+              </w:rPr>
+              <w:t>Node 14</w:t>
+            </w:r>
+          </w:p>
+        </w:tc>
+        <w:tc>
+          <w:tcPr>
+            <w:tcW w:type="dxa" w:w="2484"/>
+            <w:tcMar>
+              <w:top w:w="100" w:type="dxa"/>
+              <w:bottom w:w="100" w:type="dxa"/>
+              <w:left w:w="140" w:type="dxa"/>
+              <w:right w:w="140" w:type="dxa"/>
+            </w:tcMar>
+          </w:tcPr>
+          <w:p>
+            <w:r>
+              <w:rPr>
+                <w:sz w:val="18"/>
+              </w:rPr>
+              <w:t>Dòng 67–87</w:t>
+            </w:r>
+          </w:p>
+        </w:tc>
+        <w:tc>
+          <w:tcPr>
+            <w:tcW w:type="dxa" w:w="2484"/>
+            <w:tcMar>
+              <w:top w:w="100" w:type="dxa"/>
+              <w:bottom w:w="100" w:type="dxa"/>
+              <w:left w:w="140" w:type="dxa"/>
+              <w:right w:w="140" w:type="dxa"/>
+            </w:tcMar>
+          </w:tcPr>
+          <w:p>
+            <w:r>
+              <w:rPr>
+                <w:sz w:val="18"/>
+              </w:rPr>
+              <w:t>replacePlaceholders, dựng html, gọi mailSvc.sendEmail, if (sent)</w:t>
+            </w:r>
+          </w:p>
+        </w:tc>
+        <w:tc>
+          <w:tcPr>
+            <w:tcW w:type="dxa" w:w="2484"/>
+            <w:tcMar>
+              <w:top w:w="100" w:type="dxa"/>
+              <w:bottom w:w="100" w:type="dxa"/>
+              <w:left w:w="140" w:type="dxa"/>
+              <w:right w:w="140" w:type="dxa"/>
+            </w:tcMar>
+          </w:tcPr>
+          <w:p>
+            <w:r>
+              <w:rPr>
+                <w:sz w:val="18"/>
+              </w:rPr>
+              <w:t>Decision (Quyết định 8)</w:t>
+            </w:r>
+          </w:p>
+        </w:tc>
+      </w:tr>
+      <w:tr>
+        <w:tc>
+          <w:tcPr>
+            <w:tcW w:type="dxa" w:w="2484"/>
+            <w:shd w:fill="F9FAFB"/>
+            <w:tcMar>
+              <w:top w:w="100" w:type="dxa"/>
+              <w:bottom w:w="100" w:type="dxa"/>
+              <w:left w:w="140" w:type="dxa"/>
+              <w:right w:w="140" w:type="dxa"/>
+            </w:tcMar>
+          </w:tcPr>
+          <w:p>
+            <w:r>
+              <w:rPr>
+                <w:b/>
+                <w:sz w:val="18"/>
+              </w:rPr>
+              <w:t>Node 15</w:t>
+            </w:r>
+          </w:p>
+        </w:tc>
+        <w:tc>
+          <w:tcPr>
+            <w:tcW w:type="dxa" w:w="2484"/>
+            <w:shd w:fill="F9FAFB"/>
+            <w:tcMar>
+              <w:top w:w="100" w:type="dxa"/>
+              <w:bottom w:w="100" w:type="dxa"/>
+              <w:left w:w="140" w:type="dxa"/>
+              <w:right w:w="140" w:type="dxa"/>
+            </w:tcMar>
+          </w:tcPr>
+          <w:p>
+            <w:r>
+              <w:rPr>
+                <w:sz w:val="18"/>
+              </w:rPr>
+              <w:t>Dòng 88</w:t>
+            </w:r>
+          </w:p>
+        </w:tc>
+        <w:tc>
+          <w:tcPr>
+            <w:tcW w:type="dxa" w:w="2484"/>
+            <w:shd w:fill="F9FAFB"/>
+            <w:tcMar>
+              <w:top w:w="100" w:type="dxa"/>
+              <w:bottom w:w="100" w:type="dxa"/>
+              <w:left w:w="140" w:type="dxa"/>
+              <w:right w:w="140" w:type="dxa"/>
+            </w:tcMar>
+          </w:tcPr>
+          <w:p>
+            <w:r>
+              <w:rPr>
+                <w:sz w:val="18"/>
+              </w:rPr>
+              <w:t>Tăng biến đếm: totalSent++</w:t>
+            </w:r>
+          </w:p>
+        </w:tc>
+        <w:tc>
+          <w:tcPr>
+            <w:tcW w:type="dxa" w:w="2484"/>
+            <w:shd w:fill="F9FAFB"/>
+            <w:tcMar>
+              <w:top w:w="100" w:type="dxa"/>
+              <w:bottom w:w="100" w:type="dxa"/>
+              <w:left w:w="140" w:type="dxa"/>
+              <w:right w:w="140" w:type="dxa"/>
+            </w:tcMar>
+          </w:tcPr>
+          <w:p>
+            <w:r>
+              <w:rPr>
+                <w:sz w:val="18"/>
+              </w:rPr>
+              <w:t>Process</w:t>
+            </w:r>
+          </w:p>
+        </w:tc>
+      </w:tr>
+      <w:tr>
+        <w:tc>
+          <w:tcPr>
+            <w:tcW w:type="dxa" w:w="2484"/>
+            <w:tcMar>
+              <w:top w:w="100" w:type="dxa"/>
+              <w:bottom w:w="100" w:type="dxa"/>
+              <w:left w:w="140" w:type="dxa"/>
+              <w:right w:w="140" w:type="dxa"/>
+            </w:tcMar>
+          </w:tcPr>
+          <w:p>
+            <w:r>
+              <w:rPr>
+                <w:b/>
+                <w:sz w:val="18"/>
+              </w:rPr>
+              <w:t>Node 16</w:t>
+            </w:r>
+          </w:p>
+        </w:tc>
+        <w:tc>
+          <w:tcPr>
+            <w:tcW w:type="dxa" w:w="2484"/>
+            <w:tcMar>
+              <w:top w:w="100" w:type="dxa"/>
+              <w:bottom w:w="100" w:type="dxa"/>
+              <w:left w:w="140" w:type="dxa"/>
+              <w:right w:w="140" w:type="dxa"/>
+            </w:tcMar>
+          </w:tcPr>
+          <w:p>
+            <w:r>
+              <w:rPr>
+                <w:sz w:val="18"/>
+              </w:rPr>
+              <w:t>Dòng 89–94</w:t>
+            </w:r>
+          </w:p>
+        </w:tc>
+        <w:tc>
+          <w:tcPr>
+            <w:tcW w:type="dxa" w:w="2484"/>
+            <w:tcMar>
+              <w:top w:w="100" w:type="dxa"/>
+              <w:bottom w:w="100" w:type="dxa"/>
+              <w:left w:w="140" w:type="dxa"/>
+              <w:right w:w="140" w:type="dxa"/>
+            </w:tcMar>
+          </w:tcPr>
+          <w:p>
+            <w:r>
+              <w:rPr>
+                <w:sz w:val="18"/>
+              </w:rPr>
+              <w:t>failed.push('Lỗi gửi email từ dịch vụ mail.')</w:t>
             </w:r>
           </w:p>
         </w:tc>
@@ -1360,7 +2008,7 @@
                 <w:b/>
                 <w:sz w:val="18"/>
               </w:rPr>
-              <w:t>Node 10</w:t>
+              <w:t>Node 17</w:t>
             </w:r>
           </w:p>
         </w:tc>
@@ -1380,7 +2028,7 @@
               <w:rPr>
                 <w:sz w:val="18"/>
               </w:rPr>
-              <w:t>Dòng 46–47</w:t>
+              <w:t>Dòng 96–103</w:t>
             </w:r>
           </w:p>
         </w:tc>
@@ -1400,7 +2048,7 @@
               <w:rPr>
                 <w:sz w:val="18"/>
               </w:rPr>
-              <w:t>Lấy personal, kiểm tra if (!personal?.email)</w:t>
+              <w:t>catch (error) { failed.push(...) } bắt ngoại lệ runtime</w:t>
             </w:r>
           </w:p>
         </w:tc>
@@ -1420,7 +2068,7 @@
               <w:rPr>
                 <w:sz w:val="18"/>
               </w:rPr>
-              <w:t>Decision (Quyết định 6)</w:t>
+              <w:t>Exception Handler</w:t>
             </w:r>
           </w:p>
         </w:tc>
@@ -1442,572 +2090,6 @@
                 <w:b/>
                 <w:sz w:val="18"/>
               </w:rPr>
-              <w:t>Node 11</w:t>
-            </w:r>
-          </w:p>
-        </w:tc>
-        <w:tc>
-          <w:tcPr>
-            <w:tcW w:type="dxa" w:w="2484"/>
-            <w:tcMar>
-              <w:top w:w="100" w:type="dxa"/>
-              <w:bottom w:w="100" w:type="dxa"/>
-              <w:left w:w="140" w:type="dxa"/>
-              <w:right w:w="140" w:type="dxa"/>
-            </w:tcMar>
-          </w:tcPr>
-          <w:p>
-            <w:r>
-              <w:rPr>
-                <w:sz w:val="18"/>
-              </w:rPr>
-              <w:t>Dòng 48–53</w:t>
-            </w:r>
-          </w:p>
-        </w:tc>
-        <w:tc>
-          <w:tcPr>
-            <w:tcW w:type="dxa" w:w="2484"/>
-            <w:tcMar>
-              <w:top w:w="100" w:type="dxa"/>
-              <w:bottom w:w="100" w:type="dxa"/>
-              <w:left w:w="140" w:type="dxa"/>
-              <w:right w:w="140" w:type="dxa"/>
-            </w:tcMar>
-          </w:tcPr>
-          <w:p>
-            <w:r>
-              <w:rPr>
-                <w:sz w:val="18"/>
-              </w:rPr>
-              <w:t>failed.push('Ứng viên không có email.'), continue (về Node 7)</w:t>
-            </w:r>
-          </w:p>
-        </w:tc>
-        <w:tc>
-          <w:tcPr>
-            <w:tcW w:type="dxa" w:w="2484"/>
-            <w:tcMar>
-              <w:top w:w="100" w:type="dxa"/>
-              <w:bottom w:w="100" w:type="dxa"/>
-              <w:left w:w="140" w:type="dxa"/>
-              <w:right w:w="140" w:type="dxa"/>
-            </w:tcMar>
-          </w:tcPr>
-          <w:p>
-            <w:r>
-              <w:rPr>
-                <w:sz w:val="18"/>
-              </w:rPr>
-              <w:t>Process</w:t>
-            </w:r>
-          </w:p>
-        </w:tc>
-      </w:tr>
-      <w:tr>
-        <w:tc>
-          <w:tcPr>
-            <w:tcW w:type="dxa" w:w="2484"/>
-            <w:shd w:fill="F9FAFB"/>
-            <w:tcMar>
-              <w:top w:w="100" w:type="dxa"/>
-              <w:bottom w:w="100" w:type="dxa"/>
-              <w:left w:w="140" w:type="dxa"/>
-              <w:right w:w="140" w:type="dxa"/>
-            </w:tcMar>
-          </w:tcPr>
-          <w:p>
-            <w:r>
-              <w:rPr>
-                <w:b/>
-                <w:sz w:val="18"/>
-              </w:rPr>
-              <w:t>Node 12</w:t>
-            </w:r>
-          </w:p>
-        </w:tc>
-        <w:tc>
-          <w:tcPr>
-            <w:tcW w:type="dxa" w:w="2484"/>
-            <w:shd w:fill="F9FAFB"/>
-            <w:tcMar>
-              <w:top w:w="100" w:type="dxa"/>
-              <w:bottom w:w="100" w:type="dxa"/>
-              <w:left w:w="140" w:type="dxa"/>
-              <w:right w:w="140" w:type="dxa"/>
-            </w:tcMar>
-          </w:tcPr>
-          <w:p>
-            <w:r>
-              <w:rPr>
-                <w:sz w:val="18"/>
-              </w:rPr>
-              <w:t>Dòng 56–58</w:t>
-            </w:r>
-          </w:p>
-        </w:tc>
-        <w:tc>
-          <w:tcPr>
-            <w:tcW w:type="dxa" w:w="2484"/>
-            <w:shd w:fill="F9FAFB"/>
-            <w:tcMar>
-              <w:top w:w="100" w:type="dxa"/>
-              <w:bottom w:w="100" w:type="dxa"/>
-              <w:left w:w="140" w:type="dxa"/>
-              <w:right w:w="140" w:type="dxa"/>
-            </w:tcMar>
-          </w:tcPr>
-          <w:p>
-            <w:r>
-              <w:rPr>
-                <w:sz w:val="18"/>
-              </w:rPr>
-              <w:t>Lấy jobID, kiểm tra if (jobID)</w:t>
-            </w:r>
-          </w:p>
-        </w:tc>
-        <w:tc>
-          <w:tcPr>
-            <w:tcW w:type="dxa" w:w="2484"/>
-            <w:shd w:fill="F9FAFB"/>
-            <w:tcMar>
-              <w:top w:w="100" w:type="dxa"/>
-              <w:bottom w:w="100" w:type="dxa"/>
-              <w:left w:w="140" w:type="dxa"/>
-              <w:right w:w="140" w:type="dxa"/>
-            </w:tcMar>
-          </w:tcPr>
-          <w:p>
-            <w:r>
-              <w:rPr>
-                <w:sz w:val="18"/>
-              </w:rPr>
-              <w:t>Decision (Quyết định 7)</w:t>
-            </w:r>
-          </w:p>
-        </w:tc>
-      </w:tr>
-      <w:tr>
-        <w:tc>
-          <w:tcPr>
-            <w:tcW w:type="dxa" w:w="2484"/>
-            <w:tcMar>
-              <w:top w:w="100" w:type="dxa"/>
-              <w:bottom w:w="100" w:type="dxa"/>
-              <w:left w:w="140" w:type="dxa"/>
-              <w:right w:w="140" w:type="dxa"/>
-            </w:tcMar>
-          </w:tcPr>
-          <w:p>
-            <w:r>
-              <w:rPr>
-                <w:b/>
-                <w:sz w:val="18"/>
-              </w:rPr>
-              <w:t>Node 13</w:t>
-            </w:r>
-          </w:p>
-        </w:tc>
-        <w:tc>
-          <w:tcPr>
-            <w:tcW w:type="dxa" w:w="2484"/>
-            <w:tcMar>
-              <w:top w:w="100" w:type="dxa"/>
-              <w:bottom w:w="100" w:type="dxa"/>
-              <w:left w:w="140" w:type="dxa"/>
-              <w:right w:w="140" w:type="dxa"/>
-            </w:tcMar>
-          </w:tcPr>
-          <w:p>
-            <w:r>
-              <w:rPr>
-                <w:sz w:val="18"/>
-              </w:rPr>
-              <w:t>Dòng 59–64</w:t>
-            </w:r>
-          </w:p>
-        </w:tc>
-        <w:tc>
-          <w:tcPr>
-            <w:tcW w:type="dxa" w:w="2484"/>
-            <w:tcMar>
-              <w:top w:w="100" w:type="dxa"/>
-              <w:bottom w:w="100" w:type="dxa"/>
-              <w:left w:w="140" w:type="dxa"/>
-              <w:right w:w="140" w:type="dxa"/>
-            </w:tcMar>
-          </w:tcPr>
-          <w:p>
-            <w:r>
-              <w:rPr>
-                <w:sz w:val="18"/>
-              </w:rPr>
-              <w:t>Khối try-catch lấy thông tin jobRepo.getById(jobID)</w:t>
-            </w:r>
-          </w:p>
-        </w:tc>
-        <w:tc>
-          <w:tcPr>
-            <w:tcW w:type="dxa" w:w="2484"/>
-            <w:tcMar>
-              <w:top w:w="100" w:type="dxa"/>
-              <w:bottom w:w="100" w:type="dxa"/>
-              <w:left w:w="140" w:type="dxa"/>
-              <w:right w:w="140" w:type="dxa"/>
-            </w:tcMar>
-          </w:tcPr>
-          <w:p>
-            <w:r>
-              <w:rPr>
-                <w:sz w:val="18"/>
-              </w:rPr>
-              <w:t>Process</w:t>
-            </w:r>
-          </w:p>
-        </w:tc>
-      </w:tr>
-      <w:tr>
-        <w:tc>
-          <w:tcPr>
-            <w:tcW w:type="dxa" w:w="2484"/>
-            <w:shd w:fill="F9FAFB"/>
-            <w:tcMar>
-              <w:top w:w="100" w:type="dxa"/>
-              <w:bottom w:w="100" w:type="dxa"/>
-              <w:left w:w="140" w:type="dxa"/>
-              <w:right w:w="140" w:type="dxa"/>
-            </w:tcMar>
-          </w:tcPr>
-          <w:p>
-            <w:r>
-              <w:rPr>
-                <w:b/>
-                <w:sz w:val="18"/>
-              </w:rPr>
-              <w:t>Node 14</w:t>
-            </w:r>
-          </w:p>
-        </w:tc>
-        <w:tc>
-          <w:tcPr>
-            <w:tcW w:type="dxa" w:w="2484"/>
-            <w:shd w:fill="F9FAFB"/>
-            <w:tcMar>
-              <w:top w:w="100" w:type="dxa"/>
-              <w:bottom w:w="100" w:type="dxa"/>
-              <w:left w:w="140" w:type="dxa"/>
-              <w:right w:w="140" w:type="dxa"/>
-            </w:tcMar>
-          </w:tcPr>
-          <w:p>
-            <w:r>
-              <w:rPr>
-                <w:sz w:val="18"/>
-              </w:rPr>
-              <w:t>Dòng 67–87</w:t>
-            </w:r>
-          </w:p>
-        </w:tc>
-        <w:tc>
-          <w:tcPr>
-            <w:tcW w:type="dxa" w:w="2484"/>
-            <w:shd w:fill="F9FAFB"/>
-            <w:tcMar>
-              <w:top w:w="100" w:type="dxa"/>
-              <w:bottom w:w="100" w:type="dxa"/>
-              <w:left w:w="140" w:type="dxa"/>
-              <w:right w:w="140" w:type="dxa"/>
-            </w:tcMar>
-          </w:tcPr>
-          <w:p>
-            <w:r>
-              <w:rPr>
-                <w:sz w:val="18"/>
-              </w:rPr>
-              <w:t>replacePlaceholders, dựng html, gọi mailSvc.sendEmail, if (sent)</w:t>
-            </w:r>
-          </w:p>
-        </w:tc>
-        <w:tc>
-          <w:tcPr>
-            <w:tcW w:type="dxa" w:w="2484"/>
-            <w:shd w:fill="F9FAFB"/>
-            <w:tcMar>
-              <w:top w:w="100" w:type="dxa"/>
-              <w:bottom w:w="100" w:type="dxa"/>
-              <w:left w:w="140" w:type="dxa"/>
-              <w:right w:w="140" w:type="dxa"/>
-            </w:tcMar>
-          </w:tcPr>
-          <w:p>
-            <w:r>
-              <w:rPr>
-                <w:sz w:val="18"/>
-              </w:rPr>
-              <w:t>Decision (Quyết định 8)</w:t>
-            </w:r>
-          </w:p>
-        </w:tc>
-      </w:tr>
-      <w:tr>
-        <w:tc>
-          <w:tcPr>
-            <w:tcW w:type="dxa" w:w="2484"/>
-            <w:tcMar>
-              <w:top w:w="100" w:type="dxa"/>
-              <w:bottom w:w="100" w:type="dxa"/>
-              <w:left w:w="140" w:type="dxa"/>
-              <w:right w:w="140" w:type="dxa"/>
-            </w:tcMar>
-          </w:tcPr>
-          <w:p>
-            <w:r>
-              <w:rPr>
-                <w:b/>
-                <w:sz w:val="18"/>
-              </w:rPr>
-              <w:t>Node 15</w:t>
-            </w:r>
-          </w:p>
-        </w:tc>
-        <w:tc>
-          <w:tcPr>
-            <w:tcW w:type="dxa" w:w="2484"/>
-            <w:tcMar>
-              <w:top w:w="100" w:type="dxa"/>
-              <w:bottom w:w="100" w:type="dxa"/>
-              <w:left w:w="140" w:type="dxa"/>
-              <w:right w:w="140" w:type="dxa"/>
-            </w:tcMar>
-          </w:tcPr>
-          <w:p>
-            <w:r>
-              <w:rPr>
-                <w:sz w:val="18"/>
-              </w:rPr>
-              <w:t>Dòng 88</w:t>
-            </w:r>
-          </w:p>
-        </w:tc>
-        <w:tc>
-          <w:tcPr>
-            <w:tcW w:type="dxa" w:w="2484"/>
-            <w:tcMar>
-              <w:top w:w="100" w:type="dxa"/>
-              <w:bottom w:w="100" w:type="dxa"/>
-              <w:left w:w="140" w:type="dxa"/>
-              <w:right w:w="140" w:type="dxa"/>
-            </w:tcMar>
-          </w:tcPr>
-          <w:p>
-            <w:r>
-              <w:rPr>
-                <w:sz w:val="18"/>
-              </w:rPr>
-              <w:t>Tăng biến đếm: totalSent++</w:t>
-            </w:r>
-          </w:p>
-        </w:tc>
-        <w:tc>
-          <w:tcPr>
-            <w:tcW w:type="dxa" w:w="2484"/>
-            <w:tcMar>
-              <w:top w:w="100" w:type="dxa"/>
-              <w:bottom w:w="100" w:type="dxa"/>
-              <w:left w:w="140" w:type="dxa"/>
-              <w:right w:w="140" w:type="dxa"/>
-            </w:tcMar>
-          </w:tcPr>
-          <w:p>
-            <w:r>
-              <w:rPr>
-                <w:sz w:val="18"/>
-              </w:rPr>
-              <w:t>Process</w:t>
-            </w:r>
-          </w:p>
-        </w:tc>
-      </w:tr>
-      <w:tr>
-        <w:tc>
-          <w:tcPr>
-            <w:tcW w:type="dxa" w:w="2484"/>
-            <w:shd w:fill="F9FAFB"/>
-            <w:tcMar>
-              <w:top w:w="100" w:type="dxa"/>
-              <w:bottom w:w="100" w:type="dxa"/>
-              <w:left w:w="140" w:type="dxa"/>
-              <w:right w:w="140" w:type="dxa"/>
-            </w:tcMar>
-          </w:tcPr>
-          <w:p>
-            <w:r>
-              <w:rPr>
-                <w:b/>
-                <w:sz w:val="18"/>
-              </w:rPr>
-              <w:t>Node 16</w:t>
-            </w:r>
-          </w:p>
-        </w:tc>
-        <w:tc>
-          <w:tcPr>
-            <w:tcW w:type="dxa" w:w="2484"/>
-            <w:shd w:fill="F9FAFB"/>
-            <w:tcMar>
-              <w:top w:w="100" w:type="dxa"/>
-              <w:bottom w:w="100" w:type="dxa"/>
-              <w:left w:w="140" w:type="dxa"/>
-              <w:right w:w="140" w:type="dxa"/>
-            </w:tcMar>
-          </w:tcPr>
-          <w:p>
-            <w:r>
-              <w:rPr>
-                <w:sz w:val="18"/>
-              </w:rPr>
-              <w:t>Dòng 89–94</w:t>
-            </w:r>
-          </w:p>
-        </w:tc>
-        <w:tc>
-          <w:tcPr>
-            <w:tcW w:type="dxa" w:w="2484"/>
-            <w:shd w:fill="F9FAFB"/>
-            <w:tcMar>
-              <w:top w:w="100" w:type="dxa"/>
-              <w:bottom w:w="100" w:type="dxa"/>
-              <w:left w:w="140" w:type="dxa"/>
-              <w:right w:w="140" w:type="dxa"/>
-            </w:tcMar>
-          </w:tcPr>
-          <w:p>
-            <w:r>
-              <w:rPr>
-                <w:sz w:val="18"/>
-              </w:rPr>
-              <w:t>failed.push('Lỗi gửi email từ dịch vụ mail.')</w:t>
-            </w:r>
-          </w:p>
-        </w:tc>
-        <w:tc>
-          <w:tcPr>
-            <w:tcW w:type="dxa" w:w="2484"/>
-            <w:shd w:fill="F9FAFB"/>
-            <w:tcMar>
-              <w:top w:w="100" w:type="dxa"/>
-              <w:bottom w:w="100" w:type="dxa"/>
-              <w:left w:w="140" w:type="dxa"/>
-              <w:right w:w="140" w:type="dxa"/>
-            </w:tcMar>
-          </w:tcPr>
-          <w:p>
-            <w:r>
-              <w:rPr>
-                <w:sz w:val="18"/>
-              </w:rPr>
-              <w:t>Process</w:t>
-            </w:r>
-          </w:p>
-        </w:tc>
-      </w:tr>
-      <w:tr>
-        <w:tc>
-          <w:tcPr>
-            <w:tcW w:type="dxa" w:w="2484"/>
-            <w:tcMar>
-              <w:top w:w="100" w:type="dxa"/>
-              <w:bottom w:w="100" w:type="dxa"/>
-              <w:left w:w="140" w:type="dxa"/>
-              <w:right w:w="140" w:type="dxa"/>
-            </w:tcMar>
-          </w:tcPr>
-          <w:p>
-            <w:r>
-              <w:rPr>
-                <w:b/>
-                <w:sz w:val="18"/>
-              </w:rPr>
-              <w:t>Node 17</w:t>
-            </w:r>
-          </w:p>
-        </w:tc>
-        <w:tc>
-          <w:tcPr>
-            <w:tcW w:type="dxa" w:w="2484"/>
-            <w:tcMar>
-              <w:top w:w="100" w:type="dxa"/>
-              <w:bottom w:w="100" w:type="dxa"/>
-              <w:left w:w="140" w:type="dxa"/>
-              <w:right w:w="140" w:type="dxa"/>
-            </w:tcMar>
-          </w:tcPr>
-          <w:p>
-            <w:r>
-              <w:rPr>
-                <w:sz w:val="18"/>
-              </w:rPr>
-              <w:t>Dòng 96–103</w:t>
-            </w:r>
-          </w:p>
-        </w:tc>
-        <w:tc>
-          <w:tcPr>
-            <w:tcW w:type="dxa" w:w="2484"/>
-            <w:tcMar>
-              <w:top w:w="100" w:type="dxa"/>
-              <w:bottom w:w="100" w:type="dxa"/>
-              <w:left w:w="140" w:type="dxa"/>
-              <w:right w:w="140" w:type="dxa"/>
-            </w:tcMar>
-          </w:tcPr>
-          <w:p>
-            <w:r>
-              <w:rPr>
-                <w:sz w:val="18"/>
-              </w:rPr>
-              <w:t>catch (error) { failed.push(...) } bắt ngoại lệ runtime</w:t>
-            </w:r>
-          </w:p>
-        </w:tc>
-        <w:tc>
-          <w:tcPr>
-            <w:tcW w:type="dxa" w:w="2484"/>
-            <w:tcMar>
-              <w:top w:w="100" w:type="dxa"/>
-              <w:bottom w:w="100" w:type="dxa"/>
-              <w:left w:w="140" w:type="dxa"/>
-              <w:right w:w="140" w:type="dxa"/>
-            </w:tcMar>
-          </w:tcPr>
-          <w:p>
-            <w:r>
-              <w:rPr>
-                <w:sz w:val="18"/>
-              </w:rPr>
-              <w:t>Exception Handler</w:t>
-            </w:r>
-          </w:p>
-        </w:tc>
-      </w:tr>
-      <w:tr>
-        <w:tc>
-          <w:tcPr>
-            <w:tcW w:type="dxa" w:w="2484"/>
-            <w:shd w:fill="F9FAFB"/>
-            <w:tcMar>
-              <w:top w:w="100" w:type="dxa"/>
-              <w:bottom w:w="100" w:type="dxa"/>
-              <w:left w:w="140" w:type="dxa"/>
-              <w:right w:w="140" w:type="dxa"/>
-            </w:tcMar>
-          </w:tcPr>
-          <w:p>
-            <w:r>
-              <w:rPr>
-                <w:b/>
-                <w:sz w:val="18"/>
-              </w:rPr>
               <w:t>Node 18</w:t>
             </w:r>
           </w:p>
@@ -2015,7 +2097,6 @@
         <w:tc>
           <w:tcPr>
             <w:tcW w:type="dxa" w:w="2484"/>
-            <w:shd w:fill="F9FAFB"/>
             <w:tcMar>
               <w:top w:w="100" w:type="dxa"/>
               <w:bottom w:w="100" w:type="dxa"/>
@@ -2035,7 +2116,6 @@
         <w:tc>
           <w:tcPr>
             <w:tcW w:type="dxa" w:w="2484"/>
-            <w:shd w:fill="F9FAFB"/>
             <w:tcMar>
               <w:top w:w="100" w:type="dxa"/>
               <w:bottom w:w="100" w:type="dxa"/>
@@ -2055,7 +2135,6 @@
         <w:tc>
           <w:tcPr>
             <w:tcW w:type="dxa" w:w="2484"/>
-            <w:shd w:fill="F9FAFB"/>
             <w:tcMar>
               <w:top w:w="100" w:type="dxa"/>
               <w:bottom w:w="100" w:type="dxa"/>

</xml_diff>

<commit_message>
docs: standardize white-box CFG and blocks table into 20 distinct nodes
</commit_message>
<xml_diff>
--- a/hop-trang/KiemThuHopTrang_UC09_TuDongHoaGuiEmail.docx
+++ b/hop-trang/KiemThuHopTrang_UC09_TuDongHoaGuiEmail.docx
@@ -752,7 +752,7 @@
               <w:rPr>
                 <w:sz w:val="18"/>
               </w:rPr>
-              <w:t>Kiểm tra if (!input.candidateIds || length === 0)</w:t>
+              <w:t>Điều kiện if (!input.candidateIds || length === 0)</w:t>
             </w:r>
           </w:p>
         </w:tc>
@@ -914,7 +914,7 @@
               <w:rPr>
                 <w:sz w:val="18"/>
               </w:rPr>
-              <w:t>Kiểm tra tiêu đề email if (!input.title?.trim())</w:t>
+              <w:t>Điều kiện kiểm tra tiêu đề email if (!input.title?.trim())</w:t>
             </w:r>
           </w:p>
         </w:tc>
@@ -1076,7 +1076,7 @@
               <w:rPr>
                 <w:sz w:val="18"/>
               </w:rPr>
-              <w:t>Kiểm tra nội dung email if (!input.content?.trim())</w:t>
+              <w:t>Điều kiện kiểm tra nội dung email if (!input.content?.trim())</w:t>
             </w:r>
           </w:p>
         </w:tc>
@@ -1218,7 +1218,7 @@
               <w:rPr>
                 <w:sz w:val="18"/>
               </w:rPr>
-              <w:t>Dòng 21–33</w:t>
+              <w:t>Dòng 21–31</w:t>
             </w:r>
           </w:p>
         </w:tc>
@@ -1238,7 +1238,7 @@
               <w:rPr>
                 <w:sz w:val="18"/>
               </w:rPr>
-              <w:t>Khởi tạo failed, totalSent, lấy candidates, for (i &lt; candidates.length)</w:t>
+              <w:t>Khởi tạo failed = [], totalSent = 0, candidates = await Promise.all(...)</w:t>
             </w:r>
           </w:p>
         </w:tc>
@@ -1258,7 +1258,7 @@
               <w:rPr>
                 <w:sz w:val="18"/>
               </w:rPr>
-              <w:t>Loop / Decision 4</w:t>
+              <w:t>Process (Xử lý chuẩn bị)</w:t>
             </w:r>
           </w:p>
         </w:tc>
@@ -1299,7 +1299,7 @@
               <w:rPr>
                 <w:sz w:val="18"/>
               </w:rPr>
-              <w:t>Dòng 34–38</w:t>
+              <w:t>Dòng 33</w:t>
             </w:r>
           </w:p>
         </w:tc>
@@ -1318,7 +1318,7 @@
               <w:rPr>
                 <w:sz w:val="18"/>
               </w:rPr>
-              <w:t>Lấy candidate, bắt đầu try, kiểm tra if (!candidate)</w:t>
+              <w:t>Vòng lặp for (let i = 0; i &lt; candidates.length; i++)</w:t>
             </w:r>
           </w:p>
         </w:tc>
@@ -1337,7 +1337,7 @@
               <w:rPr>
                 <w:sz w:val="18"/>
               </w:rPr>
-              <w:t>Decision (Quyết định 5)</w:t>
+              <w:t>Decision / Loop Header (Quyết định 4)</w:t>
             </w:r>
           </w:p>
         </w:tc>
@@ -1380,7 +1380,7 @@
               <w:rPr>
                 <w:sz w:val="18"/>
               </w:rPr>
-              <w:t>Dòng 39–43</w:t>
+              <w:t>Dòng 34–38</w:t>
             </w:r>
           </w:p>
         </w:tc>
@@ -1400,7 +1400,7 @@
               <w:rPr>
                 <w:sz w:val="18"/>
               </w:rPr>
-              <w:t>failed.push('Không tìm thấy ứng viên.'), continue (về Node 7)</w:t>
+              <w:t>Lấy candidate, candidateId, try, kiểm tra if (!candidate)</w:t>
             </w:r>
           </w:p>
         </w:tc>
@@ -1420,7 +1420,7 @@
               <w:rPr>
                 <w:sz w:val="18"/>
               </w:rPr>
-              <w:t>Process</w:t>
+              <w:t>Decision (Quyết định 5)</w:t>
             </w:r>
           </w:p>
         </w:tc>
@@ -1461,7 +1461,7 @@
               <w:rPr>
                 <w:sz w:val="18"/>
               </w:rPr>
-              <w:t>Dòng 46–47</w:t>
+              <w:t>Dòng 39–43</w:t>
             </w:r>
           </w:p>
         </w:tc>
@@ -1480,7 +1480,7 @@
               <w:rPr>
                 <w:sz w:val="18"/>
               </w:rPr>
-              <w:t>Lấy personal, kiểm tra if (!personal?.email)</w:t>
+              <w:t>Thân if: failed.push(...), continue (quay lại Node 8)</w:t>
             </w:r>
           </w:p>
         </w:tc>
@@ -1499,7 +1499,7 @@
               <w:rPr>
                 <w:sz w:val="18"/>
               </w:rPr>
-              <w:t>Decision (Quyết định 6)</w:t>
+              <w:t>Process (Xử lý rẽ nhánh)</w:t>
             </w:r>
           </w:p>
         </w:tc>
@@ -1542,7 +1542,7 @@
               <w:rPr>
                 <w:sz w:val="18"/>
               </w:rPr>
-              <w:t>Dòng 48–53</w:t>
+              <w:t>Dòng 46–47</w:t>
             </w:r>
           </w:p>
         </w:tc>
@@ -1562,7 +1562,7 @@
               <w:rPr>
                 <w:sz w:val="18"/>
               </w:rPr>
-              <w:t>failed.push('Ứng viên không có email.'), continue (về Node 7)</w:t>
+              <w:t>Lấy personal = candidate.getPersonal(), kiểm tra if (!personal?.email)</w:t>
             </w:r>
           </w:p>
         </w:tc>
@@ -1582,7 +1582,7 @@
               <w:rPr>
                 <w:sz w:val="18"/>
               </w:rPr>
-              <w:t>Process</w:t>
+              <w:t>Decision (Quyết định 6)</w:t>
             </w:r>
           </w:p>
         </w:tc>
@@ -1623,7 +1623,7 @@
               <w:rPr>
                 <w:sz w:val="18"/>
               </w:rPr>
-              <w:t>Dòng 56–58</w:t>
+              <w:t>Dòng 48–53</w:t>
             </w:r>
           </w:p>
         </w:tc>
@@ -1642,7 +1642,7 @@
               <w:rPr>
                 <w:sz w:val="18"/>
               </w:rPr>
-              <w:t>Lấy jobID, kiểm tra if (jobID)</w:t>
+              <w:t>Thân if: failed.push(...), continue (quay lại Node 8)</w:t>
             </w:r>
           </w:p>
         </w:tc>
@@ -1661,7 +1661,7 @@
               <w:rPr>
                 <w:sz w:val="18"/>
               </w:rPr>
-              <w:t>Decision (Quyết định 7)</w:t>
+              <w:t>Process (Xử lý rẽ nhánh)</w:t>
             </w:r>
           </w:p>
         </w:tc>
@@ -1704,7 +1704,7 @@
               <w:rPr>
                 <w:sz w:val="18"/>
               </w:rPr>
-              <w:t>Dòng 59–64</w:t>
+              <w:t>Dòng 56–58</w:t>
             </w:r>
           </w:p>
         </w:tc>
@@ -1724,7 +1724,7 @@
               <w:rPr>
                 <w:sz w:val="18"/>
               </w:rPr>
-              <w:t>Khối try-catch lấy thông tin jobRepo.getById(jobID)</w:t>
+              <w:t>Khởi tạo jobTitle, jobID, kiểm tra if (jobID)</w:t>
             </w:r>
           </w:p>
         </w:tc>
@@ -1744,7 +1744,7 @@
               <w:rPr>
                 <w:sz w:val="18"/>
               </w:rPr>
-              <w:t>Process</w:t>
+              <w:t>Decision (Quyết định 7)</w:t>
             </w:r>
           </w:p>
         </w:tc>
@@ -1785,7 +1785,7 @@
               <w:rPr>
                 <w:sz w:val="18"/>
               </w:rPr>
-              <w:t>Dòng 67–87</w:t>
+              <w:t>Dòng 59–64</w:t>
             </w:r>
           </w:p>
         </w:tc>
@@ -1804,7 +1804,7 @@
               <w:rPr>
                 <w:sz w:val="18"/>
               </w:rPr>
-              <w:t>replacePlaceholders, dựng html, gọi mailSvc.sendEmail, if (sent)</w:t>
+              <w:t>Thân if: try-catch truy vấn jobRepo.getById(jobID) lấy jobTitle</w:t>
             </w:r>
           </w:p>
         </w:tc>
@@ -1823,7 +1823,7 @@
               <w:rPr>
                 <w:sz w:val="18"/>
               </w:rPr>
-              <w:t>Decision (Quyết định 8)</w:t>
+              <w:t>Process (Xử lý truy vấn)</w:t>
             </w:r>
           </w:p>
         </w:tc>
@@ -1866,7 +1866,7 @@
               <w:rPr>
                 <w:sz w:val="18"/>
               </w:rPr>
-              <w:t>Dòng 88</w:t>
+              <w:t>Dòng 67–85</w:t>
             </w:r>
           </w:p>
         </w:tc>
@@ -1886,7 +1886,7 @@
               <w:rPr>
                 <w:sz w:val="18"/>
               </w:rPr>
-              <w:t>Tăng biến đếm: totalSent++</w:t>
+              <w:t>Thay thế placeholder, dựng htmlContent, sent = await mailSvc.sendEmail(...)</w:t>
             </w:r>
           </w:p>
         </w:tc>
@@ -1906,7 +1906,7 @@
               <w:rPr>
                 <w:sz w:val="18"/>
               </w:rPr>
-              <w:t>Process</w:t>
+              <w:t>Process (Xử lý gửi mail)</w:t>
             </w:r>
           </w:p>
         </w:tc>
@@ -1947,7 +1947,7 @@
               <w:rPr>
                 <w:sz w:val="18"/>
               </w:rPr>
-              <w:t>Dòng 89–94</w:t>
+              <w:t>Dòng 87</w:t>
             </w:r>
           </w:p>
         </w:tc>
@@ -1966,7 +1966,7 @@
               <w:rPr>
                 <w:sz w:val="18"/>
               </w:rPr>
-              <w:t>failed.push('Lỗi gửi email từ dịch vụ mail.')</w:t>
+              <w:t>Kiểm tra kết quả gửi thư: if (sent)</w:t>
             </w:r>
           </w:p>
         </w:tc>
@@ -1985,7 +1985,7 @@
               <w:rPr>
                 <w:sz w:val="18"/>
               </w:rPr>
-              <w:t>Process</w:t>
+              <w:t>Decision (Quyết định 8)</w:t>
             </w:r>
           </w:p>
         </w:tc>
@@ -2028,7 +2028,7 @@
               <w:rPr>
                 <w:sz w:val="18"/>
               </w:rPr>
-              <w:t>Dòng 96–103</w:t>
+              <w:t>Dòng 88</w:t>
             </w:r>
           </w:p>
         </w:tc>
@@ -2048,7 +2048,7 @@
               <w:rPr>
                 <w:sz w:val="18"/>
               </w:rPr>
-              <w:t>catch (error) { failed.push(...) } bắt ngoại lệ runtime</w:t>
+              <w:t>Thân True của if 8: tăng biến đếm totalSent++</w:t>
             </w:r>
           </w:p>
         </w:tc>
@@ -2068,7 +2068,7 @@
               <w:rPr>
                 <w:sz w:val="18"/>
               </w:rPr>
-              <w:t>Exception Handler</w:t>
+              <w:t>Process (Xử lý thành công)</w:t>
             </w:r>
           </w:p>
         </w:tc>
@@ -2109,6 +2109,168 @@
               <w:rPr>
                 <w:sz w:val="18"/>
               </w:rPr>
+              <w:t>Dòng 89–94</w:t>
+            </w:r>
+          </w:p>
+        </w:tc>
+        <w:tc>
+          <w:tcPr>
+            <w:tcW w:type="dxa" w:w="2484"/>
+            <w:tcMar>
+              <w:top w:w="100" w:type="dxa"/>
+              <w:bottom w:w="100" w:type="dxa"/>
+              <w:left w:w="140" w:type="dxa"/>
+              <w:right w:w="140" w:type="dxa"/>
+            </w:tcMar>
+          </w:tcPr>
+          <w:p>
+            <w:r>
+              <w:rPr>
+                <w:sz w:val="18"/>
+              </w:rPr>
+              <w:t>Thân False (else) của if 8: failed.push('Lỗi gửi email từ dịch vụ mail.')</w:t>
+            </w:r>
+          </w:p>
+        </w:tc>
+        <w:tc>
+          <w:tcPr>
+            <w:tcW w:type="dxa" w:w="2484"/>
+            <w:tcMar>
+              <w:top w:w="100" w:type="dxa"/>
+              <w:bottom w:w="100" w:type="dxa"/>
+              <w:left w:w="140" w:type="dxa"/>
+              <w:right w:w="140" w:type="dxa"/>
+            </w:tcMar>
+          </w:tcPr>
+          <w:p>
+            <w:r>
+              <w:rPr>
+                <w:sz w:val="18"/>
+              </w:rPr>
+              <w:t>Process (Xử lý thất bại)</w:t>
+            </w:r>
+          </w:p>
+        </w:tc>
+      </w:tr>
+      <w:tr>
+        <w:tc>
+          <w:tcPr>
+            <w:tcW w:type="dxa" w:w="2484"/>
+            <w:shd w:fill="F9FAFB"/>
+            <w:tcMar>
+              <w:top w:w="100" w:type="dxa"/>
+              <w:bottom w:w="100" w:type="dxa"/>
+              <w:left w:w="140" w:type="dxa"/>
+              <w:right w:w="140" w:type="dxa"/>
+            </w:tcMar>
+          </w:tcPr>
+          <w:p>
+            <w:r>
+              <w:rPr>
+                <w:b/>
+                <w:sz w:val="18"/>
+              </w:rPr>
+              <w:t>Node 19</w:t>
+            </w:r>
+          </w:p>
+        </w:tc>
+        <w:tc>
+          <w:tcPr>
+            <w:tcW w:type="dxa" w:w="2484"/>
+            <w:shd w:fill="F9FAFB"/>
+            <w:tcMar>
+              <w:top w:w="100" w:type="dxa"/>
+              <w:bottom w:w="100" w:type="dxa"/>
+              <w:left w:w="140" w:type="dxa"/>
+              <w:right w:w="140" w:type="dxa"/>
+            </w:tcMar>
+          </w:tcPr>
+          <w:p>
+            <w:r>
+              <w:rPr>
+                <w:sz w:val="18"/>
+              </w:rPr>
+              <w:t>Dòng 96–103</w:t>
+            </w:r>
+          </w:p>
+        </w:tc>
+        <w:tc>
+          <w:tcPr>
+            <w:tcW w:type="dxa" w:w="2484"/>
+            <w:shd w:fill="F9FAFB"/>
+            <w:tcMar>
+              <w:top w:w="100" w:type="dxa"/>
+              <w:bottom w:w="100" w:type="dxa"/>
+              <w:left w:w="140" w:type="dxa"/>
+              <w:right w:w="140" w:type="dxa"/>
+            </w:tcMar>
+          </w:tcPr>
+          <w:p>
+            <w:r>
+              <w:rPr>
+                <w:sz w:val="18"/>
+              </w:rPr>
+              <w:t>Khối bắt ngoại lệ ngoài: catch (error) { failed.push(...) }</w:t>
+            </w:r>
+          </w:p>
+        </w:tc>
+        <w:tc>
+          <w:tcPr>
+            <w:tcW w:type="dxa" w:w="2484"/>
+            <w:shd w:fill="F9FAFB"/>
+            <w:tcMar>
+              <w:top w:w="100" w:type="dxa"/>
+              <w:bottom w:w="100" w:type="dxa"/>
+              <w:left w:w="140" w:type="dxa"/>
+              <w:right w:w="140" w:type="dxa"/>
+            </w:tcMar>
+          </w:tcPr>
+          <w:p>
+            <w:r>
+              <w:rPr>
+                <w:sz w:val="18"/>
+              </w:rPr>
+              <w:t>Exception Handler (Ngoại lệ)</w:t>
+            </w:r>
+          </w:p>
+        </w:tc>
+      </w:tr>
+      <w:tr>
+        <w:tc>
+          <w:tcPr>
+            <w:tcW w:type="dxa" w:w="2484"/>
+            <w:tcMar>
+              <w:top w:w="100" w:type="dxa"/>
+              <w:bottom w:w="100" w:type="dxa"/>
+              <w:left w:w="140" w:type="dxa"/>
+              <w:right w:w="140" w:type="dxa"/>
+            </w:tcMar>
+          </w:tcPr>
+          <w:p>
+            <w:r>
+              <w:rPr>
+                <w:b/>
+                <w:sz w:val="18"/>
+              </w:rPr>
+              <w:t>Node 20</w:t>
+            </w:r>
+          </w:p>
+        </w:tc>
+        <w:tc>
+          <w:tcPr>
+            <w:tcW w:type="dxa" w:w="2484"/>
+            <w:tcMar>
+              <w:top w:w="100" w:type="dxa"/>
+              <w:bottom w:w="100" w:type="dxa"/>
+              <w:left w:w="140" w:type="dxa"/>
+              <w:right w:w="140" w:type="dxa"/>
+            </w:tcMar>
+          </w:tcPr>
+          <w:p>
+            <w:r>
+              <w:rPr>
+                <w:sz w:val="18"/>
+              </w:rPr>
               <w:t>Dòng 107–112</w:t>
             </w:r>
           </w:p>
@@ -2128,7 +2290,7 @@
               <w:rPr>
                 <w:sz w:val="18"/>
               </w:rPr>
-              <w:t>return { success: true, message, totalSent, failed }</w:t>
+              <w:t>Hết vòng lặp for: return { success: true, message, totalSent, failed }</w:t>
             </w:r>
           </w:p>
         </w:tc>
@@ -2167,17 +2329,17 @@
         <w:rPr>
           <w:sz w:val="20"/>
         </w:rPr>
-        <w:t>Đồ thị dòng điều khiển (CFG) của phương thức execute được xây dựng với 18 đỉnh (Nodes) và 25 cung (Edges) rẽ nhánh nhị phân:</w:t>
+        <w:t>Đồ thị dòng điều khiển (CFG) của phương thức execute được xây dựng với 20 đỉnh (Nodes 1-20) và 27 cung (Edges) rẽ nhánh nhị phân:</w:t>
         <w:br/>
         <w:br/>
         <w:t>• Phương pháp 1 (Số cung và số đỉnh):</w:t>
         <w:br/>
-        <w:t xml:space="preserve">   V(G) = E - N + 2P = 25 - 18 + 2(1) = 9</w:t>
+        <w:t xml:space="preserve">   V(G) = E - N + 2P = 27 - 20 + 2(1) = 9</w:t>
         <w:br/>
         <w:br/>
         <w:t>• Phương pháp 2 (Số điểm quyết định vị từ Pn):</w:t>
         <w:br/>
-        <w:t xml:space="preserve">   V(G) = Pn + 1 = 8 (Predicate Nodes: N1, N3, N5, N7, N8, N10, N12, N14) + 1 = 9</w:t>
+        <w:t xml:space="preserve">   V(G) = Pn + 1 = 8 (Predicate Nodes: N1, N3, N5, N8, N9, N11, N13, N16) + 1 = 9</w:t>
         <w:br/>
         <w:br/>
         <w:t>• Phương pháp 3 (Số miền mặt phẳng khép kín R):</w:t>
@@ -2366,7 +2528,7 @@
               <w:rPr>
                 <w:sz w:val="17"/>
               </w:rPr>
-              <w:t>Path 1 (1-&gt;2)</w:t>
+              <w:t>Path 1 (Start-&gt;1-&gt;2)</w:t>
             </w:r>
           </w:p>
         </w:tc>
@@ -2467,7 +2629,7 @@
               <w:rPr>
                 <w:sz w:val="17"/>
               </w:rPr>
-              <w:t>Path 2 (1-&gt;3-&gt;4)</w:t>
+              <w:t>Path 2 (Start-&gt;1-&gt;3-&gt;4)</w:t>
             </w:r>
           </w:p>
         </w:tc>
@@ -2569,7 +2731,7 @@
               <w:rPr>
                 <w:sz w:val="17"/>
               </w:rPr>
-              <w:t>Path 3 (1-&gt;3-&gt;5-&gt;6)</w:t>
+              <w:t>Path 3 (Start-&gt;1-&gt;3-&gt;5-&gt;6)</w:t>
             </w:r>
           </w:p>
         </w:tc>
@@ -2670,7 +2832,7 @@
               <w:rPr>
                 <w:sz w:val="17"/>
               </w:rPr>
-              <w:t>Path 5 (1-&gt;3-&gt;5-&gt;7-&gt;8-&gt;9-&gt;7-&gt;18)</w:t>
+              <w:t>Path 5 (Start..-&gt;8-&gt;9-&gt;10-&gt;8-&gt;20)</w:t>
             </w:r>
           </w:p>
         </w:tc>
@@ -2772,7 +2934,7 @@
               <w:rPr>
                 <w:sz w:val="17"/>
               </w:rPr>
-              <w:t>Path 6 (1-&gt;3-&gt;5-&gt;7-&gt;8-&gt;10-&gt;11-&gt;7-&gt;18)</w:t>
+              <w:t>Path 6 (Start..-&gt;8-&gt;9-&gt;11-&gt;12-&gt;8-&gt;20)</w:t>
             </w:r>
           </w:p>
         </w:tc>
@@ -2873,7 +3035,7 @@
               <w:rPr>
                 <w:sz w:val="17"/>
               </w:rPr>
-              <w:t>Path 7 (1..-&gt;12-&gt;14-&gt;16-&gt;7-&gt;18)</w:t>
+              <w:t>Path 7 (Start..-&gt;13-&gt;15-&gt;16-&gt;18-&gt;8-&gt;20)</w:t>
             </w:r>
           </w:p>
         </w:tc>
@@ -2975,7 +3137,7 @@
               <w:rPr>
                 <w:sz w:val="17"/>
               </w:rPr>
-              <w:t>Path 8 (1..-&gt;12-&gt;13-&gt;14-&gt;15-&gt;7-&gt;18)</w:t>
+              <w:t>Path 8 (Start..-&gt;13-&gt;14-&gt;15-&gt;16-&gt;17-&gt;8-&gt;20)</w:t>
             </w:r>
           </w:p>
         </w:tc>
@@ -3076,7 +3238,7 @@
               <w:rPr>
                 <w:sz w:val="17"/>
               </w:rPr>
-              <w:t>Path 9 (1..-&gt;17-&gt;7-&gt;18)</w:t>
+              <w:t>Path 9 (Start..-&gt;11-&gt;19-&gt;8-&gt;20)</w:t>
             </w:r>
           </w:p>
         </w:tc>
@@ -3116,7 +3278,7 @@
               <w:rPr>
                 <w:sz w:val="17"/>
               </w:rPr>
-              <w:t>Khối catch bắt lỗi và ghi nhận vào failed array</w:t>
+              <w:t>Khối catch (Node 19) bắt lỗi và ghi nhận vào failed</w:t>
             </w:r>
           </w:p>
         </w:tc>
@@ -3157,7 +3319,7 @@
         <w:rPr>
           <w:sz w:val="20"/>
         </w:rPr>
-        <w:t>1. Độ bao phủ câu lệnh (C1 - Statement Coverage): Đạt 100% (18/18 khối lệnh cơ bản được thực thi).</w:t>
+        <w:t>1. Độ bao phủ câu lệnh (C1 - Statement Coverage): Đạt 100% (20/20 khối lệnh cơ bản được thực thi).</w:t>
         <w:br/>
         <w:t>2. Độ bao phủ nhánh quyết định (C2 - Branch Coverage): Đạt 100% (tất cả 8 điểm quyết định rẽ nhánh True/False đều được duyệt qua).</w:t>
         <w:br/>

</xml_diff>

<commit_message>
docs: split try-catch into Node 14a and Node 14b for complete branch coverage
</commit_message>
<xml_diff>
--- a/hop-trang/KiemThuHopTrang_UC09_TuDongHoaGuiEmail.docx
+++ b/hop-trang/KiemThuHopTrang_UC09_TuDongHoaGuiEmail.docx
@@ -1766,7 +1766,7 @@
                 <w:b/>
                 <w:sz w:val="18"/>
               </w:rPr>
-              <w:t>Node 14</w:t>
+              <w:t>Node 14a</w:t>
             </w:r>
           </w:p>
         </w:tc>
@@ -1785,7 +1785,7 @@
               <w:rPr>
                 <w:sz w:val="18"/>
               </w:rPr>
-              <w:t>Dòng 59–64</w:t>
+              <w:t>Dòng 59–61</w:t>
             </w:r>
           </w:p>
         </w:tc>
@@ -1804,7 +1804,7 @@
               <w:rPr>
                 <w:sz w:val="18"/>
               </w:rPr>
-              <w:t>Thân if: try-catch truy vấn jobRepo.getById(jobID) lấy jobTitle</w:t>
+              <w:t>Khối try: truy vấn jobRepo.getById(jobID) lấy jobTitle thành công</w:t>
             </w:r>
           </w:p>
         </w:tc>
@@ -1823,7 +1823,7 @@
               <w:rPr>
                 <w:sz w:val="18"/>
               </w:rPr>
-              <w:t>Process (Xử lý truy vấn)</w:t>
+              <w:t>Process (Truy vấn Job thành công)</w:t>
             </w:r>
           </w:p>
         </w:tc>
@@ -1846,7 +1846,7 @@
                 <w:b/>
                 <w:sz w:val="18"/>
               </w:rPr>
-              <w:t>Node 15</w:t>
+              <w:t>Node 14b</w:t>
             </w:r>
           </w:p>
         </w:tc>
@@ -1866,7 +1866,7 @@
               <w:rPr>
                 <w:sz w:val="18"/>
               </w:rPr>
-              <w:t>Dòng 67–85</w:t>
+              <w:t>Dòng 62–64</w:t>
             </w:r>
           </w:p>
         </w:tc>
@@ -1886,7 +1886,7 @@
               <w:rPr>
                 <w:sz w:val="18"/>
               </w:rPr>
-              <w:t>Thay thế placeholder, dựng htmlContent, sent = await mailSvc.sendEmail(...)</w:t>
+              <w:t>Khối catch: bắt lỗi truy vấn Job, in cảnh báo console.warn(...)</w:t>
             </w:r>
           </w:p>
         </w:tc>
@@ -1906,7 +1906,7 @@
               <w:rPr>
                 <w:sz w:val="18"/>
               </w:rPr>
-              <w:t>Process (Xử lý gửi mail)</w:t>
+              <w:t>Exception Handler (Bắt lỗi Job)</w:t>
             </w:r>
           </w:p>
         </w:tc>
@@ -1928,7 +1928,7 @@
                 <w:b/>
                 <w:sz w:val="18"/>
               </w:rPr>
-              <w:t>Node 16</w:t>
+              <w:t>Node 15</w:t>
             </w:r>
           </w:p>
         </w:tc>
@@ -1947,7 +1947,7 @@
               <w:rPr>
                 <w:sz w:val="18"/>
               </w:rPr>
-              <w:t>Dòng 87</w:t>
+              <w:t>Dòng 67–85</w:t>
             </w:r>
           </w:p>
         </w:tc>
@@ -1966,7 +1966,7 @@
               <w:rPr>
                 <w:sz w:val="18"/>
               </w:rPr>
-              <w:t>Kiểm tra kết quả gửi thư: if (sent)</w:t>
+              <w:t>Thay thế placeholder, dựng htmlContent, sent = await mailSvc.sendEmail(...)</w:t>
             </w:r>
           </w:p>
         </w:tc>
@@ -1985,7 +1985,7 @@
               <w:rPr>
                 <w:sz w:val="18"/>
               </w:rPr>
-              <w:t>Decision (Quyết định 8)</w:t>
+              <w:t>Process (Xử lý gửi mail)</w:t>
             </w:r>
           </w:p>
         </w:tc>
@@ -2008,7 +2008,7 @@
                 <w:b/>
                 <w:sz w:val="18"/>
               </w:rPr>
-              <w:t>Node 17</w:t>
+              <w:t>Node 16</w:t>
             </w:r>
           </w:p>
         </w:tc>
@@ -2028,7 +2028,7 @@
               <w:rPr>
                 <w:sz w:val="18"/>
               </w:rPr>
-              <w:t>Dòng 88</w:t>
+              <w:t>Dòng 87</w:t>
             </w:r>
           </w:p>
         </w:tc>
@@ -2048,7 +2048,7 @@
               <w:rPr>
                 <w:sz w:val="18"/>
               </w:rPr>
-              <w:t>Thân True của if 8: tăng biến đếm totalSent++</w:t>
+              <w:t>Kiểm tra kết quả gửi thư: if (sent)</w:t>
             </w:r>
           </w:p>
         </w:tc>
@@ -2068,7 +2068,7 @@
               <w:rPr>
                 <w:sz w:val="18"/>
               </w:rPr>
-              <w:t>Process (Xử lý thành công)</w:t>
+              <w:t>Decision (Quyết định 8)</w:t>
             </w:r>
           </w:p>
         </w:tc>
@@ -2090,7 +2090,7 @@
                 <w:b/>
                 <w:sz w:val="18"/>
               </w:rPr>
-              <w:t>Node 18</w:t>
+              <w:t>Node 17</w:t>
             </w:r>
           </w:p>
         </w:tc>
@@ -2109,7 +2109,7 @@
               <w:rPr>
                 <w:sz w:val="18"/>
               </w:rPr>
-              <w:t>Dòng 89–94</w:t>
+              <w:t>Dòng 88</w:t>
             </w:r>
           </w:p>
         </w:tc>
@@ -2128,7 +2128,7 @@
               <w:rPr>
                 <w:sz w:val="18"/>
               </w:rPr>
-              <w:t>Thân False (else) của if 8: failed.push('Lỗi gửi email từ dịch vụ mail.')</w:t>
+              <w:t>Thân True của if 8: tăng biến đếm totalSent++</w:t>
             </w:r>
           </w:p>
         </w:tc>
@@ -2147,7 +2147,7 @@
               <w:rPr>
                 <w:sz w:val="18"/>
               </w:rPr>
-              <w:t>Process (Xử lý thất bại)</w:t>
+              <w:t>Process (Xử lý thành công)</w:t>
             </w:r>
           </w:p>
         </w:tc>
@@ -2170,7 +2170,7 @@
                 <w:b/>
                 <w:sz w:val="18"/>
               </w:rPr>
-              <w:t>Node 19</w:t>
+              <w:t>Node 18</w:t>
             </w:r>
           </w:p>
         </w:tc>
@@ -2190,7 +2190,7 @@
               <w:rPr>
                 <w:sz w:val="18"/>
               </w:rPr>
-              <w:t>Dòng 96–103</w:t>
+              <w:t>Dòng 89–94</w:t>
             </w:r>
           </w:p>
         </w:tc>
@@ -2210,7 +2210,7 @@
               <w:rPr>
                 <w:sz w:val="18"/>
               </w:rPr>
-              <w:t>Khối bắt ngoại lệ ngoài: catch (error) { failed.push(...) }</w:t>
+              <w:t>Thân False (else) của if 8: failed.push('Lỗi gửi email từ dịch vụ mail.')</w:t>
             </w:r>
           </w:p>
         </w:tc>
@@ -2230,7 +2230,7 @@
               <w:rPr>
                 <w:sz w:val="18"/>
               </w:rPr>
-              <w:t>Exception Handler (Ngoại lệ)</w:t>
+              <w:t>Process (Xử lý thất bại)</w:t>
             </w:r>
           </w:p>
         </w:tc>
@@ -2252,6 +2252,86 @@
                 <w:b/>
                 <w:sz w:val="18"/>
               </w:rPr>
+              <w:t>Node 19</w:t>
+            </w:r>
+          </w:p>
+        </w:tc>
+        <w:tc>
+          <w:tcPr>
+            <w:tcW w:type="dxa" w:w="2484"/>
+            <w:tcMar>
+              <w:top w:w="100" w:type="dxa"/>
+              <w:bottom w:w="100" w:type="dxa"/>
+              <w:left w:w="140" w:type="dxa"/>
+              <w:right w:w="140" w:type="dxa"/>
+            </w:tcMar>
+          </w:tcPr>
+          <w:p>
+            <w:r>
+              <w:rPr>
+                <w:sz w:val="18"/>
+              </w:rPr>
+              <w:t>Dòng 96–103</w:t>
+            </w:r>
+          </w:p>
+        </w:tc>
+        <w:tc>
+          <w:tcPr>
+            <w:tcW w:type="dxa" w:w="2484"/>
+            <w:tcMar>
+              <w:top w:w="100" w:type="dxa"/>
+              <w:bottom w:w="100" w:type="dxa"/>
+              <w:left w:w="140" w:type="dxa"/>
+              <w:right w:w="140" w:type="dxa"/>
+            </w:tcMar>
+          </w:tcPr>
+          <w:p>
+            <w:r>
+              <w:rPr>
+                <w:sz w:val="18"/>
+              </w:rPr>
+              <w:t>Khối bắt ngoại lệ ngoài: catch (error) { failed.push(...) }</w:t>
+            </w:r>
+          </w:p>
+        </w:tc>
+        <w:tc>
+          <w:tcPr>
+            <w:tcW w:type="dxa" w:w="2484"/>
+            <w:tcMar>
+              <w:top w:w="100" w:type="dxa"/>
+              <w:bottom w:w="100" w:type="dxa"/>
+              <w:left w:w="140" w:type="dxa"/>
+              <w:right w:w="140" w:type="dxa"/>
+            </w:tcMar>
+          </w:tcPr>
+          <w:p>
+            <w:r>
+              <w:rPr>
+                <w:sz w:val="18"/>
+              </w:rPr>
+              <w:t>Exception Handler (Ngoại lệ runtime)</w:t>
+            </w:r>
+          </w:p>
+        </w:tc>
+      </w:tr>
+      <w:tr>
+        <w:tc>
+          <w:tcPr>
+            <w:tcW w:type="dxa" w:w="2484"/>
+            <w:shd w:fill="F9FAFB"/>
+            <w:tcMar>
+              <w:top w:w="100" w:type="dxa"/>
+              <w:bottom w:w="100" w:type="dxa"/>
+              <w:left w:w="140" w:type="dxa"/>
+              <w:right w:w="140" w:type="dxa"/>
+            </w:tcMar>
+          </w:tcPr>
+          <w:p>
+            <w:r>
+              <w:rPr>
+                <w:b/>
+                <w:sz w:val="18"/>
+              </w:rPr>
               <w:t>Node 20</w:t>
             </w:r>
           </w:p>
@@ -2259,6 +2339,7 @@
         <w:tc>
           <w:tcPr>
             <w:tcW w:type="dxa" w:w="2484"/>
+            <w:shd w:fill="F9FAFB"/>
             <w:tcMar>
               <w:top w:w="100" w:type="dxa"/>
               <w:bottom w:w="100" w:type="dxa"/>
@@ -2278,6 +2359,7 @@
         <w:tc>
           <w:tcPr>
             <w:tcW w:type="dxa" w:w="2484"/>
+            <w:shd w:fill="F9FAFB"/>
             <w:tcMar>
               <w:top w:w="100" w:type="dxa"/>
               <w:bottom w:w="100" w:type="dxa"/>
@@ -2297,6 +2379,7 @@
         <w:tc>
           <w:tcPr>
             <w:tcW w:type="dxa" w:w="2484"/>
+            <w:shd w:fill="F9FAFB"/>
             <w:tcMar>
               <w:top w:w="100" w:type="dxa"/>
               <w:bottom w:w="100" w:type="dxa"/>
@@ -2329,25 +2412,25 @@
         <w:rPr>
           <w:sz w:val="20"/>
         </w:rPr>
-        <w:t>Đồ thị dòng điều khiển (CFG) của phương thức execute được xây dựng với 20 đỉnh (Nodes 1-20) và 27 cung (Edges) rẽ nhánh nhị phân:</w:t>
+        <w:t>Đồ thị dòng điều khiển (CFG) của phương thức execute được xây dựng với 21 đỉnh (Nodes 1-20, phân rã 14a, 14b) và 29 cung (Edges) phản ánh cả nhánh rẽ ngoại lệ:</w:t>
         <w:br/>
         <w:br/>
         <w:t>• Phương pháp 1 (Số cung và số đỉnh):</w:t>
         <w:br/>
-        <w:t xml:space="preserve">   V(G) = E - N + 2P = 27 - 20 + 2(1) = 9</w:t>
+        <w:t xml:space="preserve">   V(G) = E - N + 2P = 29 - 21 + 2(1) = 10</w:t>
         <w:br/>
         <w:br/>
         <w:t>• Phương pháp 2 (Số điểm quyết định vị từ Pn):</w:t>
         <w:br/>
-        <w:t xml:space="preserve">   V(G) = Pn + 1 = 8 (Predicate Nodes: N1, N3, N5, N8, N9, N11, N13, N16) + 1 = 9</w:t>
+        <w:t xml:space="preserve">   V(G) = Pn + 1 = 9 (8 điểm if/for + 1 điểm rẽ Try/Catch Job) + 1 = 10</w:t>
         <w:br/>
         <w:br/>
         <w:t>• Phương pháp 3 (Số miền mặt phẳng khép kín R):</w:t>
         <w:br/>
-        <w:t xml:space="preserve">   V(G) = R = 8 miền khép kín (R1 đến R8) + 1 miền vô hạn ngoài (R9) = 9</w:t>
+        <w:t xml:space="preserve">   V(G) = R = 9 miền khép kín (R1 đến R9) + 1 miền vô hạn ngoài (R10) = 10</w:t>
         <w:br/>
         <w:br/>
-        <w:t>==&gt; KẾT LUẬN: Độ phức tạp Cyclomatic V(G) = 9. Cần tối thiểu 9 đường dẫn cơ sở (Basis Paths) để bao phủ toàn bộ đồ thị dòng điều khiển.</w:t>
+        <w:t>==&gt; KẾT LUẬN: Độ phức tạp Cyclomatic V(G) = 10. Cần tối thiểu 10 đường dẫn cơ sở (Basis Paths) để bao phủ toàn bộ đồ thị dòng điều khiển.</w:t>
       </w:r>
     </w:p>
     <w:p/>
@@ -3137,7 +3220,7 @@
               <w:rPr>
                 <w:sz w:val="17"/>
               </w:rPr>
-              <w:t>Path 8 (Start..-&gt;13-&gt;14-&gt;15-&gt;16-&gt;17-&gt;8-&gt;20)</w:t>
+              <w:t>Path 8 (Start..-&gt;13-&gt;14a-&gt;15-&gt;16-&gt;17-&gt;8-&gt;20)</w:t>
             </w:r>
           </w:p>
         </w:tc>
@@ -3156,7 +3239,7 @@
               <w:rPr>
                 <w:sz w:val="17"/>
               </w:rPr>
-              <w:t>Happy Path: jobID hợp lệ, mailSvc trả về true</w:t>
+              <w:t>Happy Path: jobID hợp lệ, query Job thành công, mailSvc trả true</w:t>
             </w:r>
           </w:p>
         </w:tc>
@@ -3175,7 +3258,7 @@
               <w:rPr>
                 <w:sz w:val="17"/>
               </w:rPr>
-              <w:t>totalSent: 1, failed: [], gửi thành công 1/1 ứng viên</w:t>
+              <w:t>totalSent: 1, failed: [], gửi thành công có chức danh Job</w:t>
             </w:r>
           </w:p>
         </w:tc>
@@ -3238,7 +3321,7 @@
               <w:rPr>
                 <w:sz w:val="17"/>
               </w:rPr>
-              <w:t>Path 9 (Start..-&gt;11-&gt;19-&gt;8-&gt;20)</w:t>
+              <w:t>Path 9 (Start..-&gt;13-&gt;14a-&gt;14b-&gt;15-&gt;16-&gt;17-&gt;8-&gt;20)</w:t>
             </w:r>
           </w:p>
         </w:tc>
@@ -3258,7 +3341,7 @@
               <w:rPr>
                 <w:sz w:val="17"/>
               </w:rPr>
-              <w:t>Candidate object ném Exception đột ngột</w:t>
+              <w:t>jobID hợp lệ nhưng DB lỗi, bắt lỗi tại 14b, mailSvc trả true</w:t>
             </w:r>
           </w:p>
         </w:tc>
@@ -3278,6 +3361,106 @@
               <w:rPr>
                 <w:sz w:val="17"/>
               </w:rPr>
+              <w:t>In console.warn, email vẫn gửi thành công không có tên job</w:t>
+            </w:r>
+          </w:p>
+        </w:tc>
+        <w:tc>
+          <w:tcPr>
+            <w:tcW w:type="dxa" w:w="1987"/>
+            <w:shd w:fill="F2F4F7"/>
+            <w:tcMar>
+              <w:top w:w="100" w:type="dxa"/>
+              <w:bottom w:w="100" w:type="dxa"/>
+              <w:left w:w="140" w:type="dxa"/>
+              <w:right w:w="140" w:type="dxa"/>
+            </w:tcMar>
+          </w:tcPr>
+          <w:p>
+            <w:r>
+              <w:rPr>
+                <w:b/>
+                <w:sz w:val="17"/>
+              </w:rPr>
+              <w:t>Đạt</w:t>
+            </w:r>
+          </w:p>
+        </w:tc>
+      </w:tr>
+      <w:tr>
+        <w:tc>
+          <w:tcPr>
+            <w:tcW w:type="dxa" w:w="1987"/>
+            <w:tcMar>
+              <w:top w:w="100" w:type="dxa"/>
+              <w:bottom w:w="100" w:type="dxa"/>
+              <w:left w:w="140" w:type="dxa"/>
+              <w:right w:w="140" w:type="dxa"/>
+            </w:tcMar>
+          </w:tcPr>
+          <w:p>
+            <w:r>
+              <w:rPr>
+                <w:b/>
+                <w:sz w:val="17"/>
+              </w:rPr>
+              <w:t>TC_WB_09</w:t>
+            </w:r>
+          </w:p>
+        </w:tc>
+        <w:tc>
+          <w:tcPr>
+            <w:tcW w:type="dxa" w:w="1987"/>
+            <w:tcMar>
+              <w:top w:w="100" w:type="dxa"/>
+              <w:bottom w:w="100" w:type="dxa"/>
+              <w:left w:w="140" w:type="dxa"/>
+              <w:right w:w="140" w:type="dxa"/>
+            </w:tcMar>
+          </w:tcPr>
+          <w:p>
+            <w:r>
+              <w:rPr>
+                <w:sz w:val="17"/>
+              </w:rPr>
+              <w:t>Path 10 (Start..-&gt;11-&gt;19-&gt;8-&gt;20)</w:t>
+            </w:r>
+          </w:p>
+        </w:tc>
+        <w:tc>
+          <w:tcPr>
+            <w:tcW w:type="dxa" w:w="1987"/>
+            <w:tcMar>
+              <w:top w:w="100" w:type="dxa"/>
+              <w:bottom w:w="100" w:type="dxa"/>
+              <w:left w:w="140" w:type="dxa"/>
+              <w:right w:w="140" w:type="dxa"/>
+            </w:tcMar>
+          </w:tcPr>
+          <w:p>
+            <w:r>
+              <w:rPr>
+                <w:sz w:val="17"/>
+              </w:rPr>
+              <w:t>Candidate object ném Exception đột ngột ngoài</w:t>
+            </w:r>
+          </w:p>
+        </w:tc>
+        <w:tc>
+          <w:tcPr>
+            <w:tcW w:type="dxa" w:w="1987"/>
+            <w:tcMar>
+              <w:top w:w="100" w:type="dxa"/>
+              <w:bottom w:w="100" w:type="dxa"/>
+              <w:left w:w="140" w:type="dxa"/>
+              <w:right w:w="140" w:type="dxa"/>
+            </w:tcMar>
+          </w:tcPr>
+          <w:p>
+            <w:r>
+              <w:rPr>
+                <w:sz w:val="17"/>
+              </w:rPr>
               <w:t>Khối catch (Node 19) bắt lỗi và ghi nhận vào failed</w:t>
             </w:r>
           </w:p>
@@ -3285,7 +3468,6 @@
         <w:tc>
           <w:tcPr>
             <w:tcW w:type="dxa" w:w="1987"/>
-            <w:shd w:fill="F2F4F7"/>
             <w:tcMar>
               <w:top w:w="100" w:type="dxa"/>
               <w:bottom w:w="100" w:type="dxa"/>
@@ -3319,9 +3501,9 @@
         <w:rPr>
           <w:sz w:val="20"/>
         </w:rPr>
-        <w:t>1. Độ bao phủ câu lệnh (C1 - Statement Coverage): Đạt 100% (20/20 khối lệnh cơ bản được thực thi).</w:t>
+        <w:t>1. Độ bao phủ câu lệnh (C1 - Statement Coverage): Đạt 100% (21/21 khối lệnh cơ bản bao gồm cả khối Try 14a và Catch 14b được thực thi).</w:t>
         <w:br/>
-        <w:t>2. Độ bao phủ nhánh quyết định (C2 - Branch Coverage): Đạt 100% (tất cả 8 điểm quyết định rẽ nhánh True/False đều được duyệt qua).</w:t>
+        <w:t>2. Độ bao phủ nhánh quyết định (C2 - Branch Coverage): Đạt 100% (tất cả 9 điểm quyết định và rẽ nhánh ngoại lệ True/False đều được duyệt qua).</w:t>
         <w:br/>
         <w:t>3. Độ bao phủ điều kiện (C3 - Condition Coverage): Đạt 100% cho biểu thức logic phức tại Node 1 (!candidateIds || length === 0).</w:t>
         <w:br/>

</xml_diff>

<commit_message>
refactor(uc09): chuan hoa dinh Start dong 8, Node 1 dong 9 va khop chi tiet 22 nodes 30 edges McCabe
</commit_message>
<xml_diff>
--- a/hop-trang/KiemThuHopTrang_UC09_TuDongHoaGuiEmail.docx
+++ b/hop-trang/KiemThuHopTrang_UC09_TuDongHoaGuiEmail.docx
@@ -670,7 +670,7 @@
               <w:rPr>
                 <w:sz w:val="18"/>
               </w:rPr>
-              <w:t>Bắt đầu hàm execute(input)</w:t>
+              <w:t>Bắt đầu hàm execute(input: SendBulkEmailInput)</w:t>
             </w:r>
           </w:p>
         </w:tc>
@@ -2412,12 +2412,26 @@
         <w:rPr>
           <w:sz w:val="20"/>
         </w:rPr>
-        <w:t>Đồ thị dòng điều khiển (CFG) của phương thức execute được xây dựng với 21 đỉnh (Nodes 1-20, phân rã 14a, 14b) và 29 cung (Edges) phản ánh cả nhánh rẽ ngoại lệ:</w:t>
+        <w:t>Đồ thị dòng điều khiển (CFG) của phương thức execute được xây dựng với 22 đỉnh (Đỉnh Start tại Dòng 8 + 21 Node nghiệp vụ) và 30 cung (Edges) phản ánh chính xác cả các nhánh rẽ ngoại lệ:</w:t>
         <w:br/>
         <w:br/>
-        <w:t>• Phương pháp 1 (Số cung và số đỉnh):</w:t>
+        <w:t>• Phương pháp 1 (Dựa trên số cung E và số đỉnh N):</w:t>
         <w:br/>
-        <w:t xml:space="preserve">   V(G) = E - N + 2P = 29 - 21 + 2(1) = 10</w:t>
+        <w:t xml:space="preserve">   - Số đỉnh N = 22 (gồm đỉnh Start tại dòng 8 và 21 Node từ Node 1 đến Node 20, phân rã 14a, 14b).</w:t>
+        <w:br/>
+        <w:t xml:space="preserve">   - Số cung E = 30, gồm 30 cung rẽ nhánh điều kiện, tuần tự, lặp và ngoại lệ:</w:t>
+        <w:br/>
+        <w:t xml:space="preserve">     (Start-&gt;1), (1-&gt;2), (1-&gt;3), (3-&gt;4), (3-&gt;5), (5-&gt;6), (5-&gt;7), (7-&gt;8), (8-&gt;20), (8-&gt;9),</w:t>
+        <w:br/>
+        <w:t xml:space="preserve">     (9-&gt;10), (10-&gt;8), (9-&gt;11), (11-&gt;12), (12-&gt;8), (11-&gt;13), (13-&gt;14a), (13-&gt;15),</w:t>
+        <w:br/>
+        <w:t xml:space="preserve">     (14a-&gt;15), (14a-&gt;14b), (14b-&gt;15), (15-&gt;16), (16-&gt;17), (16-&gt;18), (17-&gt;8),</w:t>
+        <w:br/>
+        <w:t xml:space="preserve">     (18-&gt;8), (9-&gt;19), (11-&gt;19), (15-&gt;19), (19-&gt;8).</w:t>
+        <w:br/>
+        <w:t xml:space="preserve">   - Số thành phần liên thông P = 1.</w:t>
+        <w:br/>
+        <w:t xml:space="preserve">   ==&gt; V(G) = E - N + 2P = 30 - 22 + 2(1) = 10</w:t>
         <w:br/>
         <w:br/>
         <w:t>• Phương pháp 2 (Số điểm quyết định vị từ Pn):</w:t>
@@ -2430,7 +2444,7 @@
         <w:t xml:space="preserve">   V(G) = R = 9 miền khép kín (R1 đến R9) + 1 miền vô hạn ngoài (R10) = 10</w:t>
         <w:br/>
         <w:br/>
-        <w:t>==&gt; KẾT LUẬN: Độ phức tạp Cyclomatic V(G) = 10. Cần tối thiểu 10 đường dẫn cơ sở (Basis Paths) để bao phủ toàn bộ đồ thị dòng điều khiển.</w:t>
+        <w:t>==&gt; KẾT LUẬN: Cả 3 phương pháp đều tính ra độ phức tạp Cyclomatic V(G) = 10. Cần tối thiểu 10 đường dẫn cơ sở (Basis Paths) để bao phủ toàn bộ đồ thị dòng điều khiển.</w:t>
       </w:r>
     </w:p>
     <w:p/>
@@ -2611,7 +2625,7 @@
               <w:rPr>
                 <w:sz w:val="17"/>
               </w:rPr>
-              <w:t>Path 1 (Start-&gt;1-&gt;2)</w:t>
+              <w:t>Path 1: Start -&gt; 1 -&gt; 2</w:t>
             </w:r>
           </w:p>
         </w:tc>
@@ -2712,7 +2726,7 @@
               <w:rPr>
                 <w:sz w:val="17"/>
               </w:rPr>
-              <w:t>Path 2 (Start-&gt;1-&gt;3-&gt;4)</w:t>
+              <w:t>Path 2: Start -&gt; 1 -&gt; 3 -&gt; 4</w:t>
             </w:r>
           </w:p>
         </w:tc>
@@ -2814,7 +2828,7 @@
               <w:rPr>
                 <w:sz w:val="17"/>
               </w:rPr>
-              <w:t>Path 3 (Start-&gt;1-&gt;3-&gt;5-&gt;6)</w:t>
+              <w:t>Path 3: Start -&gt; 1 -&gt; 3 -&gt; 5 -&gt; 6</w:t>
             </w:r>
           </w:p>
         </w:tc>
@@ -2915,7 +2929,7 @@
               <w:rPr>
                 <w:sz w:val="17"/>
               </w:rPr>
-              <w:t>Path 5 (Start..-&gt;8-&gt;9-&gt;10-&gt;8-&gt;20)</w:t>
+              <w:t>Path 5: Start..-&gt;8-&gt;9-&gt;10-&gt;8-&gt;20</w:t>
             </w:r>
           </w:p>
         </w:tc>
@@ -3017,7 +3031,7 @@
               <w:rPr>
                 <w:sz w:val="17"/>
               </w:rPr>
-              <w:t>Path 6 (Start..-&gt;8-&gt;9-&gt;11-&gt;12-&gt;8-&gt;20)</w:t>
+              <w:t>Path 6: Start..-&gt;8-&gt;9-&gt;11-&gt;12-&gt;8-&gt;20</w:t>
             </w:r>
           </w:p>
         </w:tc>
@@ -3118,7 +3132,7 @@
               <w:rPr>
                 <w:sz w:val="17"/>
               </w:rPr>
-              <w:t>Path 7 (Start..-&gt;13-&gt;15-&gt;16-&gt;18-&gt;8-&gt;20)</w:t>
+              <w:t>Path 7: Start..-&gt;13-&gt;15-&gt;16-&gt;18-&gt;8-&gt;20</w:t>
             </w:r>
           </w:p>
         </w:tc>
@@ -3138,7 +3152,7 @@
               <w:rPr>
                 <w:sz w:val="17"/>
               </w:rPr>
-              <w:t>jobID: null, mailSvc trả về false</w:t>
+              <w:t>mailSvc.sendEmail trả về false</w:t>
             </w:r>
           </w:p>
         </w:tc>
@@ -3220,7 +3234,7 @@
               <w:rPr>
                 <w:sz w:val="17"/>
               </w:rPr>
-              <w:t>Path 8 (Start..-&gt;13-&gt;14a-&gt;15-&gt;16-&gt;17-&gt;8-&gt;20)</w:t>
+              <w:t>Path 8: Start..-&gt;13-&gt;14a-&gt;15-&gt;16-&gt;17-&gt;8-&gt;20</w:t>
             </w:r>
           </w:p>
         </w:tc>
@@ -3239,7 +3253,7 @@
               <w:rPr>
                 <w:sz w:val="17"/>
               </w:rPr>
-              <w:t>Happy Path: jobID hợp lệ, query Job thành công, mailSvc trả true</w:t>
+              <w:t>Happy Path đầy đủ (jobID hợp lệ, gửi mail OK)</w:t>
             </w:r>
           </w:p>
         </w:tc>
@@ -3258,7 +3272,7 @@
               <w:rPr>
                 <w:sz w:val="17"/>
               </w:rPr>
-              <w:t>totalSent: 1, failed: [], gửi thành công có chức danh Job</w:t>
+              <w:t>totalSent: 1, failed: [], message: Gửi thành công 1/1</w:t>
             </w:r>
           </w:p>
         </w:tc>
@@ -3321,7 +3335,7 @@
               <w:rPr>
                 <w:sz w:val="17"/>
               </w:rPr>
-              <w:t>Path 9 (Start..-&gt;13-&gt;14a-&gt;14b-&gt;15-&gt;16-&gt;17-&gt;8-&gt;20)</w:t>
+              <w:t>Path 9: Start..-&gt;13-&gt;14a-&gt;14b-&gt;15-&gt;16-&gt;17-&gt;8-&gt;20</w:t>
             </w:r>
           </w:p>
         </w:tc>
@@ -3341,7 +3355,7 @@
               <w:rPr>
                 <w:sz w:val="17"/>
               </w:rPr>
-              <w:t>jobID hợp lệ nhưng DB lỗi, bắt lỗi tại 14b, mailSvc trả true</w:t>
+              <w:t>jobRepo.getById ném Exception mạng</w:t>
             </w:r>
           </w:p>
         </w:tc>
@@ -3361,7 +3375,7 @@
               <w:rPr>
                 <w:sz w:val="17"/>
               </w:rPr>
-              <w:t>In console.warn, email vẫn gửi thành công không có tên job</w:t>
+              <w:t>Bắt tại 14b, ghi log warn, gửi mail tiếp tục thành công</w:t>
             </w:r>
           </w:p>
         </w:tc>
@@ -3423,7 +3437,7 @@
               <w:rPr>
                 <w:sz w:val="17"/>
               </w:rPr>
-              <w:t>Path 10 (Start..-&gt;11-&gt;19-&gt;8-&gt;20)</w:t>
+              <w:t>Path 10: Start..-&gt;11-&gt;19-&gt;8-&gt;20</w:t>
             </w:r>
           </w:p>
         </w:tc>
@@ -3442,7 +3456,7 @@
               <w:rPr>
                 <w:sz w:val="17"/>
               </w:rPr>
-              <w:t>Candidate object ném Exception đột ngột ngoài</w:t>
+              <w:t>candidate.getPersonal() ném ngoại lệ</w:t>
             </w:r>
           </w:p>
         </w:tc>
@@ -3461,13 +3475,117 @@
               <w:rPr>
                 <w:sz w:val="17"/>
               </w:rPr>
-              <w:t>Khối catch (Node 19) bắt lỗi và ghi nhận vào failed</w:t>
+              <w:t>Bắt tại khối catch ngoài (Node 19), ghi nhận lỗi 'Crash'</w:t>
             </w:r>
           </w:p>
         </w:tc>
         <w:tc>
           <w:tcPr>
             <w:tcW w:type="dxa" w:w="1987"/>
+            <w:tcMar>
+              <w:top w:w="100" w:type="dxa"/>
+              <w:bottom w:w="100" w:type="dxa"/>
+              <w:left w:w="140" w:type="dxa"/>
+              <w:right w:w="140" w:type="dxa"/>
+            </w:tcMar>
+          </w:tcPr>
+          <w:p>
+            <w:r>
+              <w:rPr>
+                <w:b/>
+                <w:sz w:val="17"/>
+              </w:rPr>
+              <w:t>Đạt</w:t>
+            </w:r>
+          </w:p>
+        </w:tc>
+      </w:tr>
+      <w:tr>
+        <w:tc>
+          <w:tcPr>
+            <w:tcW w:type="dxa" w:w="1987"/>
+            <w:shd w:fill="F2F4F7"/>
+            <w:tcMar>
+              <w:top w:w="100" w:type="dxa"/>
+              <w:bottom w:w="100" w:type="dxa"/>
+              <w:left w:w="140" w:type="dxa"/>
+              <w:right w:w="140" w:type="dxa"/>
+            </w:tcMar>
+          </w:tcPr>
+          <w:p>
+            <w:r>
+              <w:rPr>
+                <w:b/>
+                <w:sz w:val="17"/>
+              </w:rPr>
+              <w:t>TC_WB_10</w:t>
+            </w:r>
+          </w:p>
+        </w:tc>
+        <w:tc>
+          <w:tcPr>
+            <w:tcW w:type="dxa" w:w="1987"/>
+            <w:shd w:fill="F2F4F7"/>
+            <w:tcMar>
+              <w:top w:w="100" w:type="dxa"/>
+              <w:bottom w:w="100" w:type="dxa"/>
+              <w:left w:w="140" w:type="dxa"/>
+              <w:right w:w="140" w:type="dxa"/>
+            </w:tcMar>
+          </w:tcPr>
+          <w:p>
+            <w:r>
+              <w:rPr>
+                <w:sz w:val="17"/>
+              </w:rPr>
+              <w:t>Path 4: Start -&gt; 1 -&gt; 3 -&gt; 5 -&gt; 7 -&gt; 8 -&gt; 20</w:t>
+            </w:r>
+          </w:p>
+        </w:tc>
+        <w:tc>
+          <w:tcPr>
+            <w:tcW w:type="dxa" w:w="1987"/>
+            <w:shd w:fill="F2F4F7"/>
+            <w:tcMar>
+              <w:top w:w="100" w:type="dxa"/>
+              <w:bottom w:w="100" w:type="dxa"/>
+              <w:left w:w="140" w:type="dxa"/>
+              <w:right w:w="140" w:type="dxa"/>
+            </w:tcMar>
+          </w:tcPr>
+          <w:p>
+            <w:r>
+              <w:rPr>
+                <w:sz w:val="17"/>
+              </w:rPr>
+              <w:t>Danh sách ứng viên rỗng đã qua validate (vòng for 0 lần)</w:t>
+            </w:r>
+          </w:p>
+        </w:tc>
+        <w:tc>
+          <w:tcPr>
+            <w:tcW w:type="dxa" w:w="1987"/>
+            <w:shd w:fill="F2F4F7"/>
+            <w:tcMar>
+              <w:top w:w="100" w:type="dxa"/>
+              <w:bottom w:w="100" w:type="dxa"/>
+              <w:left w:w="140" w:type="dxa"/>
+              <w:right w:w="140" w:type="dxa"/>
+            </w:tcMar>
+          </w:tcPr>
+          <w:p>
+            <w:r>
+              <w:rPr>
+                <w:sz w:val="17"/>
+              </w:rPr>
+              <w:t>totalSent: 0, failed: [], trả về đối tượng kết quả rỗng</w:t>
+            </w:r>
+          </w:p>
+        </w:tc>
+        <w:tc>
+          <w:tcPr>
+            <w:tcW w:type="dxa" w:w="1987"/>
+            <w:shd w:fill="F2F4F7"/>
             <w:tcMar>
               <w:top w:w="100" w:type="dxa"/>
               <w:bottom w:w="100" w:type="dxa"/>

</xml_diff>

<commit_message>
feat(uc09): them do thi CFG C1/C2 va C3 truc quan, phan ra Node 1a/1b va styled Mermaid tren GitHub
</commit_message>
<xml_diff>
--- a/hop-trang/KiemThuHopTrang_UC09_TuDongHoaGuiEmail.docx
+++ b/hop-trang/KiemThuHopTrang_UC09_TuDongHoaGuiEmail.docx
@@ -2404,7 +2404,15 @@
         <w:pStyle w:val="Heading1"/>
       </w:pPr>
       <w:r>
-        <w:t>3. ĐỒ THỊ DÒNG ĐIỀU KHIỂN &amp; ĐỘ PHỨC TẠP CYCLOMATIC (MCCABE)</w:t>
+        <w:t>3. XÂY DỰNG ĐỒ THỊ DÒNG ĐIỀU KHIỂN (CFG) CHO HÀM THEO C1, C2, C3</w:t>
+      </w:r>
+    </w:p>
+    <w:p>
+      <w:pPr>
+        <w:pStyle w:val="Heading2"/>
+      </w:pPr>
+      <w:r>
+        <w:t>3.1. Đồ thị dòng điều khiển ứng với độ đo C1 và C2</w:t>
       </w:r>
     </w:p>
     <w:p>
@@ -2412,7 +2420,123 @@
         <w:rPr>
           <w:sz w:val="20"/>
         </w:rPr>
-        <w:t>Đồ thị dòng điều khiển (CFG) của phương thức execute được xây dựng với 22 đỉnh (Đỉnh Start tại Dòng 8 + 21 Node nghiệp vụ) và 30 cung (Edges) phản ánh chính xác cả các nhánh rẽ ngoại lệ:</w:t>
+        <w:t>Ở cấp độ độ đo C1 (phủ câu lệnh) và C2 (phủ nhánh quyết định), mỗi khối lệnh điều kiện phức hợp được biểu diễn dưới dạng 1 điểm quyết định đơn vị rẽ 2 nhánh Đúng (True) và Sai (False):</w:t>
+      </w:r>
+    </w:p>
+    <w:p>
+      <w:pPr>
+        <w:jc w:val="center"/>
+      </w:pPr>
+      <w:r>
+        <w:drawing>
+          <wp:inline xmlns:a="http://schemas.openxmlformats.org/drawingml/2006/main" xmlns:pic="http://schemas.openxmlformats.org/drawingml/2006/picture">
+            <wp:extent cx="4114800" cy="8275833"/>
+            <wp:docPr id="1" name="Picture 1"/>
+            <wp:cNvGraphicFramePr>
+              <a:graphicFrameLocks noChangeAspect="1"/>
+            </wp:cNvGraphicFramePr>
+            <a:graphic>
+              <a:graphicData uri="http://schemas.openxmlformats.org/drawingml/2006/picture">
+                <pic:pic>
+                  <pic:nvPicPr>
+                    <pic:cNvPr id="0" name="cfg_uc09_c1_c2.png"/>
+                    <pic:cNvPicPr/>
+                  </pic:nvPicPr>
+                  <pic:blipFill>
+                    <a:blip r:embed="rId9"/>
+                    <a:stretch>
+                      <a:fillRect/>
+                    </a:stretch>
+                  </pic:blipFill>
+                  <pic:spPr>
+                    <a:xfrm>
+                      <a:off x="0" y="0"/>
+                      <a:ext cx="4114800" cy="8275833"/>
+                    </a:xfrm>
+                    <a:prstGeom prst="rect"/>
+                  </pic:spPr>
+                </pic:pic>
+              </a:graphicData>
+            </a:graphic>
+          </wp:inline>
+        </w:drawing>
+      </w:r>
+    </w:p>
+    <w:p/>
+    <w:p>
+      <w:pPr>
+        <w:pStyle w:val="Heading2"/>
+      </w:pPr>
+      <w:r>
+        <w:t>3.2. Đồ thị dòng điều khiển ứng với độ đo C3</w:t>
+      </w:r>
+    </w:p>
+    <w:p>
+      <w:r>
+        <w:rPr>
+          <w:sz w:val="20"/>
+        </w:rPr>
+        <w:t>Theo lý thuyết độ đo C3 (Condition / Multiple Condition Coverage), các biểu thức điều kiện phức hợp chứa toán tử logic (||, &amp;&amp;) được phân rã thành các nút quyết định con tương ứng để kiểm tra từng điều kiện thành phần:</w:t>
+        <w:br/>
+        <w:t>• Tại Node 1 (!input.candidateIds || input.candidateIds.length === 0): phân rã thành Node 1a (!input.candidateIds) và Node 1b (input.candidateIds.length === 0).</w:t>
+        <w:br/>
+        <w:t>• Cơ chế ngắt mạch (Short-circuit evaluation): Nếu Node 1a nhận giá trị True, biểu thức lập tức ngắt mạch và nhảy thẳng sang Node 2 (throw 'Danh sách ứng viên không được để trống.') mà không cần đánh giá Node 1b.</w:t>
+      </w:r>
+    </w:p>
+    <w:p>
+      <w:pPr>
+        <w:jc w:val="center"/>
+      </w:pPr>
+      <w:r>
+        <w:drawing>
+          <wp:inline xmlns:a="http://schemas.openxmlformats.org/drawingml/2006/main" xmlns:pic="http://schemas.openxmlformats.org/drawingml/2006/picture">
+            <wp:extent cx="4114800" cy="8738171"/>
+            <wp:docPr id="2" name="Picture 2"/>
+            <wp:cNvGraphicFramePr>
+              <a:graphicFrameLocks noChangeAspect="1"/>
+            </wp:cNvGraphicFramePr>
+            <a:graphic>
+              <a:graphicData uri="http://schemas.openxmlformats.org/drawingml/2006/picture">
+                <pic:pic>
+                  <pic:nvPicPr>
+                    <pic:cNvPr id="0" name="cfg_uc09_c3.png"/>
+                    <pic:cNvPicPr/>
+                  </pic:nvPicPr>
+                  <pic:blipFill>
+                    <a:blip r:embed="rId10"/>
+                    <a:stretch>
+                      <a:fillRect/>
+                    </a:stretch>
+                  </pic:blipFill>
+                  <pic:spPr>
+                    <a:xfrm>
+                      <a:off x="0" y="0"/>
+                      <a:ext cx="4114800" cy="8738171"/>
+                    </a:xfrm>
+                    <a:prstGeom prst="rect"/>
+                  </pic:spPr>
+                </pic:pic>
+              </a:graphicData>
+            </a:graphic>
+          </wp:inline>
+        </w:drawing>
+      </w:r>
+    </w:p>
+    <w:p/>
+    <w:p>
+      <w:pPr>
+        <w:pStyle w:val="Heading1"/>
+      </w:pPr>
+      <w:r>
+        <w:t>4. TÍNH ĐỘ PHỨC TẠP CYCLOMATIC (MCCABE)</w:t>
+      </w:r>
+    </w:p>
+    <w:p>
+      <w:r>
+        <w:rPr>
+          <w:sz w:val="20"/>
+        </w:rPr>
+        <w:t>Độ phức tạp Cyclomatic được tính độc lập theo 3 phương pháp McCabe:</w:t>
         <w:br/>
         <w:br/>
         <w:t>• Phương pháp 1 (Dựa trên số cung E và số đỉnh N):</w:t>
@@ -2453,7 +2577,727 @@
         <w:pStyle w:val="Heading1"/>
       </w:pPr>
       <w:r>
-        <w:t>4. BẢNG THIẾT KẾ CA KIỂM THỬ HỘP TRẮNG (C1, C2, C3)</w:t>
+        <w:t>5. THIẾT KẾ CÁC ĐƯỜNG DẪN CƠ SỞ (BASIS PATHS)</w:t>
+      </w:r>
+    </w:p>
+    <w:tbl>
+      <w:tblPr>
+        <w:tblW w:type="auto" w:w="0"/>
+        <w:jc w:val="center"/>
+        <w:tblLook w:firstColumn="1" w:firstRow="1" w:lastColumn="0" w:lastRow="0" w:noHBand="0" w:noVBand="1" w:val="04A0"/>
+        <w:tblBorders>
+          <w:top w:val="single" w:sz="6" w:space="0" w:color="CCCCCC"/>
+          <w:bottom w:val="single" w:sz="6" w:space="0" w:color="CCCCCC"/>
+          <w:left w:val="none"/>
+          <w:right w:val="none"/>
+          <w:insideH w:val="single" w:sz="4" w:space="0" w:color="CCCCCC"/>
+          <w:insideV w:val="none"/>
+        </w:tblBorders>
+      </w:tblPr>
+      <w:tblGrid>
+        <w:gridCol w:w="3312"/>
+        <w:gridCol w:w="3312"/>
+        <w:gridCol w:w="3312"/>
+      </w:tblGrid>
+      <w:tr>
+        <w:tc>
+          <w:tcPr>
+            <w:tcW w:type="dxa" w:w="3312"/>
+            <w:shd w:fill="1F4E79"/>
+            <w:tcMar>
+              <w:top w:w="100" w:type="dxa"/>
+              <w:bottom w:w="100" w:type="dxa"/>
+              <w:left w:w="140" w:type="dxa"/>
+              <w:right w:w="140" w:type="dxa"/>
+            </w:tcMar>
+          </w:tcPr>
+          <w:p>
+            <w:r>
+              <w:rPr>
+                <w:b/>
+                <w:color w:val="FFFFFF"/>
+                <w:sz w:val="19"/>
+              </w:rPr>
+              <w:t>Mã đường dẫn</w:t>
+            </w:r>
+          </w:p>
+        </w:tc>
+        <w:tc>
+          <w:tcPr>
+            <w:tcW w:type="dxa" w:w="3312"/>
+            <w:shd w:fill="1F4E79"/>
+            <w:tcMar>
+              <w:top w:w="100" w:type="dxa"/>
+              <w:bottom w:w="100" w:type="dxa"/>
+              <w:left w:w="140" w:type="dxa"/>
+              <w:right w:w="140" w:type="dxa"/>
+            </w:tcMar>
+          </w:tcPr>
+          <w:p>
+            <w:r>
+              <w:rPr>
+                <w:b/>
+                <w:color w:val="FFFFFF"/>
+                <w:sz w:val="19"/>
+              </w:rPr>
+              <w:t>Chuỗi các khối lệnh (Nodes Sequence)</w:t>
+            </w:r>
+          </w:p>
+        </w:tc>
+        <w:tc>
+          <w:tcPr>
+            <w:tcW w:type="dxa" w:w="3312"/>
+            <w:shd w:fill="1F4E79"/>
+            <w:tcMar>
+              <w:top w:w="100" w:type="dxa"/>
+              <w:bottom w:w="100" w:type="dxa"/>
+              <w:left w:w="140" w:type="dxa"/>
+              <w:right w:w="140" w:type="dxa"/>
+            </w:tcMar>
+          </w:tcPr>
+          <w:p>
+            <w:r>
+              <w:rPr>
+                <w:b/>
+                <w:color w:val="FFFFFF"/>
+                <w:sz w:val="19"/>
+              </w:rPr>
+              <w:t>Mục tiêu bao phủ</w:t>
+            </w:r>
+          </w:p>
+        </w:tc>
+      </w:tr>
+      <w:tr>
+        <w:tc>
+          <w:tcPr>
+            <w:tcW w:type="dxa" w:w="3312"/>
+            <w:tcMar>
+              <w:top w:w="100" w:type="dxa"/>
+              <w:bottom w:w="100" w:type="dxa"/>
+              <w:left w:w="140" w:type="dxa"/>
+              <w:right w:w="140" w:type="dxa"/>
+            </w:tcMar>
+          </w:tcPr>
+          <w:p>
+            <w:r>
+              <w:rPr>
+                <w:b/>
+                <w:sz w:val="17"/>
+              </w:rPr>
+              <w:t>Path 1</w:t>
+            </w:r>
+          </w:p>
+        </w:tc>
+        <w:tc>
+          <w:tcPr>
+            <w:tcW w:type="dxa" w:w="3312"/>
+            <w:tcMar>
+              <w:top w:w="100" w:type="dxa"/>
+              <w:bottom w:w="100" w:type="dxa"/>
+              <w:left w:w="140" w:type="dxa"/>
+              <w:right w:w="140" w:type="dxa"/>
+            </w:tcMar>
+          </w:tcPr>
+          <w:p>
+            <w:r>
+              <w:rPr>
+                <w:sz w:val="17"/>
+              </w:rPr>
+              <w:t>Start -&gt; 1 -&gt; 2</w:t>
+            </w:r>
+          </w:p>
+        </w:tc>
+        <w:tc>
+          <w:tcPr>
+            <w:tcW w:type="dxa" w:w="3312"/>
+            <w:tcMar>
+              <w:top w:w="100" w:type="dxa"/>
+              <w:bottom w:w="100" w:type="dxa"/>
+              <w:left w:w="140" w:type="dxa"/>
+              <w:right w:w="140" w:type="dxa"/>
+            </w:tcMar>
+          </w:tcPr>
+          <w:p>
+            <w:r>
+              <w:rPr>
+                <w:sz w:val="17"/>
+              </w:rPr>
+              <w:t>Nhánh lỗi danh sách ứng viên rỗng / undefined</w:t>
+            </w:r>
+          </w:p>
+        </w:tc>
+      </w:tr>
+      <w:tr>
+        <w:tc>
+          <w:tcPr>
+            <w:tcW w:type="dxa" w:w="3312"/>
+            <w:shd w:fill="F9FAFB"/>
+            <w:tcMar>
+              <w:top w:w="100" w:type="dxa"/>
+              <w:bottom w:w="100" w:type="dxa"/>
+              <w:left w:w="140" w:type="dxa"/>
+              <w:right w:w="140" w:type="dxa"/>
+            </w:tcMar>
+          </w:tcPr>
+          <w:p>
+            <w:r>
+              <w:rPr>
+                <w:b/>
+                <w:sz w:val="17"/>
+              </w:rPr>
+              <w:t>Path 2</w:t>
+            </w:r>
+          </w:p>
+        </w:tc>
+        <w:tc>
+          <w:tcPr>
+            <w:tcW w:type="dxa" w:w="3312"/>
+            <w:shd w:fill="F9FAFB"/>
+            <w:tcMar>
+              <w:top w:w="100" w:type="dxa"/>
+              <w:bottom w:w="100" w:type="dxa"/>
+              <w:left w:w="140" w:type="dxa"/>
+              <w:right w:w="140" w:type="dxa"/>
+            </w:tcMar>
+          </w:tcPr>
+          <w:p>
+            <w:r>
+              <w:rPr>
+                <w:sz w:val="17"/>
+              </w:rPr>
+              <w:t>Start -&gt; 1 -&gt; 3 -&gt; 4</w:t>
+            </w:r>
+          </w:p>
+        </w:tc>
+        <w:tc>
+          <w:tcPr>
+            <w:tcW w:type="dxa" w:w="3312"/>
+            <w:shd w:fill="F9FAFB"/>
+            <w:tcMar>
+              <w:top w:w="100" w:type="dxa"/>
+              <w:bottom w:w="100" w:type="dxa"/>
+              <w:left w:w="140" w:type="dxa"/>
+              <w:right w:w="140" w:type="dxa"/>
+            </w:tcMar>
+          </w:tcPr>
+          <w:p>
+            <w:r>
+              <w:rPr>
+                <w:sz w:val="17"/>
+              </w:rPr>
+              <w:t>Nhánh lỗi tiêu đề email bị để trống</w:t>
+            </w:r>
+          </w:p>
+        </w:tc>
+      </w:tr>
+      <w:tr>
+        <w:tc>
+          <w:tcPr>
+            <w:tcW w:type="dxa" w:w="3312"/>
+            <w:tcMar>
+              <w:top w:w="100" w:type="dxa"/>
+              <w:bottom w:w="100" w:type="dxa"/>
+              <w:left w:w="140" w:type="dxa"/>
+              <w:right w:w="140" w:type="dxa"/>
+            </w:tcMar>
+          </w:tcPr>
+          <w:p>
+            <w:r>
+              <w:rPr>
+                <w:b/>
+                <w:sz w:val="17"/>
+              </w:rPr>
+              <w:t>Path 3</w:t>
+            </w:r>
+          </w:p>
+        </w:tc>
+        <w:tc>
+          <w:tcPr>
+            <w:tcW w:type="dxa" w:w="3312"/>
+            <w:tcMar>
+              <w:top w:w="100" w:type="dxa"/>
+              <w:bottom w:w="100" w:type="dxa"/>
+              <w:left w:w="140" w:type="dxa"/>
+              <w:right w:w="140" w:type="dxa"/>
+            </w:tcMar>
+          </w:tcPr>
+          <w:p>
+            <w:r>
+              <w:rPr>
+                <w:sz w:val="17"/>
+              </w:rPr>
+              <w:t>Start -&gt; 1 -&gt; 3 -&gt; 5 -&gt; 6</w:t>
+            </w:r>
+          </w:p>
+        </w:tc>
+        <w:tc>
+          <w:tcPr>
+            <w:tcW w:type="dxa" w:w="3312"/>
+            <w:tcMar>
+              <w:top w:w="100" w:type="dxa"/>
+              <w:bottom w:w="100" w:type="dxa"/>
+              <w:left w:w="140" w:type="dxa"/>
+              <w:right w:w="140" w:type="dxa"/>
+            </w:tcMar>
+          </w:tcPr>
+          <w:p>
+            <w:r>
+              <w:rPr>
+                <w:sz w:val="17"/>
+              </w:rPr>
+              <w:t>Nhánh lỗi nội dung email bị để trống</w:t>
+            </w:r>
+          </w:p>
+        </w:tc>
+      </w:tr>
+      <w:tr>
+        <w:tc>
+          <w:tcPr>
+            <w:tcW w:type="dxa" w:w="3312"/>
+            <w:shd w:fill="F9FAFB"/>
+            <w:tcMar>
+              <w:top w:w="100" w:type="dxa"/>
+              <w:bottom w:w="100" w:type="dxa"/>
+              <w:left w:w="140" w:type="dxa"/>
+              <w:right w:w="140" w:type="dxa"/>
+            </w:tcMar>
+          </w:tcPr>
+          <w:p>
+            <w:r>
+              <w:rPr>
+                <w:b/>
+                <w:sz w:val="17"/>
+              </w:rPr>
+              <w:t>Path 4</w:t>
+            </w:r>
+          </w:p>
+        </w:tc>
+        <w:tc>
+          <w:tcPr>
+            <w:tcW w:type="dxa" w:w="3312"/>
+            <w:shd w:fill="F9FAFB"/>
+            <w:tcMar>
+              <w:top w:w="100" w:type="dxa"/>
+              <w:bottom w:w="100" w:type="dxa"/>
+              <w:left w:w="140" w:type="dxa"/>
+              <w:right w:w="140" w:type="dxa"/>
+            </w:tcMar>
+          </w:tcPr>
+          <w:p>
+            <w:r>
+              <w:rPr>
+                <w:sz w:val="17"/>
+              </w:rPr>
+              <w:t>Start -&gt; 1 -&gt; 3 -&gt; 5 -&gt; 7 -&gt; 8 -&gt; 20</w:t>
+            </w:r>
+          </w:p>
+        </w:tc>
+        <w:tc>
+          <w:tcPr>
+            <w:tcW w:type="dxa" w:w="3312"/>
+            <w:shd w:fill="F9FAFB"/>
+            <w:tcMar>
+              <w:top w:w="100" w:type="dxa"/>
+              <w:bottom w:w="100" w:type="dxa"/>
+              <w:left w:w="140" w:type="dxa"/>
+              <w:right w:w="140" w:type="dxa"/>
+            </w:tcMar>
+          </w:tcPr>
+          <w:p>
+            <w:r>
+              <w:rPr>
+                <w:sz w:val="17"/>
+              </w:rPr>
+              <w:t>Nhánh danh sách ứng viên hợp lệ nhưng vòng lặp 0 lần</w:t>
+            </w:r>
+          </w:p>
+        </w:tc>
+      </w:tr>
+      <w:tr>
+        <w:tc>
+          <w:tcPr>
+            <w:tcW w:type="dxa" w:w="3312"/>
+            <w:tcMar>
+              <w:top w:w="100" w:type="dxa"/>
+              <w:bottom w:w="100" w:type="dxa"/>
+              <w:left w:w="140" w:type="dxa"/>
+              <w:right w:w="140" w:type="dxa"/>
+            </w:tcMar>
+          </w:tcPr>
+          <w:p>
+            <w:r>
+              <w:rPr>
+                <w:b/>
+                <w:sz w:val="17"/>
+              </w:rPr>
+              <w:t>Path 5</w:t>
+            </w:r>
+          </w:p>
+        </w:tc>
+        <w:tc>
+          <w:tcPr>
+            <w:tcW w:type="dxa" w:w="3312"/>
+            <w:tcMar>
+              <w:top w:w="100" w:type="dxa"/>
+              <w:bottom w:w="100" w:type="dxa"/>
+              <w:left w:w="140" w:type="dxa"/>
+              <w:right w:w="140" w:type="dxa"/>
+            </w:tcMar>
+          </w:tcPr>
+          <w:p>
+            <w:r>
+              <w:rPr>
+                <w:sz w:val="17"/>
+              </w:rPr>
+              <w:t>Start -&gt; 1 -&gt; 3 -&gt; 5 -&gt; 7 -&gt; 8 -&gt; 9 -&gt; 10 -&gt; 8 -&gt; 20</w:t>
+            </w:r>
+          </w:p>
+        </w:tc>
+        <w:tc>
+          <w:tcPr>
+            <w:tcW w:type="dxa" w:w="3312"/>
+            <w:tcMar>
+              <w:top w:w="100" w:type="dxa"/>
+              <w:bottom w:w="100" w:type="dxa"/>
+              <w:left w:w="140" w:type="dxa"/>
+              <w:right w:w="140" w:type="dxa"/>
+            </w:tcMar>
+          </w:tcPr>
+          <w:p>
+            <w:r>
+              <w:rPr>
+                <w:sz w:val="17"/>
+              </w:rPr>
+              <w:t>Nhánh không tìm thấy ứng viên trong database</w:t>
+            </w:r>
+          </w:p>
+        </w:tc>
+      </w:tr>
+      <w:tr>
+        <w:tc>
+          <w:tcPr>
+            <w:tcW w:type="dxa" w:w="3312"/>
+            <w:shd w:fill="F9FAFB"/>
+            <w:tcMar>
+              <w:top w:w="100" w:type="dxa"/>
+              <w:bottom w:w="100" w:type="dxa"/>
+              <w:left w:w="140" w:type="dxa"/>
+              <w:right w:w="140" w:type="dxa"/>
+            </w:tcMar>
+          </w:tcPr>
+          <w:p>
+            <w:r>
+              <w:rPr>
+                <w:b/>
+                <w:sz w:val="17"/>
+              </w:rPr>
+              <w:t>Path 6</w:t>
+            </w:r>
+          </w:p>
+        </w:tc>
+        <w:tc>
+          <w:tcPr>
+            <w:tcW w:type="dxa" w:w="3312"/>
+            <w:shd w:fill="F9FAFB"/>
+            <w:tcMar>
+              <w:top w:w="100" w:type="dxa"/>
+              <w:bottom w:w="100" w:type="dxa"/>
+              <w:left w:w="140" w:type="dxa"/>
+              <w:right w:w="140" w:type="dxa"/>
+            </w:tcMar>
+          </w:tcPr>
+          <w:p>
+            <w:r>
+              <w:rPr>
+                <w:sz w:val="17"/>
+              </w:rPr>
+              <w:t>Start -&gt; 1 -&gt; 3 -&gt; 5 -&gt; 7 -&gt; 8 -&gt; 9 -&gt; 11 -&gt; 12 -&gt; 8 -&gt; 20</w:t>
+            </w:r>
+          </w:p>
+        </w:tc>
+        <w:tc>
+          <w:tcPr>
+            <w:tcW w:type="dxa" w:w="3312"/>
+            <w:shd w:fill="F9FAFB"/>
+            <w:tcMar>
+              <w:top w:w="100" w:type="dxa"/>
+              <w:bottom w:w="100" w:type="dxa"/>
+              <w:left w:w="140" w:type="dxa"/>
+              <w:right w:w="140" w:type="dxa"/>
+            </w:tcMar>
+          </w:tcPr>
+          <w:p>
+            <w:r>
+              <w:rPr>
+                <w:sz w:val="17"/>
+              </w:rPr>
+              <w:t>Nhánh ứng viên không có địa chỉ email</w:t>
+            </w:r>
+          </w:p>
+        </w:tc>
+      </w:tr>
+      <w:tr>
+        <w:tc>
+          <w:tcPr>
+            <w:tcW w:type="dxa" w:w="3312"/>
+            <w:tcMar>
+              <w:top w:w="100" w:type="dxa"/>
+              <w:bottom w:w="100" w:type="dxa"/>
+              <w:left w:w="140" w:type="dxa"/>
+              <w:right w:w="140" w:type="dxa"/>
+            </w:tcMar>
+          </w:tcPr>
+          <w:p>
+            <w:r>
+              <w:rPr>
+                <w:b/>
+                <w:sz w:val="17"/>
+              </w:rPr>
+              <w:t>Path 7</w:t>
+            </w:r>
+          </w:p>
+        </w:tc>
+        <w:tc>
+          <w:tcPr>
+            <w:tcW w:type="dxa" w:w="3312"/>
+            <w:tcMar>
+              <w:top w:w="100" w:type="dxa"/>
+              <w:bottom w:w="100" w:type="dxa"/>
+              <w:left w:w="140" w:type="dxa"/>
+              <w:right w:w="140" w:type="dxa"/>
+            </w:tcMar>
+          </w:tcPr>
+          <w:p>
+            <w:r>
+              <w:rPr>
+                <w:sz w:val="17"/>
+              </w:rPr>
+              <w:t>Start -&gt; 1 -&gt; 3 -&gt; 5 -&gt; 7 -&gt; 8 -&gt; 9 -&gt; 11 -&gt; 13 -&gt; 15 -&gt; 16 -&gt; 18 -&gt; 8 -&gt; 20</w:t>
+            </w:r>
+          </w:p>
+        </w:tc>
+        <w:tc>
+          <w:tcPr>
+            <w:tcW w:type="dxa" w:w="3312"/>
+            <w:tcMar>
+              <w:top w:w="100" w:type="dxa"/>
+              <w:bottom w:w="100" w:type="dxa"/>
+              <w:left w:w="140" w:type="dxa"/>
+              <w:right w:w="140" w:type="dxa"/>
+            </w:tcMar>
+          </w:tcPr>
+          <w:p>
+            <w:r>
+              <w:rPr>
+                <w:sz w:val="17"/>
+              </w:rPr>
+              <w:t>Nhánh không có jobID, gửi email qua SMTP thất bại</w:t>
+            </w:r>
+          </w:p>
+        </w:tc>
+      </w:tr>
+      <w:tr>
+        <w:tc>
+          <w:tcPr>
+            <w:tcW w:type="dxa" w:w="3312"/>
+            <w:shd w:fill="F9FAFB"/>
+            <w:tcMar>
+              <w:top w:w="100" w:type="dxa"/>
+              <w:bottom w:w="100" w:type="dxa"/>
+              <w:left w:w="140" w:type="dxa"/>
+              <w:right w:w="140" w:type="dxa"/>
+            </w:tcMar>
+          </w:tcPr>
+          <w:p>
+            <w:r>
+              <w:rPr>
+                <w:b/>
+                <w:sz w:val="17"/>
+              </w:rPr>
+              <w:t>Path 8</w:t>
+            </w:r>
+          </w:p>
+        </w:tc>
+        <w:tc>
+          <w:tcPr>
+            <w:tcW w:type="dxa" w:w="3312"/>
+            <w:shd w:fill="F9FAFB"/>
+            <w:tcMar>
+              <w:top w:w="100" w:type="dxa"/>
+              <w:bottom w:w="100" w:type="dxa"/>
+              <w:left w:w="140" w:type="dxa"/>
+              <w:right w:w="140" w:type="dxa"/>
+            </w:tcMar>
+          </w:tcPr>
+          <w:p>
+            <w:r>
+              <w:rPr>
+                <w:sz w:val="17"/>
+              </w:rPr>
+              <w:t>Start -&gt; 1 -&gt; 3 -&gt; 5 -&gt; 7 -&gt; 8 -&gt; 9 -&gt; 11 -&gt; 13 -&gt; 14a -&gt; 15 -&gt; 16 -&gt; 17 -&gt; 8 -&gt; 20</w:t>
+            </w:r>
+          </w:p>
+        </w:tc>
+        <w:tc>
+          <w:tcPr>
+            <w:tcW w:type="dxa" w:w="3312"/>
+            <w:shd w:fill="F9FAFB"/>
+            <w:tcMar>
+              <w:top w:w="100" w:type="dxa"/>
+              <w:bottom w:w="100" w:type="dxa"/>
+              <w:left w:w="140" w:type="dxa"/>
+              <w:right w:w="140" w:type="dxa"/>
+            </w:tcMar>
+          </w:tcPr>
+          <w:p>
+            <w:r>
+              <w:rPr>
+                <w:sz w:val="17"/>
+              </w:rPr>
+              <w:t>Happy Path: có jobID, query Job OK, gửi mail thành công</w:t>
+            </w:r>
+          </w:p>
+        </w:tc>
+      </w:tr>
+      <w:tr>
+        <w:tc>
+          <w:tcPr>
+            <w:tcW w:type="dxa" w:w="3312"/>
+            <w:tcMar>
+              <w:top w:w="100" w:type="dxa"/>
+              <w:bottom w:w="100" w:type="dxa"/>
+              <w:left w:w="140" w:type="dxa"/>
+              <w:right w:w="140" w:type="dxa"/>
+            </w:tcMar>
+          </w:tcPr>
+          <w:p>
+            <w:r>
+              <w:rPr>
+                <w:b/>
+                <w:sz w:val="17"/>
+              </w:rPr>
+              <w:t>Path 9</w:t>
+            </w:r>
+          </w:p>
+        </w:tc>
+        <w:tc>
+          <w:tcPr>
+            <w:tcW w:type="dxa" w:w="3312"/>
+            <w:tcMar>
+              <w:top w:w="100" w:type="dxa"/>
+              <w:bottom w:w="100" w:type="dxa"/>
+              <w:left w:w="140" w:type="dxa"/>
+              <w:right w:w="140" w:type="dxa"/>
+            </w:tcMar>
+          </w:tcPr>
+          <w:p>
+            <w:r>
+              <w:rPr>
+                <w:sz w:val="17"/>
+              </w:rPr>
+              <w:t>Start -&gt; 1 -&gt; 3 -&gt; 5 -&gt; 7 -&gt; 8 -&gt; 9 -&gt; 11 -&gt; 13 -&gt; 14a -&gt; 14b -&gt; 15 -&gt; 16 -&gt; 17 -&gt; 8 -&gt; 20</w:t>
+            </w:r>
+          </w:p>
+        </w:tc>
+        <w:tc>
+          <w:tcPr>
+            <w:tcW w:type="dxa" w:w="3312"/>
+            <w:tcMar>
+              <w:top w:w="100" w:type="dxa"/>
+              <w:bottom w:w="100" w:type="dxa"/>
+              <w:left w:w="140" w:type="dxa"/>
+              <w:right w:w="140" w:type="dxa"/>
+            </w:tcMar>
+          </w:tcPr>
+          <w:p>
+            <w:r>
+              <w:rPr>
+                <w:sz w:val="17"/>
+              </w:rPr>
+              <w:t>Nhánh có jobID nhưng query Job lỗi, bắt log và vẫn gửi mail</w:t>
+            </w:r>
+          </w:p>
+        </w:tc>
+      </w:tr>
+      <w:tr>
+        <w:tc>
+          <w:tcPr>
+            <w:tcW w:type="dxa" w:w="3312"/>
+            <w:shd w:fill="F9FAFB"/>
+            <w:tcMar>
+              <w:top w:w="100" w:type="dxa"/>
+              <w:bottom w:w="100" w:type="dxa"/>
+              <w:left w:w="140" w:type="dxa"/>
+              <w:right w:w="140" w:type="dxa"/>
+            </w:tcMar>
+          </w:tcPr>
+          <w:p>
+            <w:r>
+              <w:rPr>
+                <w:b/>
+                <w:sz w:val="17"/>
+              </w:rPr>
+              <w:t>Path 10</w:t>
+            </w:r>
+          </w:p>
+        </w:tc>
+        <w:tc>
+          <w:tcPr>
+            <w:tcW w:type="dxa" w:w="3312"/>
+            <w:shd w:fill="F9FAFB"/>
+            <w:tcMar>
+              <w:top w:w="100" w:type="dxa"/>
+              <w:bottom w:w="100" w:type="dxa"/>
+              <w:left w:w="140" w:type="dxa"/>
+              <w:right w:w="140" w:type="dxa"/>
+            </w:tcMar>
+          </w:tcPr>
+          <w:p>
+            <w:r>
+              <w:rPr>
+                <w:sz w:val="17"/>
+              </w:rPr>
+              <w:t>Start -&gt; 1 -&gt; 3 -&gt; 5 -&gt; 7 -&gt; 8 -&gt; 9 -&gt; 11 -&gt; 19 -&gt; 8 -&gt; 20</w:t>
+            </w:r>
+          </w:p>
+        </w:tc>
+        <w:tc>
+          <w:tcPr>
+            <w:tcW w:type="dxa" w:w="3312"/>
+            <w:shd w:fill="F9FAFB"/>
+            <w:tcMar>
+              <w:top w:w="100" w:type="dxa"/>
+              <w:bottom w:w="100" w:type="dxa"/>
+              <w:left w:w="140" w:type="dxa"/>
+              <w:right w:w="140" w:type="dxa"/>
+            </w:tcMar>
+          </w:tcPr>
+          <w:p>
+            <w:r>
+              <w:rPr>
+                <w:sz w:val="17"/>
+              </w:rPr>
+              <w:t>Nhánh phát sinh ngoại lệ đột ngột trong khối try ngoài</w:t>
+            </w:r>
+          </w:p>
+        </w:tc>
+      </w:tr>
+    </w:tbl>
+    <w:p/>
+    <w:p>
+      <w:pPr>
+        <w:pStyle w:val="Heading1"/>
+      </w:pPr>
+      <w:r>
+        <w:t>6. BẢNG THIẾT KẾ CA KIỂM THỬ HỘP TRẮNG (C1, C2, C3)</w:t>
+      </w:r>
+    </w:p>
+    <w:p>
+      <w:pPr>
+        <w:pStyle w:val="Heading2"/>
+      </w:pPr>
+      <w:r>
+        <w:t>6.1. Bảng ca kiểm thử đáp ứng độ đo C1 (Statement) &amp; C2 (Branch Coverage)</w:t>
       </w:r>
     </w:p>
     <w:tbl>
@@ -3608,10 +4452,533 @@
     <w:p/>
     <w:p>
       <w:pPr>
+        <w:pStyle w:val="Heading2"/>
+      </w:pPr>
+      <w:r>
+        <w:t>6.2. Kiểm tra độ đo bao phủ điều kiện C3 (Condition Coverage cho Node 1)</w:t>
+      </w:r>
+    </w:p>
+    <w:tbl>
+      <w:tblPr>
+        <w:tblW w:type="auto" w:w="0"/>
+        <w:jc w:val="center"/>
+        <w:tblLook w:firstColumn="1" w:firstRow="1" w:lastColumn="0" w:lastRow="0" w:noHBand="0" w:noVBand="1" w:val="04A0"/>
+        <w:tblBorders>
+          <w:top w:val="single" w:sz="6" w:space="0" w:color="CCCCCC"/>
+          <w:bottom w:val="single" w:sz="6" w:space="0" w:color="CCCCCC"/>
+          <w:left w:val="none"/>
+          <w:right w:val="none"/>
+          <w:insideH w:val="single" w:sz="4" w:space="0" w:color="CCCCCC"/>
+          <w:insideV w:val="none"/>
+        </w:tblBorders>
+      </w:tblPr>
+      <w:tblGrid>
+        <w:gridCol w:w="1656"/>
+        <w:gridCol w:w="1656"/>
+        <w:gridCol w:w="1656"/>
+        <w:gridCol w:w="1656"/>
+        <w:gridCol w:w="1656"/>
+        <w:gridCol w:w="1656"/>
+      </w:tblGrid>
+      <w:tr>
+        <w:tc>
+          <w:tcPr>
+            <w:tcW w:type="dxa" w:w="1656"/>
+            <w:shd w:fill="1F4E79"/>
+            <w:tcMar>
+              <w:top w:w="100" w:type="dxa"/>
+              <w:bottom w:w="100" w:type="dxa"/>
+              <w:left w:w="140" w:type="dxa"/>
+              <w:right w:w="140" w:type="dxa"/>
+            </w:tcMar>
+          </w:tcPr>
+          <w:p>
+            <w:r>
+              <w:rPr>
+                <w:b/>
+                <w:color w:val="FFFFFF"/>
+                <w:sz w:val="18"/>
+              </w:rPr>
+              <w:t>Ca kiểm thử C3</w:t>
+            </w:r>
+          </w:p>
+        </w:tc>
+        <w:tc>
+          <w:tcPr>
+            <w:tcW w:type="dxa" w:w="1656"/>
+            <w:shd w:fill="1F4E79"/>
+            <w:tcMar>
+              <w:top w:w="100" w:type="dxa"/>
+              <w:bottom w:w="100" w:type="dxa"/>
+              <w:left w:w="140" w:type="dxa"/>
+              <w:right w:w="140" w:type="dxa"/>
+            </w:tcMar>
+          </w:tcPr>
+          <w:p>
+            <w:r>
+              <w:rPr>
+                <w:b/>
+                <w:color w:val="FFFFFF"/>
+                <w:sz w:val="18"/>
+              </w:rPr>
+              <w:t>!input.candidateIds (A)</w:t>
+            </w:r>
+          </w:p>
+        </w:tc>
+        <w:tc>
+          <w:tcPr>
+            <w:tcW w:type="dxa" w:w="1656"/>
+            <w:shd w:fill="1F4E79"/>
+            <w:tcMar>
+              <w:top w:w="100" w:type="dxa"/>
+              <w:bottom w:w="100" w:type="dxa"/>
+              <w:left w:w="140" w:type="dxa"/>
+              <w:right w:w="140" w:type="dxa"/>
+            </w:tcMar>
+          </w:tcPr>
+          <w:p>
+            <w:r>
+              <w:rPr>
+                <w:b/>
+                <w:color w:val="FFFFFF"/>
+                <w:sz w:val="18"/>
+              </w:rPr>
+              <w:t>length === 0 (B)</w:t>
+            </w:r>
+          </w:p>
+        </w:tc>
+        <w:tc>
+          <w:tcPr>
+            <w:tcW w:type="dxa" w:w="1656"/>
+            <w:shd w:fill="1F4E79"/>
+            <w:tcMar>
+              <w:top w:w="100" w:type="dxa"/>
+              <w:bottom w:w="100" w:type="dxa"/>
+              <w:left w:w="140" w:type="dxa"/>
+              <w:right w:w="140" w:type="dxa"/>
+            </w:tcMar>
+          </w:tcPr>
+          <w:p>
+            <w:r>
+              <w:rPr>
+                <w:b/>
+                <w:color w:val="FFFFFF"/>
+                <w:sz w:val="18"/>
+              </w:rPr>
+              <w:t>Kết quả (A || B)</w:t>
+            </w:r>
+          </w:p>
+        </w:tc>
+        <w:tc>
+          <w:tcPr>
+            <w:tcW w:type="dxa" w:w="1656"/>
+            <w:shd w:fill="1F4E79"/>
+            <w:tcMar>
+              <w:top w:w="100" w:type="dxa"/>
+              <w:bottom w:w="100" w:type="dxa"/>
+              <w:left w:w="140" w:type="dxa"/>
+              <w:right w:w="140" w:type="dxa"/>
+            </w:tcMar>
+          </w:tcPr>
+          <w:p>
+            <w:r>
+              <w:rPr>
+                <w:b/>
+                <w:color w:val="FFFFFF"/>
+                <w:sz w:val="18"/>
+              </w:rPr>
+              <w:t>Nhánh rẽ</w:t>
+            </w:r>
+          </w:p>
+        </w:tc>
+        <w:tc>
+          <w:tcPr>
+            <w:tcW w:type="dxa" w:w="1656"/>
+            <w:shd w:fill="1F4E79"/>
+            <w:tcMar>
+              <w:top w:w="100" w:type="dxa"/>
+              <w:bottom w:w="100" w:type="dxa"/>
+              <w:left w:w="140" w:type="dxa"/>
+              <w:right w:w="140" w:type="dxa"/>
+            </w:tcMar>
+          </w:tcPr>
+          <w:p>
+            <w:r>
+              <w:rPr>
+                <w:b/>
+                <w:color w:val="FFFFFF"/>
+                <w:sz w:val="18"/>
+              </w:rPr>
+              <w:t>Dữ liệu minh họa</w:t>
+            </w:r>
+          </w:p>
+        </w:tc>
+      </w:tr>
+      <w:tr>
+        <w:tc>
+          <w:tcPr>
+            <w:tcW w:type="dxa" w:w="1656"/>
+            <w:tcMar>
+              <w:top w:w="100" w:type="dxa"/>
+              <w:bottom w:w="100" w:type="dxa"/>
+              <w:left w:w="140" w:type="dxa"/>
+              <w:right w:w="140" w:type="dxa"/>
+            </w:tcMar>
+          </w:tcPr>
+          <w:p>
+            <w:r>
+              <w:rPr>
+                <w:b/>
+                <w:sz w:val="17"/>
+              </w:rPr>
+              <w:t>C3_01</w:t>
+            </w:r>
+          </w:p>
+        </w:tc>
+        <w:tc>
+          <w:tcPr>
+            <w:tcW w:type="dxa" w:w="1656"/>
+            <w:tcMar>
+              <w:top w:w="100" w:type="dxa"/>
+              <w:bottom w:w="100" w:type="dxa"/>
+              <w:left w:w="140" w:type="dxa"/>
+              <w:right w:w="140" w:type="dxa"/>
+            </w:tcMar>
+          </w:tcPr>
+          <w:p>
+            <w:r>
+              <w:rPr>
+                <w:sz w:val="17"/>
+              </w:rPr>
+              <w:t>True</w:t>
+            </w:r>
+          </w:p>
+        </w:tc>
+        <w:tc>
+          <w:tcPr>
+            <w:tcW w:type="dxa" w:w="1656"/>
+            <w:tcMar>
+              <w:top w:w="100" w:type="dxa"/>
+              <w:bottom w:w="100" w:type="dxa"/>
+              <w:left w:w="140" w:type="dxa"/>
+              <w:right w:w="140" w:type="dxa"/>
+            </w:tcMar>
+          </w:tcPr>
+          <w:p>
+            <w:r>
+              <w:rPr>
+                <w:sz w:val="17"/>
+              </w:rPr>
+              <w:t>Không xét (Short-circuit)</w:t>
+            </w:r>
+          </w:p>
+        </w:tc>
+        <w:tc>
+          <w:tcPr>
+            <w:tcW w:type="dxa" w:w="1656"/>
+            <w:tcMar>
+              <w:top w:w="100" w:type="dxa"/>
+              <w:bottom w:w="100" w:type="dxa"/>
+              <w:left w:w="140" w:type="dxa"/>
+              <w:right w:w="140" w:type="dxa"/>
+            </w:tcMar>
+          </w:tcPr>
+          <w:p>
+            <w:r>
+              <w:rPr>
+                <w:sz w:val="17"/>
+              </w:rPr>
+              <w:t>True</w:t>
+            </w:r>
+          </w:p>
+        </w:tc>
+        <w:tc>
+          <w:tcPr>
+            <w:tcW w:type="dxa" w:w="1656"/>
+            <w:tcMar>
+              <w:top w:w="100" w:type="dxa"/>
+              <w:bottom w:w="100" w:type="dxa"/>
+              <w:left w:w="140" w:type="dxa"/>
+              <w:right w:w="140" w:type="dxa"/>
+            </w:tcMar>
+          </w:tcPr>
+          <w:p>
+            <w:r>
+              <w:rPr>
+                <w:sz w:val="17"/>
+              </w:rPr>
+              <w:t>Node 2 (Ném ngoại lệ)</w:t>
+            </w:r>
+          </w:p>
+        </w:tc>
+        <w:tc>
+          <w:tcPr>
+            <w:tcW w:type="dxa" w:w="1656"/>
+            <w:tcMar>
+              <w:top w:w="100" w:type="dxa"/>
+              <w:bottom w:w="100" w:type="dxa"/>
+              <w:left w:w="140" w:type="dxa"/>
+              <w:right w:w="140" w:type="dxa"/>
+            </w:tcMar>
+          </w:tcPr>
+          <w:p>
+            <w:r>
+              <w:rPr>
+                <w:sz w:val="17"/>
+              </w:rPr>
+              <w:t>input.candidateIds = null hoặc undefined</w:t>
+            </w:r>
+          </w:p>
+        </w:tc>
+      </w:tr>
+      <w:tr>
+        <w:tc>
+          <w:tcPr>
+            <w:tcW w:type="dxa" w:w="1656"/>
+            <w:shd w:fill="F9FAFB"/>
+            <w:tcMar>
+              <w:top w:w="100" w:type="dxa"/>
+              <w:bottom w:w="100" w:type="dxa"/>
+              <w:left w:w="140" w:type="dxa"/>
+              <w:right w:w="140" w:type="dxa"/>
+            </w:tcMar>
+          </w:tcPr>
+          <w:p>
+            <w:r>
+              <w:rPr>
+                <w:b/>
+                <w:sz w:val="17"/>
+              </w:rPr>
+              <w:t>C3_02</w:t>
+            </w:r>
+          </w:p>
+        </w:tc>
+        <w:tc>
+          <w:tcPr>
+            <w:tcW w:type="dxa" w:w="1656"/>
+            <w:shd w:fill="F9FAFB"/>
+            <w:tcMar>
+              <w:top w:w="100" w:type="dxa"/>
+              <w:bottom w:w="100" w:type="dxa"/>
+              <w:left w:w="140" w:type="dxa"/>
+              <w:right w:w="140" w:type="dxa"/>
+            </w:tcMar>
+          </w:tcPr>
+          <w:p>
+            <w:r>
+              <w:rPr>
+                <w:sz w:val="17"/>
+              </w:rPr>
+              <w:t>False</w:t>
+            </w:r>
+          </w:p>
+        </w:tc>
+        <w:tc>
+          <w:tcPr>
+            <w:tcW w:type="dxa" w:w="1656"/>
+            <w:shd w:fill="F9FAFB"/>
+            <w:tcMar>
+              <w:top w:w="100" w:type="dxa"/>
+              <w:bottom w:w="100" w:type="dxa"/>
+              <w:left w:w="140" w:type="dxa"/>
+              <w:right w:w="140" w:type="dxa"/>
+            </w:tcMar>
+          </w:tcPr>
+          <w:p>
+            <w:r>
+              <w:rPr>
+                <w:sz w:val="17"/>
+              </w:rPr>
+              <w:t>True</w:t>
+            </w:r>
+          </w:p>
+        </w:tc>
+        <w:tc>
+          <w:tcPr>
+            <w:tcW w:type="dxa" w:w="1656"/>
+            <w:shd w:fill="F9FAFB"/>
+            <w:tcMar>
+              <w:top w:w="100" w:type="dxa"/>
+              <w:bottom w:w="100" w:type="dxa"/>
+              <w:left w:w="140" w:type="dxa"/>
+              <w:right w:w="140" w:type="dxa"/>
+            </w:tcMar>
+          </w:tcPr>
+          <w:p>
+            <w:r>
+              <w:rPr>
+                <w:sz w:val="17"/>
+              </w:rPr>
+              <w:t>True</w:t>
+            </w:r>
+          </w:p>
+        </w:tc>
+        <w:tc>
+          <w:tcPr>
+            <w:tcW w:type="dxa" w:w="1656"/>
+            <w:shd w:fill="F9FAFB"/>
+            <w:tcMar>
+              <w:top w:w="100" w:type="dxa"/>
+              <w:bottom w:w="100" w:type="dxa"/>
+              <w:left w:w="140" w:type="dxa"/>
+              <w:right w:w="140" w:type="dxa"/>
+            </w:tcMar>
+          </w:tcPr>
+          <w:p>
+            <w:r>
+              <w:rPr>
+                <w:sz w:val="17"/>
+              </w:rPr>
+              <w:t>Node 2 (Ném ngoại lệ)</w:t>
+            </w:r>
+          </w:p>
+        </w:tc>
+        <w:tc>
+          <w:tcPr>
+            <w:tcW w:type="dxa" w:w="1656"/>
+            <w:shd w:fill="F9FAFB"/>
+            <w:tcMar>
+              <w:top w:w="100" w:type="dxa"/>
+              <w:bottom w:w="100" w:type="dxa"/>
+              <w:left w:w="140" w:type="dxa"/>
+              <w:right w:w="140" w:type="dxa"/>
+            </w:tcMar>
+          </w:tcPr>
+          <w:p>
+            <w:r>
+              <w:rPr>
+                <w:sz w:val="17"/>
+              </w:rPr>
+              <w:t>input.candidateIds = [] (Mảng rỗng)</w:t>
+            </w:r>
+          </w:p>
+        </w:tc>
+      </w:tr>
+      <w:tr>
+        <w:tc>
+          <w:tcPr>
+            <w:tcW w:type="dxa" w:w="1656"/>
+            <w:tcMar>
+              <w:top w:w="100" w:type="dxa"/>
+              <w:bottom w:w="100" w:type="dxa"/>
+              <w:left w:w="140" w:type="dxa"/>
+              <w:right w:w="140" w:type="dxa"/>
+            </w:tcMar>
+          </w:tcPr>
+          <w:p>
+            <w:r>
+              <w:rPr>
+                <w:b/>
+                <w:sz w:val="17"/>
+              </w:rPr>
+              <w:t>C3_03</w:t>
+            </w:r>
+          </w:p>
+        </w:tc>
+        <w:tc>
+          <w:tcPr>
+            <w:tcW w:type="dxa" w:w="1656"/>
+            <w:tcMar>
+              <w:top w:w="100" w:type="dxa"/>
+              <w:bottom w:w="100" w:type="dxa"/>
+              <w:left w:w="140" w:type="dxa"/>
+              <w:right w:w="140" w:type="dxa"/>
+            </w:tcMar>
+          </w:tcPr>
+          <w:p>
+            <w:r>
+              <w:rPr>
+                <w:sz w:val="17"/>
+              </w:rPr>
+              <w:t>False</w:t>
+            </w:r>
+          </w:p>
+        </w:tc>
+        <w:tc>
+          <w:tcPr>
+            <w:tcW w:type="dxa" w:w="1656"/>
+            <w:tcMar>
+              <w:top w:w="100" w:type="dxa"/>
+              <w:bottom w:w="100" w:type="dxa"/>
+              <w:left w:w="140" w:type="dxa"/>
+              <w:right w:w="140" w:type="dxa"/>
+            </w:tcMar>
+          </w:tcPr>
+          <w:p>
+            <w:r>
+              <w:rPr>
+                <w:sz w:val="17"/>
+              </w:rPr>
+              <w:t>False</w:t>
+            </w:r>
+          </w:p>
+        </w:tc>
+        <w:tc>
+          <w:tcPr>
+            <w:tcW w:type="dxa" w:w="1656"/>
+            <w:tcMar>
+              <w:top w:w="100" w:type="dxa"/>
+              <w:bottom w:w="100" w:type="dxa"/>
+              <w:left w:w="140" w:type="dxa"/>
+              <w:right w:w="140" w:type="dxa"/>
+            </w:tcMar>
+          </w:tcPr>
+          <w:p>
+            <w:r>
+              <w:rPr>
+                <w:sz w:val="17"/>
+              </w:rPr>
+              <w:t>False</w:t>
+            </w:r>
+          </w:p>
+        </w:tc>
+        <w:tc>
+          <w:tcPr>
+            <w:tcW w:type="dxa" w:w="1656"/>
+            <w:tcMar>
+              <w:top w:w="100" w:type="dxa"/>
+              <w:bottom w:w="100" w:type="dxa"/>
+              <w:left w:w="140" w:type="dxa"/>
+              <w:right w:w="140" w:type="dxa"/>
+            </w:tcMar>
+          </w:tcPr>
+          <w:p>
+            <w:r>
+              <w:rPr>
+                <w:sz w:val="17"/>
+              </w:rPr>
+              <w:t>Node 3 (Đi tiếp)</w:t>
+            </w:r>
+          </w:p>
+        </w:tc>
+        <w:tc>
+          <w:tcPr>
+            <w:tcW w:type="dxa" w:w="1656"/>
+            <w:tcMar>
+              <w:top w:w="100" w:type="dxa"/>
+              <w:bottom w:w="100" w:type="dxa"/>
+              <w:left w:w="140" w:type="dxa"/>
+              <w:right w:w="140" w:type="dxa"/>
+            </w:tcMar>
+          </w:tcPr>
+          <w:p>
+            <w:r>
+              <w:rPr>
+                <w:sz w:val="17"/>
+              </w:rPr>
+              <w:t>input.candidateIds = ['CAN_01']</w:t>
+            </w:r>
+          </w:p>
+        </w:tc>
+      </w:tr>
+    </w:tbl>
+    <w:p/>
+    <w:p>
+      <w:pPr>
         <w:pStyle w:val="Heading1"/>
       </w:pPr>
       <w:r>
-        <w:t>5. ĐÁNH GIÁ ĐỘ ĐO BAO PHỦ VÀ KẾT LUẬN</w:t>
+        <w:t>7. ĐÁNH GIÁ ĐỘ ĐO BAO PHỦ VÀ KẾT LUẬN</w:t>
       </w:r>
     </w:p>
     <w:p>
@@ -3619,14 +4986,14 @@
         <w:rPr>
           <w:sz w:val="20"/>
         </w:rPr>
-        <w:t>1. Độ bao phủ câu lệnh (C1 - Statement Coverage): Đạt 100% (21/21 khối lệnh cơ bản bao gồm cả khối Try 14a và Catch 14b được thực thi).</w:t>
+        <w:t>1. Độ bao phủ câu lệnh (C1 - Statement Coverage): Đạt 100% (22/22 khối lệnh cơ bản bao gồm cả đỉnh Start, khối Try 14a và Catch 14b được thực thi đầy đủ).</w:t>
         <w:br/>
         <w:t>2. Độ bao phủ nhánh quyết định (C2 - Branch Coverage): Đạt 100% (tất cả 9 điểm quyết định và rẽ nhánh ngoại lệ True/False đều được duyệt qua).</w:t>
         <w:br/>
-        <w:t>3. Độ bao phủ điều kiện (C3 - Condition Coverage): Đạt 100% cho biểu thức logic phức tại Node 1 (!candidateIds || length === 0).</w:t>
+        <w:t>3. Độ bao phủ điều kiện (C3 - Condition Coverage): Đạt 100% cho biểu thức logic phức hợp tại Node 1 (!candidateIds || length === 0) theo cơ chế ngắt mạch Short-circuit evaluation.</w:t>
         <w:br/>
         <w:br/>
-        <w:t>Bộ ca kiểm thử hộp trắng được thiết kế đảm bảo phát hiện sớm các khiếm khuyết trong logic xử lý danh sách rỗng, xử lý ngoại lệ mạng, kiểm tra tính toàn vẹn dữ liệu ứng viên và bảo đảm tính chịu lỗi (Fault-tolerance) của hệ thống tuyển dụng.</w:t>
+        <w:t>Bộ ca kiểm thử hộp trắng được thiết kế đảm bảo phát hiện sớm các khiếm khuyết trong logic xử lý danh sách rỗng, xử lý ngoại lệ mạng cơ sở dữ liệu, kiểm tra tính toàn vẹn dữ liệu ứng viên và bảo đảm tính chịu lỗi (Fault-tolerance) của hệ thống tuyển dụng.</w:t>
       </w:r>
     </w:p>
     <w:sectPr>
@@ -4089,7 +5456,7 @@
       <w:rFonts w:asciiTheme="majorHAnsi" w:eastAsiaTheme="majorEastAsia" w:hAnsiTheme="majorHAnsi" w:cstheme="majorBidi"/>
       <w:b/>
       <w:bCs/>
-      <w:color w:val="4F81BD" w:themeColor="accent1"/>
+      <w:color w:val="2E75B6"/>
       <w:sz w:val="26"/>
       <w:szCs w:val="26"/>
     </w:rPr>

</xml_diff>

<commit_message>
feat(testing): add Loop Testing (Section 6) with 7 standard cases for UC09, UC10, and UC11
</commit_message>
<xml_diff>
--- a/hop-trang/KiemThuHopTrang_UC09_TuDongHoaGuiEmail.docx
+++ b/hop-trang/KiemThuHopTrang_UC09_TuDongHoaGuiEmail.docx
@@ -6224,7 +6224,886 @@
         <w:pStyle w:val="Heading1"/>
       </w:pPr>
       <w:r>
-        <w:t>6. ĐÁNH GIÁ ĐỘ ĐO BAO PHỦ VÀ KẾT LUẬN</w:t>
+        <w:t>6. SINH CA KIỂM THỬ ĐỂ KIỂM THỬ CÁC VÒNG LẶP TRONG HÀM (LOOP TESTING)</w:t>
+      </w:r>
+    </w:p>
+    <w:p>
+      <w:pPr>
+        <w:spacing w:line="276" w:lineRule="auto"/>
+      </w:pPr>
+      <w:r>
+        <w:t>Theo lý thuyết kiểm thử dòng điều khiển và giáo trình Kiểm thử phần mềm (CSE462 - ĐH Thủy Lợi), với cấu trúc vòng lặp đơn (Simple Loop), cần thiết kế tập ca kiểm thử bao phủ đầy đủ 7 trường hợp chuẩn:</w:t>
+        <w:br/>
+        <w:t>1. Vòng lặp thực hiện 0 lần (m = 0)</w:t>
+        <w:br/>
+        <w:t>2. Vòng lặp thực hiện 1 lần (m = 1)</w:t>
+        <w:br/>
+        <w:t>3. Vòng lặp thực hiện 2 lần (m = 2)</w:t>
+        <w:br/>
+        <w:t>4. Vòng lặp thực hiện k lần điển hình (2 &lt; k &lt; n - 1)</w:t>
+        <w:br/>
+        <w:t>5. Vòng lặp thực hiện n - 1 lần (m = n - 1)</w:t>
+        <w:br/>
+        <w:t>6. Vòng lặp thực hiện n lần (Tối đa cấu hình cho phép, m = n)</w:t>
+        <w:br/>
+        <w:t>7. Vòng lặp thực hiện n + 1 lần (Vượt giới hạn tối đa, m = n + 1)</w:t>
+        <w:br/>
+        <w:br/>
+        <w:t>Áp dụng vào Use Case 09 (SendBulkEmailUseCase):</w:t>
+        <w:br/>
+        <w:t>Vòng lặp xuất hiện tại Node 8 (Dòng 56): 'for (let i = 0; i &lt; candidates.length; i++)'. Vòng lặp này duyệt tuần tự qua từng phần tử trong danh sách ứng viên candidateIds để cá nhân hóa nội dung email và gửi qua mailSvc.sendEmail. Theo đặc tả kỹ thuật hệ thống tuyển dụng (TC_UC09_TuDongHoaGuiEmail.md), ngưỡng tối đa cho phép gửi email hàng loạt trong một phiên là n = 50 ứng viên.</w:t>
+      </w:r>
+    </w:p>
+    <w:p>
+      <w:r>
+        <w:rPr>
+          <w:b/>
+        </w:rPr>
+        <w:t>Bảng ca kiểm thử vòng lặp duyệt danh sách gửi email hàng loạt (candidates, n = 50):</w:t>
+      </w:r>
+    </w:p>
+    <w:tbl>
+      <w:tblPr>
+        <w:tblW w:type="auto" w:w="0"/>
+        <w:jc w:val="center"/>
+        <w:tblLook w:firstColumn="1" w:firstRow="1" w:lastColumn="0" w:lastRow="0" w:noHBand="0" w:noVBand="1" w:val="04A0"/>
+        <w:tblBorders>
+          <w:top w:val="single" w:sz="6" w:space="0" w:color="CCCCCC"/>
+          <w:bottom w:val="single" w:sz="6" w:space="0" w:color="CCCCCC"/>
+          <w:left w:val="none"/>
+          <w:right w:val="none"/>
+          <w:insideH w:val="single" w:sz="4" w:space="0" w:color="CCCCCC"/>
+          <w:insideV w:val="none"/>
+        </w:tblBorders>
+      </w:tblPr>
+      <w:tblGrid>
+        <w:gridCol w:w="1987"/>
+        <w:gridCol w:w="1987"/>
+        <w:gridCol w:w="1987"/>
+        <w:gridCol w:w="1987"/>
+        <w:gridCol w:w="1987"/>
+      </w:tblGrid>
+      <w:tr>
+        <w:tc>
+          <w:tcPr>
+            <w:tcW w:type="dxa" w:w="1152"/>
+            <w:shd w:fill="1F4E79"/>
+            <w:tcMar>
+              <w:top w:w="100" w:type="dxa"/>
+              <w:bottom w:w="100" w:type="dxa"/>
+              <w:left w:w="140" w:type="dxa"/>
+              <w:right w:w="140" w:type="dxa"/>
+            </w:tcMar>
+          </w:tcPr>
+          <w:p>
+            <w:r>
+              <w:rPr>
+                <w:b/>
+                <w:color w:val="FFFFFF"/>
+                <w:sz w:val="18"/>
+              </w:rPr>
+              <w:t>TT</w:t>
+            </w:r>
+          </w:p>
+        </w:tc>
+        <w:tc>
+          <w:tcPr>
+            <w:tcW w:type="dxa" w:w="2592"/>
+            <w:shd w:fill="1F4E79"/>
+            <w:tcMar>
+              <w:top w:w="100" w:type="dxa"/>
+              <w:bottom w:w="100" w:type="dxa"/>
+              <w:left w:w="140" w:type="dxa"/>
+              <w:right w:w="140" w:type="dxa"/>
+            </w:tcMar>
+          </w:tcPr>
+          <w:p>
+            <w:r>
+              <w:rPr>
+                <w:b/>
+                <w:color w:val="FFFFFF"/>
+                <w:sz w:val="18"/>
+              </w:rPr>
+              <w:t>Trường hợp kiểm thử vòng lặp</w:t>
+            </w:r>
+          </w:p>
+        </w:tc>
+        <w:tc>
+          <w:tcPr>
+            <w:tcW w:type="dxa" w:w="1440"/>
+            <w:shd w:fill="1F4E79"/>
+            <w:tcMar>
+              <w:top w:w="100" w:type="dxa"/>
+              <w:bottom w:w="100" w:type="dxa"/>
+              <w:left w:w="140" w:type="dxa"/>
+              <w:right w:w="140" w:type="dxa"/>
+            </w:tcMar>
+          </w:tcPr>
+          <w:p>
+            <w:r>
+              <w:rPr>
+                <w:b/>
+                <w:color w:val="FFFFFF"/>
+                <w:sz w:val="18"/>
+              </w:rPr>
+              <w:t>Số phần tử (m)</w:t>
+            </w:r>
+          </w:p>
+        </w:tc>
+        <w:tc>
+          <w:tcPr>
+            <w:tcW w:type="dxa" w:w="2304"/>
+            <w:shd w:fill="1F4E79"/>
+            <w:tcMar>
+              <w:top w:w="100" w:type="dxa"/>
+              <w:bottom w:w="100" w:type="dxa"/>
+              <w:left w:w="140" w:type="dxa"/>
+              <w:right w:w="140" w:type="dxa"/>
+            </w:tcMar>
+          </w:tcPr>
+          <w:p>
+            <w:r>
+              <w:rPr>
+                <w:b/>
+                <w:color w:val="FFFFFF"/>
+                <w:sz w:val="18"/>
+              </w:rPr>
+              <w:t>Dữ liệu đầu vào kiểm thử cụ thể</w:t>
+            </w:r>
+          </w:p>
+        </w:tc>
+        <w:tc>
+          <w:tcPr>
+            <w:tcW w:type="dxa" w:w="2592"/>
+            <w:shd w:fill="1F4E79"/>
+            <w:tcMar>
+              <w:top w:w="100" w:type="dxa"/>
+              <w:bottom w:w="100" w:type="dxa"/>
+              <w:left w:w="140" w:type="dxa"/>
+              <w:right w:w="140" w:type="dxa"/>
+            </w:tcMar>
+          </w:tcPr>
+          <w:p>
+            <w:r>
+              <w:rPr>
+                <w:b/>
+                <w:color w:val="FFFFFF"/>
+                <w:sz w:val="18"/>
+              </w:rPr>
+              <w:t>Kết quả mong đợi</w:t>
+            </w:r>
+          </w:p>
+        </w:tc>
+      </w:tr>
+      <w:tr>
+        <w:tc>
+          <w:tcPr>
+            <w:tcW w:type="dxa" w:w="1152"/>
+            <w:tcMar>
+              <w:top w:w="100" w:type="dxa"/>
+              <w:bottom w:w="100" w:type="dxa"/>
+              <w:left w:w="140" w:type="dxa"/>
+              <w:right w:w="140" w:type="dxa"/>
+            </w:tcMar>
+          </w:tcPr>
+          <w:p>
+            <w:r>
+              <w:rPr>
+                <w:b/>
+                <w:sz w:val="17"/>
+              </w:rPr>
+              <w:t>LOOP_01</w:t>
+            </w:r>
+          </w:p>
+        </w:tc>
+        <w:tc>
+          <w:tcPr>
+            <w:tcW w:type="dxa" w:w="2592"/>
+            <w:tcMar>
+              <w:top w:w="100" w:type="dxa"/>
+              <w:bottom w:w="100" w:type="dxa"/>
+              <w:left w:w="140" w:type="dxa"/>
+              <w:right w:w="140" w:type="dxa"/>
+            </w:tcMar>
+          </w:tcPr>
+          <w:p>
+            <w:r>
+              <w:rPr>
+                <w:sz w:val="17"/>
+              </w:rPr>
+              <w:t>Vòng lặp 0 lần (Danh sách rỗng)</w:t>
+            </w:r>
+          </w:p>
+        </w:tc>
+        <w:tc>
+          <w:tcPr>
+            <w:tcW w:type="dxa" w:w="1440"/>
+            <w:tcMar>
+              <w:top w:w="100" w:type="dxa"/>
+              <w:bottom w:w="100" w:type="dxa"/>
+              <w:left w:w="140" w:type="dxa"/>
+              <w:right w:w="140" w:type="dxa"/>
+            </w:tcMar>
+          </w:tcPr>
+          <w:p>
+            <w:r>
+              <w:rPr>
+                <w:sz w:val="17"/>
+              </w:rPr>
+              <w:t>m = 0</w:t>
+            </w:r>
+          </w:p>
+        </w:tc>
+        <w:tc>
+          <w:tcPr>
+            <w:tcW w:type="dxa" w:w="2304"/>
+            <w:tcMar>
+              <w:top w:w="100" w:type="dxa"/>
+              <w:bottom w:w="100" w:type="dxa"/>
+              <w:left w:w="140" w:type="dxa"/>
+              <w:right w:w="140" w:type="dxa"/>
+            </w:tcMar>
+          </w:tcPr>
+          <w:p>
+            <w:r>
+              <w:rPr>
+                <w:sz w:val="17"/>
+              </w:rPr>
+              <w:t>Gửi candidateIds = [] rỗng</w:t>
+            </w:r>
+          </w:p>
+        </w:tc>
+        <w:tc>
+          <w:tcPr>
+            <w:tcW w:type="dxa" w:w="2592"/>
+            <w:tcMar>
+              <w:top w:w="100" w:type="dxa"/>
+              <w:bottom w:w="100" w:type="dxa"/>
+              <w:left w:w="140" w:type="dxa"/>
+              <w:right w:w="140" w:type="dxa"/>
+            </w:tcMar>
+          </w:tcPr>
+          <w:p>
+            <w:r>
+              <w:rPr>
+                <w:sz w:val="17"/>
+              </w:rPr>
+              <w:t>Hệ thống ném lỗi: 'Danh sách ứng viên không được để trống.' (Chặn tại Node 1 trước khi vào vòng lặp)</w:t>
+            </w:r>
+          </w:p>
+        </w:tc>
+      </w:tr>
+      <w:tr>
+        <w:tc>
+          <w:tcPr>
+            <w:tcW w:type="dxa" w:w="1152"/>
+            <w:shd w:fill="F9FAFB"/>
+            <w:tcMar>
+              <w:top w:w="100" w:type="dxa"/>
+              <w:bottom w:w="100" w:type="dxa"/>
+              <w:left w:w="140" w:type="dxa"/>
+              <w:right w:w="140" w:type="dxa"/>
+            </w:tcMar>
+          </w:tcPr>
+          <w:p>
+            <w:r>
+              <w:rPr>
+                <w:b/>
+                <w:sz w:val="17"/>
+              </w:rPr>
+              <w:t>LOOP_02</w:t>
+            </w:r>
+          </w:p>
+        </w:tc>
+        <w:tc>
+          <w:tcPr>
+            <w:tcW w:type="dxa" w:w="2592"/>
+            <w:shd w:fill="F9FAFB"/>
+            <w:tcMar>
+              <w:top w:w="100" w:type="dxa"/>
+              <w:bottom w:w="100" w:type="dxa"/>
+              <w:left w:w="140" w:type="dxa"/>
+              <w:right w:w="140" w:type="dxa"/>
+            </w:tcMar>
+          </w:tcPr>
+          <w:p>
+            <w:r>
+              <w:rPr>
+                <w:sz w:val="17"/>
+              </w:rPr>
+              <w:t>Vòng lặp 1 lần (Đơn lẻ 1 ứng viên)</w:t>
+            </w:r>
+          </w:p>
+        </w:tc>
+        <w:tc>
+          <w:tcPr>
+            <w:tcW w:type="dxa" w:w="1440"/>
+            <w:shd w:fill="F9FAFB"/>
+            <w:tcMar>
+              <w:top w:w="100" w:type="dxa"/>
+              <w:bottom w:w="100" w:type="dxa"/>
+              <w:left w:w="140" w:type="dxa"/>
+              <w:right w:w="140" w:type="dxa"/>
+            </w:tcMar>
+          </w:tcPr>
+          <w:p>
+            <w:r>
+              <w:rPr>
+                <w:sz w:val="17"/>
+              </w:rPr>
+              <w:t>m = 1</w:t>
+            </w:r>
+          </w:p>
+        </w:tc>
+        <w:tc>
+          <w:tcPr>
+            <w:tcW w:type="dxa" w:w="2304"/>
+            <w:shd w:fill="F9FAFB"/>
+            <w:tcMar>
+              <w:top w:w="100" w:type="dxa"/>
+              <w:bottom w:w="100" w:type="dxa"/>
+              <w:left w:w="140" w:type="dxa"/>
+              <w:right w:w="140" w:type="dxa"/>
+            </w:tcMar>
+          </w:tcPr>
+          <w:p>
+            <w:r>
+              <w:rPr>
+                <w:sz w:val="17"/>
+              </w:rPr>
+              <w:t>candidateIds = ['CAN_01']</w:t>
+            </w:r>
+          </w:p>
+        </w:tc>
+        <w:tc>
+          <w:tcPr>
+            <w:tcW w:type="dxa" w:w="2592"/>
+            <w:shd w:fill="F9FAFB"/>
+            <w:tcMar>
+              <w:top w:w="100" w:type="dxa"/>
+              <w:bottom w:w="100" w:type="dxa"/>
+              <w:left w:w="140" w:type="dxa"/>
+              <w:right w:w="140" w:type="dxa"/>
+            </w:tcMar>
+          </w:tcPr>
+          <w:p>
+            <w:r>
+              <w:rPr>
+                <w:sz w:val="17"/>
+              </w:rPr>
+              <w:t>Vòng lặp thực thi 1 lần, gửi 1 email thành công, totalSent = 1</w:t>
+            </w:r>
+          </w:p>
+        </w:tc>
+      </w:tr>
+      <w:tr>
+        <w:tc>
+          <w:tcPr>
+            <w:tcW w:type="dxa" w:w="1152"/>
+            <w:tcMar>
+              <w:top w:w="100" w:type="dxa"/>
+              <w:bottom w:w="100" w:type="dxa"/>
+              <w:left w:w="140" w:type="dxa"/>
+              <w:right w:w="140" w:type="dxa"/>
+            </w:tcMar>
+          </w:tcPr>
+          <w:p>
+            <w:r>
+              <w:rPr>
+                <w:b/>
+                <w:sz w:val="17"/>
+              </w:rPr>
+              <w:t>LOOP_03</w:t>
+            </w:r>
+          </w:p>
+        </w:tc>
+        <w:tc>
+          <w:tcPr>
+            <w:tcW w:type="dxa" w:w="2592"/>
+            <w:tcMar>
+              <w:top w:w="100" w:type="dxa"/>
+              <w:bottom w:w="100" w:type="dxa"/>
+              <w:left w:w="140" w:type="dxa"/>
+              <w:right w:w="140" w:type="dxa"/>
+            </w:tcMar>
+          </w:tcPr>
+          <w:p>
+            <w:r>
+              <w:rPr>
+                <w:sz w:val="17"/>
+              </w:rPr>
+              <w:t>Vòng lặp 2 lần (2 ứng viên)</w:t>
+            </w:r>
+          </w:p>
+        </w:tc>
+        <w:tc>
+          <w:tcPr>
+            <w:tcW w:type="dxa" w:w="1440"/>
+            <w:tcMar>
+              <w:top w:w="100" w:type="dxa"/>
+              <w:bottom w:w="100" w:type="dxa"/>
+              <w:left w:w="140" w:type="dxa"/>
+              <w:right w:w="140" w:type="dxa"/>
+            </w:tcMar>
+          </w:tcPr>
+          <w:p>
+            <w:r>
+              <w:rPr>
+                <w:sz w:val="17"/>
+              </w:rPr>
+              <w:t>m = 2</w:t>
+            </w:r>
+          </w:p>
+        </w:tc>
+        <w:tc>
+          <w:tcPr>
+            <w:tcW w:type="dxa" w:w="2304"/>
+            <w:tcMar>
+              <w:top w:w="100" w:type="dxa"/>
+              <w:bottom w:w="100" w:type="dxa"/>
+              <w:left w:w="140" w:type="dxa"/>
+              <w:right w:w="140" w:type="dxa"/>
+            </w:tcMar>
+          </w:tcPr>
+          <w:p>
+            <w:r>
+              <w:rPr>
+                <w:sz w:val="17"/>
+              </w:rPr>
+              <w:t>candidateIds = ['CAN_01', 'CAN_02']</w:t>
+            </w:r>
+          </w:p>
+        </w:tc>
+        <w:tc>
+          <w:tcPr>
+            <w:tcW w:type="dxa" w:w="2592"/>
+            <w:tcMar>
+              <w:top w:w="100" w:type="dxa"/>
+              <w:bottom w:w="100" w:type="dxa"/>
+              <w:left w:w="140" w:type="dxa"/>
+              <w:right w:w="140" w:type="dxa"/>
+            </w:tcMar>
+          </w:tcPr>
+          <w:p>
+            <w:r>
+              <w:rPr>
+                <w:sz w:val="17"/>
+              </w:rPr>
+              <w:t>Vòng lặp thực thi 2 lần, gửi 2 email thành công, totalSent = 2</w:t>
+            </w:r>
+          </w:p>
+        </w:tc>
+      </w:tr>
+      <w:tr>
+        <w:tc>
+          <w:tcPr>
+            <w:tcW w:type="dxa" w:w="1152"/>
+            <w:shd w:fill="F9FAFB"/>
+            <w:tcMar>
+              <w:top w:w="100" w:type="dxa"/>
+              <w:bottom w:w="100" w:type="dxa"/>
+              <w:left w:w="140" w:type="dxa"/>
+              <w:right w:w="140" w:type="dxa"/>
+            </w:tcMar>
+          </w:tcPr>
+          <w:p>
+            <w:r>
+              <w:rPr>
+                <w:b/>
+                <w:sz w:val="17"/>
+              </w:rPr>
+              <w:t>LOOP_04</w:t>
+            </w:r>
+          </w:p>
+        </w:tc>
+        <w:tc>
+          <w:tcPr>
+            <w:tcW w:type="dxa" w:w="2592"/>
+            <w:shd w:fill="F9FAFB"/>
+            <w:tcMar>
+              <w:top w:w="100" w:type="dxa"/>
+              <w:bottom w:w="100" w:type="dxa"/>
+              <w:left w:w="140" w:type="dxa"/>
+              <w:right w:w="140" w:type="dxa"/>
+            </w:tcMar>
+          </w:tcPr>
+          <w:p>
+            <w:r>
+              <w:rPr>
+                <w:sz w:val="17"/>
+              </w:rPr>
+              <w:t>Vòng lặp k lần (2 &lt; k &lt; n - 1)</w:t>
+            </w:r>
+          </w:p>
+        </w:tc>
+        <w:tc>
+          <w:tcPr>
+            <w:tcW w:type="dxa" w:w="1440"/>
+            <w:shd w:fill="F9FAFB"/>
+            <w:tcMar>
+              <w:top w:w="100" w:type="dxa"/>
+              <w:bottom w:w="100" w:type="dxa"/>
+              <w:left w:w="140" w:type="dxa"/>
+              <w:right w:w="140" w:type="dxa"/>
+            </w:tcMar>
+          </w:tcPr>
+          <w:p>
+            <w:r>
+              <w:rPr>
+                <w:sz w:val="17"/>
+              </w:rPr>
+              <w:t>m = 25</w:t>
+            </w:r>
+          </w:p>
+        </w:tc>
+        <w:tc>
+          <w:tcPr>
+            <w:tcW w:type="dxa" w:w="2304"/>
+            <w:shd w:fill="F9FAFB"/>
+            <w:tcMar>
+              <w:top w:w="100" w:type="dxa"/>
+              <w:bottom w:w="100" w:type="dxa"/>
+              <w:left w:w="140" w:type="dxa"/>
+              <w:right w:w="140" w:type="dxa"/>
+            </w:tcMar>
+          </w:tcPr>
+          <w:p>
+            <w:r>
+              <w:rPr>
+                <w:sz w:val="17"/>
+              </w:rPr>
+              <w:t>Mảng gồm 25 mã ứng viên hợp lệ</w:t>
+            </w:r>
+          </w:p>
+        </w:tc>
+        <w:tc>
+          <w:tcPr>
+            <w:tcW w:type="dxa" w:w="2592"/>
+            <w:shd w:fill="F9FAFB"/>
+            <w:tcMar>
+              <w:top w:w="100" w:type="dxa"/>
+              <w:bottom w:w="100" w:type="dxa"/>
+              <w:left w:w="140" w:type="dxa"/>
+              <w:right w:w="140" w:type="dxa"/>
+            </w:tcMar>
+          </w:tcPr>
+          <w:p>
+            <w:r>
+              <w:rPr>
+                <w:sz w:val="17"/>
+              </w:rPr>
+              <w:t>Vòng lặp thực thi 25 lần ổn định, gửi email hàng loạt thành công, totalSent = 25</w:t>
+            </w:r>
+          </w:p>
+        </w:tc>
+      </w:tr>
+      <w:tr>
+        <w:tc>
+          <w:tcPr>
+            <w:tcW w:type="dxa" w:w="1152"/>
+            <w:tcMar>
+              <w:top w:w="100" w:type="dxa"/>
+              <w:bottom w:w="100" w:type="dxa"/>
+              <w:left w:w="140" w:type="dxa"/>
+              <w:right w:w="140" w:type="dxa"/>
+            </w:tcMar>
+          </w:tcPr>
+          <w:p>
+            <w:r>
+              <w:rPr>
+                <w:b/>
+                <w:sz w:val="17"/>
+              </w:rPr>
+              <w:t>LOOP_05</w:t>
+            </w:r>
+          </w:p>
+        </w:tc>
+        <w:tc>
+          <w:tcPr>
+            <w:tcW w:type="dxa" w:w="2592"/>
+            <w:tcMar>
+              <w:top w:w="100" w:type="dxa"/>
+              <w:bottom w:w="100" w:type="dxa"/>
+              <w:left w:w="140" w:type="dxa"/>
+              <w:right w:w="140" w:type="dxa"/>
+            </w:tcMar>
+          </w:tcPr>
+          <w:p>
+            <w:r>
+              <w:rPr>
+                <w:sz w:val="17"/>
+              </w:rPr>
+              <w:t>Vòng lặp n - 1 lần</w:t>
+            </w:r>
+          </w:p>
+        </w:tc>
+        <w:tc>
+          <w:tcPr>
+            <w:tcW w:type="dxa" w:w="1440"/>
+            <w:tcMar>
+              <w:top w:w="100" w:type="dxa"/>
+              <w:bottom w:w="100" w:type="dxa"/>
+              <w:left w:w="140" w:type="dxa"/>
+              <w:right w:w="140" w:type="dxa"/>
+            </w:tcMar>
+          </w:tcPr>
+          <w:p>
+            <w:r>
+              <w:rPr>
+                <w:sz w:val="17"/>
+              </w:rPr>
+              <w:t>m = 49</w:t>
+            </w:r>
+          </w:p>
+        </w:tc>
+        <w:tc>
+          <w:tcPr>
+            <w:tcW w:type="dxa" w:w="2304"/>
+            <w:tcMar>
+              <w:top w:w="100" w:type="dxa"/>
+              <w:bottom w:w="100" w:type="dxa"/>
+              <w:left w:w="140" w:type="dxa"/>
+              <w:right w:w="140" w:type="dxa"/>
+            </w:tcMar>
+          </w:tcPr>
+          <w:p>
+            <w:r>
+              <w:rPr>
+                <w:sz w:val="17"/>
+              </w:rPr>
+              <w:t>Mảng gồm 49 mã ứng viên hợp lệ</w:t>
+            </w:r>
+          </w:p>
+        </w:tc>
+        <w:tc>
+          <w:tcPr>
+            <w:tcW w:type="dxa" w:w="2592"/>
+            <w:tcMar>
+              <w:top w:w="100" w:type="dxa"/>
+              <w:bottom w:w="100" w:type="dxa"/>
+              <w:left w:w="140" w:type="dxa"/>
+              <w:right w:w="140" w:type="dxa"/>
+            </w:tcMar>
+          </w:tcPr>
+          <w:p>
+            <w:r>
+              <w:rPr>
+                <w:sz w:val="17"/>
+              </w:rPr>
+              <w:t>Vòng lặp xử lý 49 lần ổn định cận trên tối đa, totalSent = 49</w:t>
+            </w:r>
+          </w:p>
+        </w:tc>
+      </w:tr>
+      <w:tr>
+        <w:tc>
+          <w:tcPr>
+            <w:tcW w:type="dxa" w:w="1152"/>
+            <w:shd w:fill="F9FAFB"/>
+            <w:tcMar>
+              <w:top w:w="100" w:type="dxa"/>
+              <w:bottom w:w="100" w:type="dxa"/>
+              <w:left w:w="140" w:type="dxa"/>
+              <w:right w:w="140" w:type="dxa"/>
+            </w:tcMar>
+          </w:tcPr>
+          <w:p>
+            <w:r>
+              <w:rPr>
+                <w:b/>
+                <w:sz w:val="17"/>
+              </w:rPr>
+              <w:t>LOOP_06</w:t>
+            </w:r>
+          </w:p>
+        </w:tc>
+        <w:tc>
+          <w:tcPr>
+            <w:tcW w:type="dxa" w:w="2592"/>
+            <w:shd w:fill="F9FAFB"/>
+            <w:tcMar>
+              <w:top w:w="100" w:type="dxa"/>
+              <w:bottom w:w="100" w:type="dxa"/>
+              <w:left w:w="140" w:type="dxa"/>
+              <w:right w:w="140" w:type="dxa"/>
+            </w:tcMar>
+          </w:tcPr>
+          <w:p>
+            <w:r>
+              <w:rPr>
+                <w:sz w:val="17"/>
+              </w:rPr>
+              <w:t>Vòng lặp n lần (Tối đa cấu hình)</w:t>
+            </w:r>
+          </w:p>
+        </w:tc>
+        <w:tc>
+          <w:tcPr>
+            <w:tcW w:type="dxa" w:w="1440"/>
+            <w:shd w:fill="F9FAFB"/>
+            <w:tcMar>
+              <w:top w:w="100" w:type="dxa"/>
+              <w:bottom w:w="100" w:type="dxa"/>
+              <w:left w:w="140" w:type="dxa"/>
+              <w:right w:w="140" w:type="dxa"/>
+            </w:tcMar>
+          </w:tcPr>
+          <w:p>
+            <w:r>
+              <w:rPr>
+                <w:sz w:val="17"/>
+              </w:rPr>
+              <w:t>m = 50</w:t>
+            </w:r>
+          </w:p>
+        </w:tc>
+        <w:tc>
+          <w:tcPr>
+            <w:tcW w:type="dxa" w:w="2304"/>
+            <w:shd w:fill="F9FAFB"/>
+            <w:tcMar>
+              <w:top w:w="100" w:type="dxa"/>
+              <w:bottom w:w="100" w:type="dxa"/>
+              <w:left w:w="140" w:type="dxa"/>
+              <w:right w:w="140" w:type="dxa"/>
+            </w:tcMar>
+          </w:tcPr>
+          <w:p>
+            <w:r>
+              <w:rPr>
+                <w:sz w:val="17"/>
+              </w:rPr>
+              <w:t>Mảng đúng 50 mã ứng viên (ngưỡng max)</w:t>
+            </w:r>
+          </w:p>
+        </w:tc>
+        <w:tc>
+          <w:tcPr>
+            <w:tcW w:type="dxa" w:w="2592"/>
+            <w:shd w:fill="F9FAFB"/>
+            <w:tcMar>
+              <w:top w:w="100" w:type="dxa"/>
+              <w:bottom w:w="100" w:type="dxa"/>
+              <w:left w:w="140" w:type="dxa"/>
+              <w:right w:w="140" w:type="dxa"/>
+            </w:tcMar>
+          </w:tcPr>
+          <w:p>
+            <w:r>
+              <w:rPr>
+                <w:sz w:val="17"/>
+              </w:rPr>
+              <w:t>Vòng lặp thực thi đủ 50 lần, gửi trọn vẹn 50 email thành công, totalSent = 50</w:t>
+            </w:r>
+          </w:p>
+        </w:tc>
+      </w:tr>
+      <w:tr>
+        <w:tc>
+          <w:tcPr>
+            <w:tcW w:type="dxa" w:w="1152"/>
+            <w:tcMar>
+              <w:top w:w="100" w:type="dxa"/>
+              <w:bottom w:w="100" w:type="dxa"/>
+              <w:left w:w="140" w:type="dxa"/>
+              <w:right w:w="140" w:type="dxa"/>
+            </w:tcMar>
+          </w:tcPr>
+          <w:p>
+            <w:r>
+              <w:rPr>
+                <w:b/>
+                <w:sz w:val="17"/>
+              </w:rPr>
+              <w:t>LOOP_07</w:t>
+            </w:r>
+          </w:p>
+        </w:tc>
+        <w:tc>
+          <w:tcPr>
+            <w:tcW w:type="dxa" w:w="2592"/>
+            <w:tcMar>
+              <w:top w:w="100" w:type="dxa"/>
+              <w:bottom w:w="100" w:type="dxa"/>
+              <w:left w:w="140" w:type="dxa"/>
+              <w:right w:w="140" w:type="dxa"/>
+            </w:tcMar>
+          </w:tcPr>
+          <w:p>
+            <w:r>
+              <w:rPr>
+                <w:sz w:val="17"/>
+              </w:rPr>
+              <w:t>Vòng lặp n + 1 lần (Vượt giới hạn)</w:t>
+            </w:r>
+          </w:p>
+        </w:tc>
+        <w:tc>
+          <w:tcPr>
+            <w:tcW w:type="dxa" w:w="1440"/>
+            <w:tcMar>
+              <w:top w:w="100" w:type="dxa"/>
+              <w:bottom w:w="100" w:type="dxa"/>
+              <w:left w:w="140" w:type="dxa"/>
+              <w:right w:w="140" w:type="dxa"/>
+            </w:tcMar>
+          </w:tcPr>
+          <w:p>
+            <w:r>
+              <w:rPr>
+                <w:sz w:val="17"/>
+              </w:rPr>
+              <w:t>m = 51</w:t>
+            </w:r>
+          </w:p>
+        </w:tc>
+        <w:tc>
+          <w:tcPr>
+            <w:tcW w:type="dxa" w:w="2304"/>
+            <w:tcMar>
+              <w:top w:w="100" w:type="dxa"/>
+              <w:bottom w:w="100" w:type="dxa"/>
+              <w:left w:w="140" w:type="dxa"/>
+              <w:right w:w="140" w:type="dxa"/>
+            </w:tcMar>
+          </w:tcPr>
+          <w:p>
+            <w:r>
+              <w:rPr>
+                <w:sz w:val="17"/>
+              </w:rPr>
+              <w:t>Gửi danh sách 51 ứng viên</w:t>
+            </w:r>
+          </w:p>
+        </w:tc>
+        <w:tc>
+          <w:tcPr>
+            <w:tcW w:type="dxa" w:w="2592"/>
+            <w:tcMar>
+              <w:top w:w="100" w:type="dxa"/>
+              <w:bottom w:w="100" w:type="dxa"/>
+              <w:left w:w="140" w:type="dxa"/>
+              <w:right w:w="140" w:type="dxa"/>
+            </w:tcMar>
+          </w:tcPr>
+          <w:p>
+            <w:r>
+              <w:rPr>
+                <w:sz w:val="17"/>
+              </w:rPr>
+              <w:t>Hệ thống từ chối hoặc cảnh báo: 'Số lượng ứng viên gửi hàng loạt không được vượt quá 50 người'</w:t>
+            </w:r>
+          </w:p>
+        </w:tc>
+      </w:tr>
+    </w:tbl>
+    <w:p/>
+    <w:p>
+      <w:pPr>
+        <w:pStyle w:val="Heading1"/>
+      </w:pPr>
+      <w:r>
+        <w:t>7. ĐÁNH GIÁ ĐỘ ĐO BAO PHỦ VÀ KẾT LUẬN</w:t>
       </w:r>
     </w:p>
     <w:p>
@@ -6237,6 +7116,8 @@
         <w:t>2. Độ bao phủ nhánh quyết định (C2 - Branch Coverage): Đạt 100% (tất cả 9 điểm quyết định và rẽ nhánh ngoại lệ True/False đều được kích hoạt đầy đủ qua ma trận điều kiện rẽ nhánh C2).</w:t>
         <w:br/>
         <w:t>3. Độ bao phủ điều kiện (C3 - Condition Coverage): Đạt 100% cho biểu thức logic phức hợp tại Node 1 (!candidateIds || length === 0) theo đúng nguyên lý ngắt mạch Short-circuit evaluation.</w:t>
+        <w:br/>
+        <w:t>4. Độ bao phủ vòng lặp (Loop Coverage): Đạt 100% với 7/7 ca kiểm thử vòng lặp chuẩn (LOOP_01 - LOOP_07) bao quát từ m = 0 đến m = n + 1.</w:t>
         <w:br/>
         <w:br/>
         <w:t>Bộ ca kiểm thử hộp trắng được thiết kế đảm bảo phát hiện sớm các khiếm khuyết trong logic xử lý danh sách rỗng, xử lý ngoại lệ mạng cơ sở dữ liệu, kiểm tra tính toàn vẹn dữ liệu ứng viên và bảo đảm tính chịu lỗi (Fault-tolerance) của hệ thống tuyển dụng.</w:t>

</xml_diff>